<commit_message>
Add all-in-one Colab notebook and update progress report
</commit_message>
<xml_diff>
--- a/reports/preprocessing_progress_report.docx
+++ b/reports/preprocessing_progress_report.docx
@@ -20,7 +20,7 @@
     </w:p>
     <w:p>
       <w:r>
-        <w:t>Status: Initial data inspection is complete and the preprocessing script has run successfully. Dataset partitions, model training, tuning, evaluation, and figures are pending. This is a working Word draft, not the final submission report.</w:t>
+        <w:t>Status: Initial data inspection is complete and the preprocessing script has run successfully. Grouped train/test and five-fold assignments are complete. Model configuration, training, tuning, evaluation, and figures are pending. This is a working Word draft, not the final submission report.</w:t>
       </w:r>
     </w:p>
     <w:p>
@@ -362,7 +362,7 @@
         <w:pStyle w:val="ListBullet"/>
       </w:pPr>
       <w:r>
-        <w:t>Input scaling: A FoldPreprocessor class provides standardization of the nine raw predictors. Each mean and standard deviation must be learned from the relevant training portion only. The same fitted transform will then be applied to validation data. No scaler has been fitted yet.</w:t>
+        <w:t>Input scaling: A FoldPreprocessor class provides standardization of the nine raw predictors. Each mean and standard deviation must be learned from the relevant training portion only. The same fitted transform will then be applied to validation data. No scaler has been fitted yet; the grouped partitions are now saved.</w:t>
       </w:r>
     </w:p>
     <w:p>
@@ -409,7 +409,7 @@
     </w:p>
     <w:p>
       <w:r>
-        <w:t>Next, construct a reproducible approximately 80/20 train/test partition using seed 42, keeping matching predictor combinations together. Create five cross-validation folds within training data and reuse the assignments for both models. Fit preprocessing separately within each fold, use validation data for early stopping and selection, and keep test data out of all tuning decisions.</w:t>
+        <w:t>A grouped split using seed 42 assigns 1,493 samples (80.05%) to training and 372 (19.95%) to testing. Five training folds contain 298, 298, 300, 300, and 297 validation samples. GroupShuffleSplit uses 20% of predictor groups for testing; shuffled GroupKFold creates training folds. Neither uses targets. Complete sample coverage, no group overlap, and deterministic regeneration were checked. Assignments and a summary are saved under outputs/partitions/. Reuse these assignments for both models. Next, define the data-driven network search space and budget. Fit preprocessing separately within each fold, use validation data for early stopping and selection, and keep test data out of all tuning decisions.</w:t>
       </w:r>
     </w:p>
     <w:p>

</xml_diff>

<commit_message>
Update academic report with cross-validation results and runtime
</commit_message>
<xml_diff>
--- a/reports/preprocessing_progress_report.docx
+++ b/reports/preprocessing_progress_report.docx
@@ -11,16 +11,8 @@
       </w:r>
     </w:p>
     <w:p>
-      <w:pPr>
-        <w:pStyle w:val="Subtitle"/>
-      </w:pPr>
       <w:r>
-        <w:t>Progress report • Data inspection and preprocessing • October 20, 2026</w:t>
-      </w:r>
-    </w:p>
-    <w:p>
-      <w:r>
-        <w:t>Status: Initial data inspection is complete and the preprocessing script has run successfully. Grouped train/test and five-fold assignments are complete. Model configuration, training, tuning, evaluation, and figures are pending. This is a working Word draft, not the final submission report.</w:t>
+        <w:t>Interim academic report: data preparation and data-driven model selection</w:t>
       </w:r>
     </w:p>
     <w:p>
@@ -28,17 +20,22 @@
         <w:pStyle w:val="Heading1"/>
       </w:pPr>
       <w:r>
-        <w:t>1. Objective and supplied data</w:t>
+        <w:t>1. Objective and data preparation</w:t>
       </w:r>
     </w:p>
     <w:p>
       <w:r>
-        <w:t>The challenge compares a feedforward neural network using nine input features with a physics-informed network incorporating y = x₂² / (72.2 × x₁^(−m)). The positive exponent m must be predicted for each sample from its input features and learned jointly during training. No neural network or exponent mapping has been trained at this stage.</w:t>
+        <w:t>The objective is to compare a feedforward regression network with a physics-informed network incorporating y = x₂² / (72.2 × x₁^(−m)), where m &gt; 0 is learned separately for each sample from its inputs. This report documents completed data preparation and data-driven cross-validation. Physics-informed training, full-training refitting, and final testing remain pending.</w:t>
       </w:r>
     </w:p>
     <w:p>
       <w:r>
-        <w:t>Database.xls contains one worksheet, “sorted all”. It uses a two-row header: merged section labels in the first row and feature names in the second. Loading with the second row as the header yields 1,865 observations, nine predictors (x1–x9), and one target (y), plus a sample identifier (ID). ID is retained for traceability and excluded from model inputs.</w:t>
+        <w:t>The supplied Database.xls workbook contains 1,865 observations, nine predictors (x1–x9), and target y. The second header row supplies feature names. IDs are unique and serve only as identifiers. No missing or nonfinite values were found. All observations were retained, including extreme values and repeated records. There are 1,859 distinct predictor combinations: six pairs share all nine inputs, including two pairs with identical y and four with different y. Predictor-group metadata prevent matching inputs from crossing partition boundaries; neither group number nor ID enters the network.</w:t>
+      </w:r>
+    </w:p>
+    <w:p>
+      <w:r>
+        <w:t>x1, x2, and y are positive; x3, x7, and x8 contain zeros. y ranges approximately from 0.000075 to 46.863905. The search compares raw inputs with log10-transformed x1, x2, x4, x5, and x6; other features remain unchanged. Compression is especially motivated by the broad ranges of x2 and x4. Each representation is standardized using fitting-fold means and standard deviations only. The fixed target representation is log10(y); predictions are recovered as 10 raised to the network output, with invalid numerical results rejected rather than clipped. Original feature units are retained for subsequent physical calculations.</w:t>
       </w:r>
     </w:p>
     <w:p>
@@ -46,7 +43,12 @@
         <w:pStyle w:val="Heading1"/>
       </w:pPr>
       <w:r>
-        <w:t>2. Data quality findings</w:t>
+        <w:t>2. Partitioning and search design</w:t>
+      </w:r>
+    </w:p>
+    <w:p>
+      <w:r>
+        <w:t>Seed-42 GroupShuffleSplit holds out 20% of predictor groups, yielding 1,493 training observations (80.05%) and 372 test observations (19.95%). Shuffled GroupKFold with seed 42 creates five group-disjoint training folds, containing 298, 298, 300, 300, and 297 validation observations. All samples are assigned once; group separation and deterministic regeneration were checked. These assignments will also be used for the physics-informed model. Test observations were not scored or used for tuning.</w:t>
       </w:r>
     </w:p>
     <w:tbl>
@@ -56,27 +58,39 @@
         <w:tblLook w:firstColumn="1" w:firstRow="1" w:lastColumn="0" w:lastRow="0" w:noHBand="0" w:noVBand="1" w:val="04A0"/>
       </w:tblPr>
       <w:tblGrid>
-        <w:gridCol w:w="5040"/>
-        <w:gridCol w:w="5040"/>
+        <w:gridCol w:w="5184"/>
+        <w:gridCol w:w="5184"/>
       </w:tblGrid>
       <w:tr>
         <w:tc>
           <w:tcPr>
-            <w:tcW w:type="dxa" w:w="5040"/>
+            <w:tcW w:type="dxa" w:w="5184"/>
           </w:tcPr>
           <w:p>
+            <w:pPr>
+              <w:spacing w:after="60" w:before="0"/>
+            </w:pPr>
             <w:r>
-              <w:t>Check</w:t>
+              <w:rPr>
+                <w:sz w:val="18"/>
+              </w:rPr>
+              <w:t>Hyperparameter</w:t>
             </w:r>
           </w:p>
         </w:tc>
         <w:tc>
           <w:tcPr>
-            <w:tcW w:type="dxa" w:w="5040"/>
+            <w:tcW w:type="dxa" w:w="5184"/>
           </w:tcPr>
           <w:p>
+            <w:pPr>
+              <w:spacing w:after="60" w:before="0"/>
+            </w:pPr>
             <w:r>
-              <w:t>Observed result</w:t>
+              <w:rPr>
+                <w:sz w:val="18"/>
+              </w:rPr>
+              <w:t>Candidate values / rationale</w:t>
             </w:r>
           </w:p>
         </w:tc>
@@ -84,21 +98,33 @@
       <w:tr>
         <w:tc>
           <w:tcPr>
-            <w:tcW w:type="dxa" w:w="5040"/>
+            <w:tcW w:type="dxa" w:w="5184"/>
           </w:tcPr>
           <w:p>
+            <w:pPr>
+              <w:spacing w:after="60" w:before="0"/>
+            </w:pPr>
             <w:r>
-              <w:t>Observations</w:t>
+              <w:rPr>
+                <w:sz w:val="18"/>
+              </w:rPr>
+              <w:t>Hidden layers; uniform width</w:t>
             </w:r>
           </w:p>
         </w:tc>
         <w:tc>
           <w:tcPr>
-            <w:tcW w:type="dxa" w:w="5040"/>
+            <w:tcW w:type="dxa" w:w="5184"/>
           </w:tcPr>
           <w:p>
+            <w:pPr>
+              <w:spacing w:after="60" w:before="0"/>
+            </w:pPr>
             <w:r>
-              <w:t>1,865</w:t>
+              <w:rPr>
+                <w:sz w:val="18"/>
+              </w:rPr>
+              <w:t>1, 2, 3 layers; 16, 32, 64 neurons: modest capacities for nine inputs</w:t>
             </w:r>
           </w:p>
         </w:tc>
@@ -106,21 +132,33 @@
       <w:tr>
         <w:tc>
           <w:tcPr>
-            <w:tcW w:type="dxa" w:w="5040"/>
+            <w:tcW w:type="dxa" w:w="5184"/>
           </w:tcPr>
           <w:p>
+            <w:pPr>
+              <w:spacing w:after="60" w:before="0"/>
+            </w:pPr>
             <w:r>
-              <w:t>Input features</w:t>
+              <w:rPr>
+                <w:sz w:val="18"/>
+              </w:rPr>
+              <w:t>Activation</w:t>
             </w:r>
           </w:p>
         </w:tc>
         <w:tc>
           <w:tcPr>
-            <w:tcW w:type="dxa" w:w="5040"/>
+            <w:tcW w:type="dxa" w:w="5184"/>
           </w:tcPr>
           <w:p>
+            <w:pPr>
+              <w:spacing w:after="60" w:before="0"/>
+            </w:pPr>
             <w:r>
-              <w:t>9: x1–x9</w:t>
+              <w:rPr>
+                <w:sz w:val="18"/>
+              </w:rPr>
+              <w:t>ReLU, tanh: piecewise-linear versus smooth mappings</w:t>
             </w:r>
           </w:p>
         </w:tc>
@@ -128,21 +166,33 @@
       <w:tr>
         <w:tc>
           <w:tcPr>
-            <w:tcW w:type="dxa" w:w="5040"/>
+            <w:tcW w:type="dxa" w:w="5184"/>
           </w:tcPr>
           <w:p>
+            <w:pPr>
+              <w:spacing w:after="60" w:before="0"/>
+            </w:pPr>
             <w:r>
-              <w:t>Missing / nonfinite cells</w:t>
+              <w:rPr>
+                <w:sz w:val="18"/>
+              </w:rPr>
+              <w:t>Learning rate</w:t>
             </w:r>
           </w:p>
         </w:tc>
         <w:tc>
           <w:tcPr>
-            <w:tcW w:type="dxa" w:w="5040"/>
+            <w:tcW w:type="dxa" w:w="5184"/>
           </w:tcPr>
           <w:p>
+            <w:pPr>
+              <w:spacing w:after="60" w:before="0"/>
+            </w:pPr>
             <w:r>
-              <w:t>0 / 0</w:t>
+              <w:rPr>
+                <w:sz w:val="18"/>
+              </w:rPr>
+              <w:t>0.0003, 0.001, 0.003: tenfold Adam rate range</w:t>
             </w:r>
           </w:p>
         </w:tc>
@@ -150,21 +200,33 @@
       <w:tr>
         <w:tc>
           <w:tcPr>
-            <w:tcW w:type="dxa" w:w="5040"/>
+            <w:tcW w:type="dxa" w:w="5184"/>
           </w:tcPr>
           <w:p>
+            <w:pPr>
+              <w:spacing w:after="60" w:before="0"/>
+            </w:pPr>
             <w:r>
-              <w:t>Duplicate sample IDs</w:t>
+              <w:rPr>
+                <w:sz w:val="18"/>
+              </w:rPr>
+              <w:t>Batch size</w:t>
             </w:r>
           </w:p>
         </w:tc>
         <w:tc>
           <w:tcPr>
-            <w:tcW w:type="dxa" w:w="5040"/>
+            <w:tcW w:type="dxa" w:w="5184"/>
           </w:tcPr>
           <w:p>
+            <w:pPr>
+              <w:spacing w:after="60" w:before="0"/>
+            </w:pPr>
             <w:r>
-              <w:t>0</w:t>
+              <w:rPr>
+                <w:sz w:val="18"/>
+              </w:rPr>
+              <w:t>32, 64, 128: different update frequencies and averaging</w:t>
             </w:r>
           </w:p>
         </w:tc>
@@ -172,21 +234,33 @@
       <w:tr>
         <w:tc>
           <w:tcPr>
-            <w:tcW w:type="dxa" w:w="5040"/>
+            <w:tcW w:type="dxa" w:w="5184"/>
           </w:tcPr>
           <w:p>
+            <w:pPr>
+              <w:spacing w:after="60" w:before="0"/>
+            </w:pPr>
             <w:r>
-              <w:t>Distinct predictor combinations</w:t>
+              <w:rPr>
+                <w:sz w:val="18"/>
+              </w:rPr>
+              <w:t>L2 coefficient</w:t>
             </w:r>
           </w:p>
         </w:tc>
         <w:tc>
           <w:tcPr>
-            <w:tcW w:type="dxa" w:w="5040"/>
+            <w:tcW w:type="dxa" w:w="5184"/>
           </w:tcPr>
           <w:p>
+            <w:pPr>
+              <w:spacing w:after="60" w:before="0"/>
+            </w:pPr>
             <w:r>
-              <w:t>1,859</w:t>
+              <w:rPr>
+                <w:sz w:val="18"/>
+              </w:rPr>
+              <w:t>0, 0.00001, 0.0001, 0.001: unregularized to stronger penalties</w:t>
             </w:r>
           </w:p>
         </w:tc>
@@ -194,109 +268,33 @@
       <w:tr>
         <w:tc>
           <w:tcPr>
-            <w:tcW w:type="dxa" w:w="5040"/>
+            <w:tcW w:type="dxa" w:w="5184"/>
           </w:tcPr>
           <w:p>
+            <w:pPr>
+              <w:spacing w:after="60" w:before="0"/>
+            </w:pPr>
             <w:r>
-              <w:t>Repeated predictor combinations</w:t>
+              <w:rPr>
+                <w:sz w:val="18"/>
+              </w:rPr>
+              <w:t>Selected input logarithms</w:t>
             </w:r>
           </w:p>
         </w:tc>
         <w:tc>
           <w:tcPr>
-            <w:tcW w:type="dxa" w:w="5040"/>
+            <w:tcW w:type="dxa" w:w="5184"/>
           </w:tcPr>
           <w:p>
+            <w:pPr>
+              <w:spacing w:after="60" w:before="0"/>
+            </w:pPr>
             <w:r>
-              <w:t>6 groups, each containing 2 rows</w:t>
-            </w:r>
-          </w:p>
-        </w:tc>
-      </w:tr>
-      <w:tr>
-        <w:tc>
-          <w:tcPr>
-            <w:tcW w:type="dxa" w:w="5040"/>
-          </w:tcPr>
-          <w:p>
-            <w:r>
-              <w:t>Rows in repeated predictor groups</w:t>
-            </w:r>
-          </w:p>
-        </w:tc>
-        <w:tc>
-          <w:tcPr>
-            <w:tcW w:type="dxa" w:w="5040"/>
-          </w:tcPr>
-          <w:p>
-            <w:r>
-              <w:t>12 (6 additional occurrences)</w:t>
-            </w:r>
-          </w:p>
-        </w:tc>
-      </w:tr>
-      <w:tr>
-        <w:tc>
-          <w:tcPr>
-            <w:tcW w:type="dxa" w:w="5040"/>
-          </w:tcPr>
-          <w:p>
-            <w:r>
-              <w:t>Repeated groups with different y values</w:t>
-            </w:r>
-          </w:p>
-        </w:tc>
-        <w:tc>
-          <w:tcPr>
-            <w:tcW w:type="dxa" w:w="5040"/>
-          </w:tcPr>
-          <w:p>
-            <w:r>
-              <w:t>4</w:t>
-            </w:r>
-          </w:p>
-        </w:tc>
-      </w:tr>
-      <w:tr>
-        <w:tc>
-          <w:tcPr>
-            <w:tcW w:type="dxa" w:w="5040"/>
-          </w:tcPr>
-          <w:p>
-            <w:r>
-              <w:t>Repeated groups with identical y values</w:t>
-            </w:r>
-          </w:p>
-        </w:tc>
-        <w:tc>
-          <w:tcPr>
-            <w:tcW w:type="dxa" w:w="5040"/>
-          </w:tcPr>
-          <w:p>
-            <w:r>
-              <w:t>2</w:t>
-            </w:r>
-          </w:p>
-        </w:tc>
-      </w:tr>
-      <w:tr>
-        <w:tc>
-          <w:tcPr>
-            <w:tcW w:type="dxa" w:w="5040"/>
-          </w:tcPr>
-          <w:p>
-            <w:r>
-              <w:t>Rows removed</w:t>
-            </w:r>
-          </w:p>
-        </w:tc>
-        <w:tc>
-          <w:tcPr>
-            <w:tcW w:type="dxa" w:w="5040"/>
-          </w:tcPr>
-          <w:p>
-            <w:r>
-              <w:t>0</w:t>
+              <w:rPr>
+                <w:sz w:val="18"/>
+              </w:rPr>
+              <w:t>Enabled or disabled; standardization follows either choice</w:t>
             </w:r>
           </w:p>
         </w:tc>
@@ -304,20 +302,7 @@
     </w:tbl>
     <w:p>
       <w:r>
-        <w:t>Repeated groups are defined by exact equality across all nine predictors, without using y. The two records with identical inputs and target are counted as additional occurrences after the first record; all observations are retained. Different targets for matching inputs indicate that these inputs alone do not uniquely determine the observed target. Their cause has not been established.</w:t>
-      </w:r>
-    </w:p>
-    <w:p>
-      <w:pPr>
-        <w:pStyle w:val="Heading1"/>
-      </w:pPr>
-      <w:r>
-        <w:t>3. Numerical ranges</w:t>
-      </w:r>
-    </w:p>
-    <w:p>
-      <w:r>
-        <w:t>Observed ranges are x1: 0.2094–0.8100; x2: approximately 0.083098–12,442.844754; and y: approximately 0.000075–46.863905. These three variables are strictly positive. Features x3, x7, and x8 contain zeros. The broad scales support considering input standardization and a logarithmic target representation, without taking logarithms of every input.</w:t>
+        <w:t>Twenty distinct combinations were sampled without replacement from 1,296 possibilities using NumPy seed 42, giving 100 fold fits. This is a predefined budget-limited random search, not exhaustive optimization. The training objective is mean squared log10-target error plus α times the sum of squared weight-matrix entries; biases are excluded from L2. No separate weight decay or learning-rate schedule is used.</w:t>
       </w:r>
     </w:p>
     <w:p>
@@ -330,55 +315,577 @@
         <w:pStyle w:val="Heading1"/>
       </w:pPr>
       <w:r>
-        <w:t>4. Preprocessing implemented</w:t>
+        <w:t>3. Training protocol and selected configuration</w:t>
       </w:r>
     </w:p>
     <w:p>
-      <w:pPr>
-        <w:pStyle w:val="ListBullet"/>
-      </w:pPr>
       <w:r>
-        <w:t>Workbook validation: Require the expected feature columns, numeric finite values, unique integer IDs, and strictly positive x1, x2, and y. Invalid data cause an explicit error rather than silent imputation, clipping, or deletion.</w:t>
+        <w:t>Adam uses β₁ = 0.9, β₂ = 0.999, and ε = 10⁻⁷. Hidden layers use He initialization for ReLU or Xavier initialization with tanh gain; the output uses Xavier initialization and biases start at zero. Fold seeds are 42 + fold number and are shared across candidates. CPU execution uses one PyTorch thread and deterministic algorithms. Early stopping monitors validation RMSLE, with 1,000 maximum epochs, patience 50, and minimum improvement 10⁻⁵. The absolute lowest validation-score checkpoint is retained; the improvement threshold controls patience only.</w:t>
       </w:r>
     </w:p>
     <w:p>
-      <w:pPr>
-        <w:pStyle w:val="ListBullet"/>
-      </w:pPr>
       <w:r>
-        <w:t>Observation retention: Keep all rows, including repeated records and extreme values. No observations have been removed because they may be difficult to predict.</w:t>
+        <w:t>The selection metric is RMSLE₁₀ = √mean[(log₁₀(1 + ŷ) − log₁₀(1 + y))²], with predictions on their original scale. This explicit +1 convention differs from RMSE in log10(y) space. The selected candidate minimizes mean validation RMSLE across five folds; standard deviation is calculated with ddof = 1.</w:t>
       </w:r>
     </w:p>
     <w:p>
-      <w:pPr>
-        <w:pStyle w:val="ListBullet"/>
-      </w:pPr>
       <w:r>
-        <w:t>Grouping metadata: Assign a predictor_group number to exact matches across x1–x9. This number is only for keeping matching inputs together during later partitioning; it is never a neural-network input.</w:t>
+        <w:t>Configuration 2 was selected: three hidden layers of 16 neurons (9 → 16 → 16 → 16 → 1), ReLU activation, learning rate 0.003, batch size 64, L2 coefficient 0.001, and selected-feature logarithms enabled. Mean validation RMSLE is 0.299685 ± 0.016474 (fold standard deviation). The next-ranked candidate scores 0.302644; this small difference does not establish statistical superiority.</w:t>
+      </w:r>
+    </w:p>
+    <w:tbl>
+      <w:tblPr>
+        <w:tblStyle w:val="LightShading-Accent1"/>
+        <w:tblW w:type="auto" w:w="0"/>
+        <w:tblLook w:firstColumn="1" w:firstRow="1" w:lastColumn="0" w:lastRow="0" w:noHBand="0" w:noVBand="1" w:val="04A0"/>
+      </w:tblPr>
+      <w:tblGrid>
+        <w:gridCol w:w="2074"/>
+        <w:gridCol w:w="2074"/>
+        <w:gridCol w:w="2074"/>
+        <w:gridCol w:w="2074"/>
+        <w:gridCol w:w="2074"/>
+      </w:tblGrid>
+      <w:tr>
+        <w:tc>
+          <w:tcPr>
+            <w:tcW w:type="dxa" w:w="2074"/>
+          </w:tcPr>
+          <w:p>
+            <w:pPr>
+              <w:spacing w:after="60" w:before="0"/>
+            </w:pPr>
+            <w:r>
+              <w:rPr>
+                <w:sz w:val="18"/>
+              </w:rPr>
+              <w:t>Fold</w:t>
+            </w:r>
+          </w:p>
+        </w:tc>
+        <w:tc>
+          <w:tcPr>
+            <w:tcW w:type="dxa" w:w="2074"/>
+          </w:tcPr>
+          <w:p>
+            <w:pPr>
+              <w:spacing w:after="60" w:before="0"/>
+            </w:pPr>
+            <w:r>
+              <w:rPr>
+                <w:sz w:val="18"/>
+              </w:rPr>
+              <w:t>Validation RMSLE</w:t>
+            </w:r>
+          </w:p>
+        </w:tc>
+        <w:tc>
+          <w:tcPr>
+            <w:tcW w:type="dxa" w:w="2074"/>
+          </w:tcPr>
+          <w:p>
+            <w:pPr>
+              <w:spacing w:after="60" w:before="0"/>
+            </w:pPr>
+            <w:r>
+              <w:rPr>
+                <w:sz w:val="18"/>
+              </w:rPr>
+              <w:t>Best epoch</w:t>
+            </w:r>
+          </w:p>
+        </w:tc>
+        <w:tc>
+          <w:tcPr>
+            <w:tcW w:type="dxa" w:w="2074"/>
+          </w:tcPr>
+          <w:p>
+            <w:pPr>
+              <w:spacing w:after="60" w:before="0"/>
+            </w:pPr>
+            <w:r>
+              <w:rPr>
+                <w:sz w:val="18"/>
+              </w:rPr>
+              <w:t>Stopping epoch</w:t>
+            </w:r>
+          </w:p>
+        </w:tc>
+        <w:tc>
+          <w:tcPr>
+            <w:tcW w:type="dxa" w:w="2074"/>
+          </w:tcPr>
+          <w:p>
+            <w:pPr>
+              <w:spacing w:after="60" w:before="0"/>
+            </w:pPr>
+            <w:r>
+              <w:rPr>
+                <w:sz w:val="18"/>
+              </w:rPr>
+              <w:t>Runtime (s)</w:t>
+            </w:r>
+          </w:p>
+        </w:tc>
+      </w:tr>
+      <w:tr>
+        <w:tc>
+          <w:tcPr>
+            <w:tcW w:type="dxa" w:w="2074"/>
+          </w:tcPr>
+          <w:p>
+            <w:pPr>
+              <w:spacing w:after="60" w:before="0"/>
+            </w:pPr>
+            <w:r>
+              <w:rPr>
+                <w:sz w:val="18"/>
+              </w:rPr>
+              <w:t>1</w:t>
+            </w:r>
+          </w:p>
+        </w:tc>
+        <w:tc>
+          <w:tcPr>
+            <w:tcW w:type="dxa" w:w="2074"/>
+          </w:tcPr>
+          <w:p>
+            <w:pPr>
+              <w:spacing w:after="60" w:before="0"/>
+            </w:pPr>
+            <w:r>
+              <w:rPr>
+                <w:sz w:val="18"/>
+              </w:rPr>
+              <w:t>0.304186</w:t>
+            </w:r>
+          </w:p>
+        </w:tc>
+        <w:tc>
+          <w:tcPr>
+            <w:tcW w:type="dxa" w:w="2074"/>
+          </w:tcPr>
+          <w:p>
+            <w:pPr>
+              <w:spacing w:after="60" w:before="0"/>
+            </w:pPr>
+            <w:r>
+              <w:rPr>
+                <w:sz w:val="18"/>
+              </w:rPr>
+              <w:t>31</w:t>
+            </w:r>
+          </w:p>
+        </w:tc>
+        <w:tc>
+          <w:tcPr>
+            <w:tcW w:type="dxa" w:w="2074"/>
+          </w:tcPr>
+          <w:p>
+            <w:pPr>
+              <w:spacing w:after="60" w:before="0"/>
+            </w:pPr>
+            <w:r>
+              <w:rPr>
+                <w:sz w:val="18"/>
+              </w:rPr>
+              <w:t>81</w:t>
+            </w:r>
+          </w:p>
+        </w:tc>
+        <w:tc>
+          <w:tcPr>
+            <w:tcW w:type="dxa" w:w="2074"/>
+          </w:tcPr>
+          <w:p>
+            <w:pPr>
+              <w:spacing w:after="60" w:before="0"/>
+            </w:pPr>
+            <w:r>
+              <w:rPr>
+                <w:sz w:val="18"/>
+              </w:rPr>
+              <w:t>1.01</w:t>
+            </w:r>
+          </w:p>
+        </w:tc>
+      </w:tr>
+      <w:tr>
+        <w:tc>
+          <w:tcPr>
+            <w:tcW w:type="dxa" w:w="2074"/>
+          </w:tcPr>
+          <w:p>
+            <w:pPr>
+              <w:spacing w:after="60" w:before="0"/>
+            </w:pPr>
+            <w:r>
+              <w:rPr>
+                <w:sz w:val="18"/>
+              </w:rPr>
+              <w:t>2</w:t>
+            </w:r>
+          </w:p>
+        </w:tc>
+        <w:tc>
+          <w:tcPr>
+            <w:tcW w:type="dxa" w:w="2074"/>
+          </w:tcPr>
+          <w:p>
+            <w:pPr>
+              <w:spacing w:after="60" w:before="0"/>
+            </w:pPr>
+            <w:r>
+              <w:rPr>
+                <w:sz w:val="18"/>
+              </w:rPr>
+              <w:t>0.307538</w:t>
+            </w:r>
+          </w:p>
+        </w:tc>
+        <w:tc>
+          <w:tcPr>
+            <w:tcW w:type="dxa" w:w="2074"/>
+          </w:tcPr>
+          <w:p>
+            <w:pPr>
+              <w:spacing w:after="60" w:before="0"/>
+            </w:pPr>
+            <w:r>
+              <w:rPr>
+                <w:sz w:val="18"/>
+              </w:rPr>
+              <w:t>123</w:t>
+            </w:r>
+          </w:p>
+        </w:tc>
+        <w:tc>
+          <w:tcPr>
+            <w:tcW w:type="dxa" w:w="2074"/>
+          </w:tcPr>
+          <w:p>
+            <w:pPr>
+              <w:spacing w:after="60" w:before="0"/>
+            </w:pPr>
+            <w:r>
+              <w:rPr>
+                <w:sz w:val="18"/>
+              </w:rPr>
+              <w:t>173</w:t>
+            </w:r>
+          </w:p>
+        </w:tc>
+        <w:tc>
+          <w:tcPr>
+            <w:tcW w:type="dxa" w:w="2074"/>
+          </w:tcPr>
+          <w:p>
+            <w:pPr>
+              <w:spacing w:after="60" w:before="0"/>
+            </w:pPr>
+            <w:r>
+              <w:rPr>
+                <w:sz w:val="18"/>
+              </w:rPr>
+              <w:t>2.23</w:t>
+            </w:r>
+          </w:p>
+        </w:tc>
+      </w:tr>
+      <w:tr>
+        <w:tc>
+          <w:tcPr>
+            <w:tcW w:type="dxa" w:w="2074"/>
+          </w:tcPr>
+          <w:p>
+            <w:pPr>
+              <w:spacing w:after="60" w:before="0"/>
+            </w:pPr>
+            <w:r>
+              <w:rPr>
+                <w:sz w:val="18"/>
+              </w:rPr>
+              <w:t>3</w:t>
+            </w:r>
+          </w:p>
+        </w:tc>
+        <w:tc>
+          <w:tcPr>
+            <w:tcW w:type="dxa" w:w="2074"/>
+          </w:tcPr>
+          <w:p>
+            <w:pPr>
+              <w:spacing w:after="60" w:before="0"/>
+            </w:pPr>
+            <w:r>
+              <w:rPr>
+                <w:sz w:val="18"/>
+              </w:rPr>
+              <w:t>0.285252</w:t>
+            </w:r>
+          </w:p>
+        </w:tc>
+        <w:tc>
+          <w:tcPr>
+            <w:tcW w:type="dxa" w:w="2074"/>
+          </w:tcPr>
+          <w:p>
+            <w:pPr>
+              <w:spacing w:after="60" w:before="0"/>
+            </w:pPr>
+            <w:r>
+              <w:rPr>
+                <w:sz w:val="18"/>
+              </w:rPr>
+              <w:t>89</w:t>
+            </w:r>
+          </w:p>
+        </w:tc>
+        <w:tc>
+          <w:tcPr>
+            <w:tcW w:type="dxa" w:w="2074"/>
+          </w:tcPr>
+          <w:p>
+            <w:pPr>
+              <w:spacing w:after="60" w:before="0"/>
+            </w:pPr>
+            <w:r>
+              <w:rPr>
+                <w:sz w:val="18"/>
+              </w:rPr>
+              <w:t>139</w:t>
+            </w:r>
+          </w:p>
+        </w:tc>
+        <w:tc>
+          <w:tcPr>
+            <w:tcW w:type="dxa" w:w="2074"/>
+          </w:tcPr>
+          <w:p>
+            <w:pPr>
+              <w:spacing w:after="60" w:before="0"/>
+            </w:pPr>
+            <w:r>
+              <w:rPr>
+                <w:sz w:val="18"/>
+              </w:rPr>
+              <w:t>1.90</w:t>
+            </w:r>
+          </w:p>
+        </w:tc>
+      </w:tr>
+      <w:tr>
+        <w:tc>
+          <w:tcPr>
+            <w:tcW w:type="dxa" w:w="2074"/>
+          </w:tcPr>
+          <w:p>
+            <w:pPr>
+              <w:spacing w:after="60" w:before="0"/>
+            </w:pPr>
+            <w:r>
+              <w:rPr>
+                <w:sz w:val="18"/>
+              </w:rPr>
+              <w:t>4</w:t>
+            </w:r>
+          </w:p>
+        </w:tc>
+        <w:tc>
+          <w:tcPr>
+            <w:tcW w:type="dxa" w:w="2074"/>
+          </w:tcPr>
+          <w:p>
+            <w:pPr>
+              <w:spacing w:after="60" w:before="0"/>
+            </w:pPr>
+            <w:r>
+              <w:rPr>
+                <w:sz w:val="18"/>
+              </w:rPr>
+              <w:t>0.320640</w:t>
+            </w:r>
+          </w:p>
+        </w:tc>
+        <w:tc>
+          <w:tcPr>
+            <w:tcW w:type="dxa" w:w="2074"/>
+          </w:tcPr>
+          <w:p>
+            <w:pPr>
+              <w:spacing w:after="60" w:before="0"/>
+            </w:pPr>
+            <w:r>
+              <w:rPr>
+                <w:sz w:val="18"/>
+              </w:rPr>
+              <w:t>39</w:t>
+            </w:r>
+          </w:p>
+        </w:tc>
+        <w:tc>
+          <w:tcPr>
+            <w:tcW w:type="dxa" w:w="2074"/>
+          </w:tcPr>
+          <w:p>
+            <w:pPr>
+              <w:spacing w:after="60" w:before="0"/>
+            </w:pPr>
+            <w:r>
+              <w:rPr>
+                <w:sz w:val="18"/>
+              </w:rPr>
+              <w:t>89</w:t>
+            </w:r>
+          </w:p>
+        </w:tc>
+        <w:tc>
+          <w:tcPr>
+            <w:tcW w:type="dxa" w:w="2074"/>
+          </w:tcPr>
+          <w:p>
+            <w:pPr>
+              <w:spacing w:after="60" w:before="0"/>
+            </w:pPr>
+            <w:r>
+              <w:rPr>
+                <w:sz w:val="18"/>
+              </w:rPr>
+              <w:t>1.21</w:t>
+            </w:r>
+          </w:p>
+        </w:tc>
+      </w:tr>
+      <w:tr>
+        <w:tc>
+          <w:tcPr>
+            <w:tcW w:type="dxa" w:w="2074"/>
+          </w:tcPr>
+          <w:p>
+            <w:pPr>
+              <w:spacing w:after="60" w:before="0"/>
+            </w:pPr>
+            <w:r>
+              <w:rPr>
+                <w:sz w:val="18"/>
+              </w:rPr>
+              <w:t>5</w:t>
+            </w:r>
+          </w:p>
+        </w:tc>
+        <w:tc>
+          <w:tcPr>
+            <w:tcW w:type="dxa" w:w="2074"/>
+          </w:tcPr>
+          <w:p>
+            <w:pPr>
+              <w:spacing w:after="60" w:before="0"/>
+            </w:pPr>
+            <w:r>
+              <w:rPr>
+                <w:sz w:val="18"/>
+              </w:rPr>
+              <w:t>0.280810</w:t>
+            </w:r>
+          </w:p>
+        </w:tc>
+        <w:tc>
+          <w:tcPr>
+            <w:tcW w:type="dxa" w:w="2074"/>
+          </w:tcPr>
+          <w:p>
+            <w:pPr>
+              <w:spacing w:after="60" w:before="0"/>
+            </w:pPr>
+            <w:r>
+              <w:rPr>
+                <w:sz w:val="18"/>
+              </w:rPr>
+              <w:t>78</w:t>
+            </w:r>
+          </w:p>
+        </w:tc>
+        <w:tc>
+          <w:tcPr>
+            <w:tcW w:type="dxa" w:w="2074"/>
+          </w:tcPr>
+          <w:p>
+            <w:pPr>
+              <w:spacing w:after="60" w:before="0"/>
+            </w:pPr>
+            <w:r>
+              <w:rPr>
+                <w:sz w:val="18"/>
+              </w:rPr>
+              <w:t>128</w:t>
+            </w:r>
+          </w:p>
+        </w:tc>
+        <w:tc>
+          <w:tcPr>
+            <w:tcW w:type="dxa" w:w="2074"/>
+          </w:tcPr>
+          <w:p>
+            <w:pPr>
+              <w:spacing w:after="60" w:before="0"/>
+            </w:pPr>
+            <w:r>
+              <w:rPr>
+                <w:sz w:val="18"/>
+              </w:rPr>
+              <w:t>1.69</w:t>
+            </w:r>
+          </w:p>
+        </w:tc>
+      </w:tr>
+    </w:tbl>
+    <w:p>
+      <w:r>
+        <w:drawing>
+          <wp:inline xmlns:a="http://schemas.openxmlformats.org/drawingml/2006/main" xmlns:pic="http://schemas.openxmlformats.org/drawingml/2006/picture">
+            <wp:extent cx="6355080" cy="3442335"/>
+            <wp:docPr id="1" name="Picture 1"/>
+            <wp:cNvGraphicFramePr>
+              <a:graphicFrameLocks noChangeAspect="1"/>
+            </wp:cNvGraphicFramePr>
+            <a:graphic>
+              <a:graphicData uri="http://schemas.openxmlformats.org/drawingml/2006/picture">
+                <pic:pic>
+                  <pic:nvPicPr>
+                    <pic:cNvPr id="0" name="selected_all_folds_learning_curves.png"/>
+                    <pic:cNvPicPr/>
+                  </pic:nvPicPr>
+                  <pic:blipFill>
+                    <a:blip r:embed="rId10"/>
+                    <a:stretch>
+                      <a:fillRect/>
+                    </a:stretch>
+                  </pic:blipFill>
+                  <pic:spPr>
+                    <a:xfrm>
+                      <a:off x="0" y="0"/>
+                      <a:ext cx="6355080" cy="3442335"/>
+                    </a:xfrm>
+                    <a:prstGeom prst="rect"/>
+                  </pic:spPr>
+                </pic:pic>
+              </a:graphicData>
+            </a:graphic>
+          </wp:inline>
+        </w:drawing>
       </w:r>
     </w:p>
     <w:p>
-      <w:pPr>
-        <w:pStyle w:val="ListBullet"/>
-      </w:pPr>
       <w:r>
-        <w:t>Input scaling: A FoldPreprocessor class provides standardization of the nine raw predictors. Each mean and standard deviation must be learned from the relevant training portion only. The same fitted transform will then be applied to validation data. No scaler has been fitted yet; the grouped partitions are now saved.</w:t>
+        <w:rPr>
+          <w:sz w:val="18"/>
+        </w:rPr>
+        <w:t>Figure 1. Training and validation RMSLE for all five folds of the selected configuration. Dashed lines mark retained checkpoints. Curves end at actual early-stopping epochs; shorter runs are not padded. Shared axes support comparison. No test error is plotted.</w:t>
       </w:r>
     </w:p>
     <w:p>
-      <w:pPr>
-        <w:pStyle w:val="ListBullet"/>
-      </w:pPr>
       <w:r>
-        <w:t>Target representation: The initial implementation uses log10(y), with inverse transformation 10 raised to the predicted value. This supports positive predictions; numerical overflow, underflow, or invalid outputs are treated as errors rather than silently clipped. This is an initial modeling choice, whose suitability has not yet been evaluated.</w:t>
-      </w:r>
-    </w:p>
-    <w:p>
-      <w:pPr>
-        <w:pStyle w:val="ListBullet"/>
-      </w:pPr>
-      <w:r>
-        <w:t>Physical units: Original feature values remain available. The physical equation must use original x1 and x2 values, rather than standardized inputs. The logarithmic target transform is separate from the required base-10 RMSLE metric, which will be implemented explicitly during evaluation.</w:t>
+        <w:br w:type="page"/>
       </w:r>
     </w:p>
     <w:p>
@@ -386,17 +893,22 @@
         <w:pStyle w:val="Heading1"/>
       </w:pPr>
       <w:r>
-        <w:t>5. Reproducibility and current outputs</w:t>
+        <w:t>4. Computational runtime and interpretation</w:t>
       </w:r>
     </w:p>
     <w:p>
       <w:r>
-        <w:t>The repository contains preprocess.py, a pinned requirements.txt, and reproduction instructions in README.md. The preprocessing command has been executed successfully against the supplied workbook. Generated outputs include validated_data.csv, descriptive_statistics.csv, repeated_predictors.csv, and data_audit.json under outputs/preprocessing/. Original observations and IDs are preserved in the validated output.</w:t>
+        <w:t>All 20 candidates completed five folds (100 fits). Cumulative measured fold-training time was 293.20 s (4.89 min); the complete search invocation took 294.29 s (4.90 min), excluding dependency installation. The selected candidate’s five fits required 8.05 s in total. These are measurements on the current single-threaded CPU environment, not estimates of Colab runtime. Software versions recorded with the experiment are Python 3.12.14, PyTorch 2.14.1+cpu, NumPy 2.3.5, pandas 2.2.3, and scikit-learn 1.8.0.</w:t>
       </w:r>
     </w:p>
     <w:p>
       <w:r>
-        <w:t>Command: python preprocess.py /path/to/Database.xls</w:t>
+        <w:t>No fit reached the epoch ceiling. Different stopping epochs reflect fold-specific validation trajectories. Training error generally continues to decline after validation improvement slows, indicating a generalization gap and supporting early stopping. The selected best epochs are 31, 123, 89, 39, and 78. Their median, 78 epochs, is the predetermined duration for subsequent refitting on all 1,493 training observations; no final refit has yet been performed.</w:t>
+      </w:r>
+    </w:p>
+    <w:p>
+      <w:r>
+        <w:t>The reported validation scores serve both early stopping and candidate selection and therefore are not an independent generalization estimate. Fold variability is not a confidence interval, and one seed per fold does not characterize initialization sensitivity. Twenty trials provide limited coverage of the search space. The fixed log-target objective and log(1+y) selection metric emphasize errors differently. Repeated inputs with different outputs also limit how uniquely the measured features determine y; their origin has not been established.</w:t>
       </w:r>
     </w:p>
     <w:p>
@@ -404,17 +916,272 @@
         <w:pStyle w:val="Heading1"/>
       </w:pPr>
       <w:r>
-        <w:t>6. Planned next steps and limitations</w:t>
+        <w:t>5. Final comparison: pending evaluation</w:t>
       </w:r>
     </w:p>
+    <w:tbl>
+      <w:tblPr>
+        <w:tblStyle w:val="LightShading-Accent1"/>
+        <w:tblW w:type="auto" w:w="0"/>
+        <w:tblLook w:firstColumn="1" w:firstRow="1" w:lastColumn="0" w:lastRow="0" w:noHBand="0" w:noVBand="1" w:val="04A0"/>
+      </w:tblPr>
+      <w:tblGrid>
+        <w:gridCol w:w="2074"/>
+        <w:gridCol w:w="2074"/>
+        <w:gridCol w:w="2074"/>
+        <w:gridCol w:w="2074"/>
+        <w:gridCol w:w="2074"/>
+      </w:tblGrid>
+      <w:tr>
+        <w:tc>
+          <w:tcPr>
+            <w:tcW w:type="dxa" w:w="2074"/>
+          </w:tcPr>
+          <w:p>
+            <w:pPr>
+              <w:spacing w:after="60" w:before="0"/>
+            </w:pPr>
+            <w:r>
+              <w:rPr>
+                <w:sz w:val="18"/>
+              </w:rPr>
+              <w:t>Model</w:t>
+            </w:r>
+          </w:p>
+        </w:tc>
+        <w:tc>
+          <w:tcPr>
+            <w:tcW w:type="dxa" w:w="2074"/>
+          </w:tcPr>
+          <w:p>
+            <w:pPr>
+              <w:spacing w:after="60" w:before="0"/>
+            </w:pPr>
+            <w:r>
+              <w:rPr>
+                <w:sz w:val="18"/>
+              </w:rPr>
+              <w:t>Training R²</w:t>
+            </w:r>
+          </w:p>
+        </w:tc>
+        <w:tc>
+          <w:tcPr>
+            <w:tcW w:type="dxa" w:w="2074"/>
+          </w:tcPr>
+          <w:p>
+            <w:pPr>
+              <w:spacing w:after="60" w:before="0"/>
+            </w:pPr>
+            <w:r>
+              <w:rPr>
+                <w:sz w:val="18"/>
+              </w:rPr>
+              <w:t>Training RMSLE</w:t>
+            </w:r>
+          </w:p>
+        </w:tc>
+        <w:tc>
+          <w:tcPr>
+            <w:tcW w:type="dxa" w:w="2074"/>
+          </w:tcPr>
+          <w:p>
+            <w:pPr>
+              <w:spacing w:after="60" w:before="0"/>
+            </w:pPr>
+            <w:r>
+              <w:rPr>
+                <w:sz w:val="18"/>
+              </w:rPr>
+              <w:t>Testing R²</w:t>
+            </w:r>
+          </w:p>
+        </w:tc>
+        <w:tc>
+          <w:tcPr>
+            <w:tcW w:type="dxa" w:w="2074"/>
+          </w:tcPr>
+          <w:p>
+            <w:pPr>
+              <w:spacing w:after="60" w:before="0"/>
+            </w:pPr>
+            <w:r>
+              <w:rPr>
+                <w:sz w:val="18"/>
+              </w:rPr>
+              <w:t>Testing RMSLE</w:t>
+            </w:r>
+          </w:p>
+        </w:tc>
+      </w:tr>
+      <w:tr>
+        <w:tc>
+          <w:tcPr>
+            <w:tcW w:type="dxa" w:w="2074"/>
+          </w:tcPr>
+          <w:p>
+            <w:pPr>
+              <w:spacing w:after="60" w:before="0"/>
+            </w:pPr>
+            <w:r>
+              <w:rPr>
+                <w:sz w:val="18"/>
+              </w:rPr>
+              <w:t>Data-driven network</w:t>
+            </w:r>
+          </w:p>
+        </w:tc>
+        <w:tc>
+          <w:tcPr>
+            <w:tcW w:type="dxa" w:w="2074"/>
+          </w:tcPr>
+          <w:p>
+            <w:pPr>
+              <w:spacing w:after="60" w:before="0"/>
+            </w:pPr>
+            <w:r>
+              <w:rPr>
+                <w:sz w:val="18"/>
+              </w:rPr>
+              <w:t>Pending</w:t>
+            </w:r>
+          </w:p>
+        </w:tc>
+        <w:tc>
+          <w:tcPr>
+            <w:tcW w:type="dxa" w:w="2074"/>
+          </w:tcPr>
+          <w:p>
+            <w:pPr>
+              <w:spacing w:after="60" w:before="0"/>
+            </w:pPr>
+            <w:r>
+              <w:rPr>
+                <w:sz w:val="18"/>
+              </w:rPr>
+              <w:t>Pending</w:t>
+            </w:r>
+          </w:p>
+        </w:tc>
+        <w:tc>
+          <w:tcPr>
+            <w:tcW w:type="dxa" w:w="2074"/>
+          </w:tcPr>
+          <w:p>
+            <w:pPr>
+              <w:spacing w:after="60" w:before="0"/>
+            </w:pPr>
+            <w:r>
+              <w:rPr>
+                <w:sz w:val="18"/>
+              </w:rPr>
+              <w:t>Pending</w:t>
+            </w:r>
+          </w:p>
+        </w:tc>
+        <w:tc>
+          <w:tcPr>
+            <w:tcW w:type="dxa" w:w="2074"/>
+          </w:tcPr>
+          <w:p>
+            <w:pPr>
+              <w:spacing w:after="60" w:before="0"/>
+            </w:pPr>
+            <w:r>
+              <w:rPr>
+                <w:sz w:val="18"/>
+              </w:rPr>
+              <w:t>Pending</w:t>
+            </w:r>
+          </w:p>
+        </w:tc>
+      </w:tr>
+      <w:tr>
+        <w:tc>
+          <w:tcPr>
+            <w:tcW w:type="dxa" w:w="2074"/>
+          </w:tcPr>
+          <w:p>
+            <w:pPr>
+              <w:spacing w:after="60" w:before="0"/>
+            </w:pPr>
+            <w:r>
+              <w:rPr>
+                <w:sz w:val="18"/>
+              </w:rPr>
+              <w:t>Physics-informed network</w:t>
+            </w:r>
+          </w:p>
+        </w:tc>
+        <w:tc>
+          <w:tcPr>
+            <w:tcW w:type="dxa" w:w="2074"/>
+          </w:tcPr>
+          <w:p>
+            <w:pPr>
+              <w:spacing w:after="60" w:before="0"/>
+            </w:pPr>
+            <w:r>
+              <w:rPr>
+                <w:sz w:val="18"/>
+              </w:rPr>
+              <w:t>Pending</w:t>
+            </w:r>
+          </w:p>
+        </w:tc>
+        <w:tc>
+          <w:tcPr>
+            <w:tcW w:type="dxa" w:w="2074"/>
+          </w:tcPr>
+          <w:p>
+            <w:pPr>
+              <w:spacing w:after="60" w:before="0"/>
+            </w:pPr>
+            <w:r>
+              <w:rPr>
+                <w:sz w:val="18"/>
+              </w:rPr>
+              <w:t>Pending</w:t>
+            </w:r>
+          </w:p>
+        </w:tc>
+        <w:tc>
+          <w:tcPr>
+            <w:tcW w:type="dxa" w:w="2074"/>
+          </w:tcPr>
+          <w:p>
+            <w:pPr>
+              <w:spacing w:after="60" w:before="0"/>
+            </w:pPr>
+            <w:r>
+              <w:rPr>
+                <w:sz w:val="18"/>
+              </w:rPr>
+              <w:t>Pending</w:t>
+            </w:r>
+          </w:p>
+        </w:tc>
+        <w:tc>
+          <w:tcPr>
+            <w:tcW w:type="dxa" w:w="2074"/>
+          </w:tcPr>
+          <w:p>
+            <w:pPr>
+              <w:spacing w:after="60" w:before="0"/>
+            </w:pPr>
+            <w:r>
+              <w:rPr>
+                <w:sz w:val="18"/>
+              </w:rPr>
+              <w:t>Pending</w:t>
+            </w:r>
+          </w:p>
+        </w:tc>
+      </w:tr>
+    </w:tbl>
     <w:p>
       <w:r>
-        <w:t>A grouped split using seed 42 assigns 1,493 samples (80.05%) to training and 372 (19.95%) to testing. Five training folds contain 298, 298, 300, 300, and 297 validation samples. GroupShuffleSplit uses 20% of predictor groups for testing; shuffled GroupKFold creates training folds. Neither uses targets. Complete sample coverage, no group overlap, and deterministic regeneration were checked. Assignments and a summary are saved under outputs/partitions/. Reuse these assignments for both models. Next, define the data-driven network search space and budget. Fit preprocessing separately within each fold, use validation data for early stopping and selection, and keep test data out of all tuning decisions.</w:t>
-      </w:r>
-    </w:p>
-    <w:p>
-      <w:r>
-        <w:t>Model architectures, search budgets, final training durations, predictive metrics, learned exponent summaries, and required figures are not yet available. No claims about model accuracy or physical agreement can be made. The final submission requires a PDF of at most three pages; this Word draft will be revised and condensed as results become available.</w:t>
+        <w:t>The table is intentionally incomplete: cross-validation scores must not be substituted for finalized-model training or testing metrics. Final R² will be calculated from residuals on the original y scale. After physics-informed selection and full-training refitting, each finalized model will be evaluated on the untouched test set without adjustment. The observed-versus-predicted training/test panels and the physics-loss and exponent-evolution diagnostics remain outstanding.</w:t>
       </w:r>
     </w:p>
     <w:p>
@@ -422,18 +1189,36 @@
         <w:pStyle w:val="Heading1"/>
       </w:pPr>
       <w:r>
-        <w:t>7. Assistance disclosure</w:t>
+        <w:t>6. Reproducibility and next stage</w:t>
       </w:r>
     </w:p>
     <w:p>
       <w:r>
-        <w:t>OpenAI Codex assisted with reading the challenge, inspecting the workbook, implementing preprocessing, and drafting this report. The submitter should review, understand, and verify the methods and disclose this assistance in the final submission.</w:t>
+        <w:t>The Colab notebook and standalone Python scripts reproduce data preparation, saved grouped partitions, and the predefined search. Dependencies are pinned. Outputs include the sampled configurations and software manifest, all 100 fold scores and histories, fold checkpoints with scaler statistics, validation predictions linked to IDs, and the selected settings. configuration_results.csv and configuration_results.md are generated from measured fold results and record every candidate’s hyperparameters, five scores, mean, standard deviation, rank, and runtime. The original training source is archived to match the recorded source hash.</w:t>
+      </w:r>
+    </w:p>
+    <w:p>
+      <w:r>
+        <w:t>Next, define a jointly trained positive sample-dependent exponent component and a physics-loss weight search, preserving the equation in original units. Use the same saved partitions and keep the test set excluded from model selection. This Word report is maintained separately from the analysis notebook. The final submission must be a PDF of at most three pages and will be revised when both models are complete.</w:t>
+      </w:r>
+    </w:p>
+    <w:p>
+      <w:pPr>
+        <w:pStyle w:val="Heading1"/>
+      </w:pPr>
+      <w:r>
+        <w:t>Assistance disclosure and source material</w:t>
+      </w:r>
+    </w:p>
+    <w:p>
+      <w:r>
+        <w:t>Source material: the supplied Coding Challenge.pdf and Database.xls. OpenAI Codex assisted with data inspection, Python implementation, cross-validation execution, visualization, and report drafting. The author must review and understand the implementation, verify the findings, and disclose this assistance in the final submission. No external predictive baseline or physical interpretation has yet been validated.</w:t>
       </w:r>
     </w:p>
     <w:sectPr>
       <w:footerReference w:type="default" r:id="rId9"/>
       <w:pgSz w:w="12240" w:h="15840"/>
-      <w:pgMar w:top="1008" w:right="1080" w:bottom="1008" w:left="1080" w:header="720" w:footer="720" w:gutter="0"/>
+      <w:pgMar w:top="864" w:right="936" w:bottom="864" w:left="936" w:header="720" w:footer="720" w:gutter="0"/>
       <w:cols w:space="720"/>
       <w:docGrid w:linePitch="360"/>
     </w:sectPr>
@@ -448,8 +1233,9 @@
       <w:pStyle w:val="Footer"/>
     </w:pPr>
     <w:r>
-      <w:t>UTA Coding Challenge | Working progress report | Preprocessing stage</w:t>
+      <w:t xml:space="preserve">UTA Coding Challenge | Interim analysis, October 20, 2026 | </w:t>
     </w:r>
+    <w:fldSimple w:instr="PAGE"/>
   </w:p>
 </w:ftr>
 </file>
@@ -818,7 +1604,7 @@
     <w:qFormat/>
     <w:rsid w:val="00FC693F"/>
     <w:pPr>
-      <w:spacing w:after="120"/>
+      <w:spacing w:after="100" w:line="240" w:lineRule="auto"/>
     </w:pPr>
     <w:rPr>
       <w:rFonts w:ascii="Calibri" w:hAnsi="Calibri"/>
@@ -880,15 +1666,15 @@
     <w:pPr>
       <w:keepNext/>
       <w:keepLines/>
-      <w:spacing w:before="480" w:after="0"/>
+      <w:spacing w:before="160" w:after="80"/>
       <w:outlineLvl w:val="0"/>
     </w:pPr>
     <w:rPr>
       <w:rFonts w:asciiTheme="majorHAnsi" w:eastAsiaTheme="majorEastAsia" w:hAnsiTheme="majorHAnsi" w:cstheme="majorBidi"/>
       <w:b/>
       <w:bCs/>
-      <w:color w:val="204864"/>
-      <w:sz w:val="28"/>
+      <w:color w:val="203E55"/>
+      <w:sz w:val="24"/>
       <w:szCs w:val="28"/>
     </w:rPr>
   </w:style>
@@ -904,15 +1690,15 @@
     <w:pPr>
       <w:keepNext/>
       <w:keepLines/>
-      <w:spacing w:before="200" w:after="0"/>
+      <w:spacing w:before="160" w:after="80"/>
       <w:outlineLvl w:val="1"/>
     </w:pPr>
     <w:rPr>
       <w:rFonts w:asciiTheme="majorHAnsi" w:eastAsiaTheme="majorEastAsia" w:hAnsiTheme="majorHAnsi" w:cstheme="majorBidi"/>
       <w:b/>
       <w:bCs/>
-      <w:color w:val="204864"/>
-      <w:sz w:val="26"/>
+      <w:color w:val="203E55"/>
+      <w:sz w:val="22"/>
       <w:szCs w:val="26"/>
     </w:rPr>
   </w:style>
@@ -1177,7 +1963,7 @@
       <w:color w:val="17365D" w:themeColor="text2" w:themeShade="BF"/>
       <w:spacing w:val="5"/>
       <w:kern w:val="28"/>
-      <w:sz w:val="52"/>
+      <w:sz w:val="38"/>
       <w:szCs w:val="52"/>
     </w:rPr>
   </w:style>

</xml_diff>

<commit_message>
Complete physics-informed comparison, final evaluation, and academic report
</commit_message>
<xml_diff>
--- a/reports/preprocessing_progress_report.docx
+++ b/reports/preprocessing_progress_report.docx
@@ -11,44 +11,26 @@
       </w:r>
     </w:p>
     <w:p>
-      <w:r>
-        <w:t>Interim academic report: data preparation and data-driven model selection</w:t>
-      </w:r>
-    </w:p>
-    <w:p>
       <w:pPr>
         <w:pStyle w:val="Heading1"/>
       </w:pPr>
       <w:r>
-        <w:t>1. Objective and data preparation</w:t>
+        <w:t>1. Data, protocol, and model selection</w:t>
       </w:r>
     </w:p>
     <w:p>
       <w:r>
-        <w:t>The objective is to compare a feedforward regression network with a physics-informed network incorporating y = x₂² / (72.2 × x₁^(−m)), where m &gt; 0 is learned separately for each sample from its inputs. This report documents completed data preparation and data-driven cross-validation. Physics-informed training, full-training refitting, and final testing remain pending.</w:t>
+        <w:t>We compare a feedforward regression network with a jointly trained physics-informed model. Database.xls contains 1,865 samples, nine predictors, and target y. IDs are excluded from prediction. The two-row header was handled explicitly; there are no missing/nonfinite values or duplicate IDs. All observations were retained. Six pairs share all nine predictors: two also share y, while four have different y. Exact predictor combinations define groups, giving 1,859 groups and preventing repeated inputs from crossing partitions.</w:t>
       </w:r>
     </w:p>
     <w:p>
       <w:r>
-        <w:t>The supplied Database.xls workbook contains 1,865 observations, nine predictors (x1–x9), and target y. The second header row supplies feature names. IDs are unique and serve only as identifiers. No missing or nonfinite values were found. All observations were retained, including extreme values and repeated records. There are 1,859 distinct predictor combinations: six pairs share all nine inputs, including two pairs with identical y and four with different y. Predictor-group metadata prevent matching inputs from crossing partition boundaries; neither group number nor ID enters the network.</w:t>
+        <w:t>Seed-42 GroupShuffleSplit holds out 20% of groups: 1,493 training and 372 testing samples (80.05/19.95%). Shuffled GroupKFold, seed 42, forms five training folds with 298, 298, 300, 300, and 297 validation samples. Both models use identical saved assignments. Standardization is fitted separately on each fitting fold. Positive x1, x2, x4, x5, and x6 are optionally log10-transformed first; zero-valued features are not logged. The fixed log10(y) target accommodates its approximately 0.000075–46.863905 range. Predictions are 10 raised to the network output; invalid values raise errors, with no clipping.</w:t>
       </w:r>
     </w:p>
     <w:p>
       <w:r>
-        <w:t>x1, x2, and y are positive; x3, x7, and x8 contain zeros. y ranges approximately from 0.000075 to 46.863905. The search compares raw inputs with log10-transformed x1, x2, x4, x5, and x6; other features remain unchanged. Compression is especially motivated by the broad ranges of x2 and x4. Each representation is standardized using fitting-fold means and standard deviations only. The fixed target representation is log10(y); predictions are recovered as 10 raised to the network output, with invalid numerical results rejected rather than clipped. Original feature units are retained for subsequent physical calculations.</w:t>
-      </w:r>
-    </w:p>
-    <w:p>
-      <w:pPr>
-        <w:pStyle w:val="Heading1"/>
-      </w:pPr>
-      <w:r>
-        <w:t>2. Partitioning and search design</w:t>
-      </w:r>
-    </w:p>
-    <w:p>
-      <w:r>
-        <w:t>Seed-42 GroupShuffleSplit holds out 20% of predictor groups, yielding 1,493 training observations (80.05%) and 372 test observations (19.95%). Shuffled GroupKFold with seed 42 creates five group-disjoint training folds, containing 298, 298, 300, 300, and 297 validation observations. All samples are assigned once; group separation and deterministic regeneration were checked. These assignments will also be used for the physics-informed model. Test observations were not scored or used for tuning.</w:t>
+        <w:t>The physics model predicts m = softplus(g(X)) &gt; 0 jointly with z = log10(ŷ). In original numerical units, z_phys = 2 log10(x2) − log10(72.2) + m log10(x1), equivalent to y_phys = x2²/[72.2 x1^(−m)]. Its objective is mean[(z − log10(y))²] + λ mean[(z − z_phys)²] + αΣ||W||². The data-driven model omits the physics term. Biases are excluded from L2. The physical residual sends gradients to both networks; equation equivalence and nonzero gradients were verified.</w:t>
       </w:r>
     </w:p>
     <w:tbl>
@@ -58,39 +40,39 @@
         <w:tblLook w:firstColumn="1" w:firstRow="1" w:lastColumn="0" w:lastRow="0" w:noHBand="0" w:noVBand="1" w:val="04A0"/>
       </w:tblPr>
       <w:tblGrid>
-        <w:gridCol w:w="5184"/>
-        <w:gridCol w:w="5184"/>
+        <w:gridCol w:w="5256"/>
+        <w:gridCol w:w="5256"/>
       </w:tblGrid>
       <w:tr>
         <w:tc>
           <w:tcPr>
-            <w:tcW w:type="dxa" w:w="5184"/>
+            <w:tcW w:type="dxa" w:w="5256"/>
           </w:tcPr>
           <w:p>
             <w:pPr>
-              <w:spacing w:after="60" w:before="0"/>
+              <w:spacing w:after="40"/>
             </w:pPr>
             <w:r>
               <w:rPr>
-                <w:sz w:val="18"/>
+                <w:sz w:val="17"/>
               </w:rPr>
-              <w:t>Hyperparameter</w:t>
+              <w:t>Choice</w:t>
             </w:r>
           </w:p>
         </w:tc>
         <w:tc>
           <w:tcPr>
-            <w:tcW w:type="dxa" w:w="5184"/>
+            <w:tcW w:type="dxa" w:w="5256"/>
           </w:tcPr>
           <w:p>
             <w:pPr>
-              <w:spacing w:after="60" w:before="0"/>
+              <w:spacing w:after="40"/>
             </w:pPr>
             <w:r>
               <w:rPr>
-                <w:sz w:val="18"/>
+                <w:sz w:val="17"/>
               </w:rPr>
-              <w:t>Candidate values / rationale</w:t>
+              <w:t>Search / rationale</w:t>
             </w:r>
           </w:p>
         </w:tc>
@@ -98,33 +80,33 @@
       <w:tr>
         <w:tc>
           <w:tcPr>
-            <w:tcW w:type="dxa" w:w="5184"/>
+            <w:tcW w:type="dxa" w:w="5256"/>
           </w:tcPr>
           <w:p>
             <w:pPr>
-              <w:spacing w:after="60" w:before="0"/>
+              <w:spacing w:after="40"/>
             </w:pPr>
             <w:r>
               <w:rPr>
-                <w:sz w:val="18"/>
+                <w:sz w:val="17"/>
               </w:rPr>
-              <w:t>Hidden layers; uniform width</w:t>
+              <w:t>Prediction architecture</w:t>
             </w:r>
           </w:p>
         </w:tc>
         <w:tc>
           <w:tcPr>
-            <w:tcW w:type="dxa" w:w="5184"/>
+            <w:tcW w:type="dxa" w:w="5256"/>
           </w:tcPr>
           <w:p>
             <w:pPr>
-              <w:spacing w:after="60" w:before="0"/>
+              <w:spacing w:after="40"/>
             </w:pPr>
             <w:r>
               <w:rPr>
-                <w:sz w:val="18"/>
+                <w:sz w:val="17"/>
               </w:rPr>
-              <w:t>1, 2, 3 layers; 16, 32, 64 neurons: modest capacities for nine inputs</w:t>
+              <w:t>1–3 layers; uniform widths 16/32/64; ReLU/tanh: modest nonlinear capacities</w:t>
             </w:r>
           </w:p>
         </w:tc>
@@ -132,33 +114,33 @@
       <w:tr>
         <w:tc>
           <w:tcPr>
-            <w:tcW w:type="dxa" w:w="5184"/>
+            <w:tcW w:type="dxa" w:w="5256"/>
           </w:tcPr>
           <w:p>
             <w:pPr>
-              <w:spacing w:after="60" w:before="0"/>
+              <w:spacing w:after="40"/>
             </w:pPr>
             <w:r>
               <w:rPr>
-                <w:sz w:val="18"/>
+                <w:sz w:val="17"/>
               </w:rPr>
-              <w:t>Activation</w:t>
+              <w:t>Optimization</w:t>
             </w:r>
           </w:p>
         </w:tc>
         <w:tc>
           <w:tcPr>
-            <w:tcW w:type="dxa" w:w="5184"/>
+            <w:tcW w:type="dxa" w:w="5256"/>
           </w:tcPr>
           <w:p>
             <w:pPr>
-              <w:spacing w:after="60" w:before="0"/>
+              <w:spacing w:after="40"/>
             </w:pPr>
             <w:r>
               <w:rPr>
-                <w:sz w:val="18"/>
+                <w:sz w:val="17"/>
               </w:rPr>
-              <w:t>ReLU, tanh: piecewise-linear versus smooth mappings</w:t>
+              <w:t>Adam; rates 0.0003/0.001/0.003; batches 32/64/128; L2 0/1e−5/1e−4/1e−3</w:t>
             </w:r>
           </w:p>
         </w:tc>
@@ -166,33 +148,33 @@
       <w:tr>
         <w:tc>
           <w:tcPr>
-            <w:tcW w:type="dxa" w:w="5184"/>
+            <w:tcW w:type="dxa" w:w="5256"/>
           </w:tcPr>
           <w:p>
             <w:pPr>
-              <w:spacing w:after="60" w:before="0"/>
+              <w:spacing w:after="40"/>
             </w:pPr>
             <w:r>
               <w:rPr>
-                <w:sz w:val="18"/>
+                <w:sz w:val="17"/>
               </w:rPr>
-              <w:t>Learning rate</w:t>
+              <w:t>Input representation</w:t>
             </w:r>
           </w:p>
         </w:tc>
         <w:tc>
           <w:tcPr>
-            <w:tcW w:type="dxa" w:w="5184"/>
+            <w:tcW w:type="dxa" w:w="5256"/>
           </w:tcPr>
           <w:p>
             <w:pPr>
-              <w:spacing w:after="60" w:before="0"/>
+              <w:spacing w:after="40"/>
             </w:pPr>
             <w:r>
               <w:rPr>
-                <w:sz w:val="18"/>
+                <w:sz w:val="17"/>
               </w:rPr>
-              <w:t>0.0003, 0.001, 0.003: tenfold Adam rate range</w:t>
+              <w:t>Selected logs on/off, then standardization: assess compression, especially x2/x4</w:t>
             </w:r>
           </w:p>
         </w:tc>
@@ -200,33 +182,33 @@
       <w:tr>
         <w:tc>
           <w:tcPr>
-            <w:tcW w:type="dxa" w:w="5184"/>
+            <w:tcW w:type="dxa" w:w="5256"/>
           </w:tcPr>
           <w:p>
             <w:pPr>
-              <w:spacing w:after="60" w:before="0"/>
+              <w:spacing w:after="40"/>
             </w:pPr>
             <w:r>
               <w:rPr>
-                <w:sz w:val="18"/>
+                <w:sz w:val="17"/>
               </w:rPr>
-              <w:t>Batch size</w:t>
+              <w:t>Physics exponent network</w:t>
             </w:r>
           </w:p>
         </w:tc>
         <w:tc>
           <w:tcPr>
-            <w:tcW w:type="dxa" w:w="5184"/>
+            <w:tcW w:type="dxa" w:w="5256"/>
           </w:tcPr>
           <w:p>
             <w:pPr>
-              <w:spacing w:after="60" w:before="0"/>
+              <w:spacing w:after="40"/>
             </w:pPr>
             <w:r>
               <w:rPr>
-                <w:sz w:val="18"/>
+                <w:sz w:val="17"/>
               </w:rPr>
-              <w:t>32, 64, 128: different update frequencies and averaging</w:t>
+              <w:t>Tanh hidden sizes (8), (16), (16,8); inputs x1–x2/all: limited scalar-map capacity</w:t>
             </w:r>
           </w:p>
         </w:tc>
@@ -234,33 +216,152 @@
       <w:tr>
         <w:tc>
           <w:tcPr>
-            <w:tcW w:type="dxa" w:w="5184"/>
+            <w:tcW w:type="dxa" w:w="5256"/>
           </w:tcPr>
           <w:p>
             <w:pPr>
-              <w:spacing w:after="60" w:before="0"/>
+              <w:spacing w:after="40"/>
             </w:pPr>
             <w:r>
               <w:rPr>
-                <w:sz w:val="18"/>
+                <w:sz w:val="17"/>
               </w:rPr>
-              <w:t>L2 coefficient</w:t>
+              <w:t>Physics optimization</w:t>
             </w:r>
           </w:p>
         </w:tc>
         <w:tc>
           <w:tcPr>
-            <w:tcW w:type="dxa" w:w="5184"/>
+            <w:tcW w:type="dxa" w:w="5256"/>
           </w:tcPr>
           <w:p>
             <w:pPr>
-              <w:spacing w:after="60" w:before="0"/>
+              <w:spacing w:after="40"/>
             </w:pPr>
             <w:r>
               <w:rPr>
-                <w:sz w:val="18"/>
+                <w:sz w:val="17"/>
               </w:rPr>
-              <w:t>0, 0.00001, 0.0001, 0.001: unregularized to stronger penalties</w:t>
+              <w:t>Fixed selected backbone, batch/L2/logs; retune the three rates; λ = 0.01/0.1/1/10</w:t>
+            </w:r>
+          </w:p>
+        </w:tc>
+      </w:tr>
+    </w:tbl>
+    <w:p>
+      <w:r>
+        <w:t>Each search samples 20 distinct candidates without replacement (seed 42): 20/1,296 data-driven and 20/72 physics configurations, totaling 200 fold fits. Adam uses β=(0.9,0.999), ε=1e−7. He/ReLU and Xavier/tanh initialization are used with zero biases; output weights use Xavier initialization. Fold seeds are 42+fold. Early stopping uses validation RMSLE, a 1,000-epoch ceiling, patience 50, and min_delta=1e−5; retain the absolute minimum checkpoint. Select by mean five-fold RMSLE and report sample SD (ddof=1).</w:t>
+      </w:r>
+    </w:p>
+    <w:p>
+      <w:r>
+        <w:t>Selected data-driven settings: 16–16–16 ReLU, learning rate 0.003, batch 64, L2 0.001, logs enabled; validation RMSLE 0.299685 ± 0.016474. Physics retains that backbone and selects exponent hidden sizes [16], inputs x1_x2, learning rate 0.003, and λ=0.01; validation RMSLE 0.298574 ± 0.015089. Other features x3–x9 contribute through the prediction network.</w:t>
+      </w:r>
+    </w:p>
+    <w:p>
+      <w:pPr>
+        <w:pStyle w:val="Heading1"/>
+      </w:pPr>
+      <w:r>
+        <w:t>2. Final refitting and predictive results</w:t>
+      </w:r>
+    </w:p>
+    <w:p>
+      <w:r>
+        <w:t>Before testing, durations were fixed to median selected CV best epochs: 78 (data-driven) and 116 (physics-informed). New scalers and models were fitted on all training samples, seed 42, without test/validation monitoring. R² = 1 − SSE/SST uses original-scale residuals. RMSLE₁₀ = √mean[(log10(1+ŷ) − log10(1+y))²]; this +1 convention differs from the log-target training loss. Finalized models were evaluated without further adjustment.</w:t>
+      </w:r>
+    </w:p>
+    <w:tbl>
+      <w:tblPr>
+        <w:tblStyle w:val="LightShading-Accent1"/>
+        <w:tblW w:type="auto" w:w="0"/>
+        <w:tblLook w:firstColumn="1" w:firstRow="1" w:lastColumn="0" w:lastRow="0" w:noHBand="0" w:noVBand="1" w:val="04A0"/>
+      </w:tblPr>
+      <w:tblGrid>
+        <w:gridCol w:w="2102"/>
+        <w:gridCol w:w="2102"/>
+        <w:gridCol w:w="2102"/>
+        <w:gridCol w:w="2102"/>
+        <w:gridCol w:w="2102"/>
+      </w:tblGrid>
+      <w:tr>
+        <w:tc>
+          <w:tcPr>
+            <w:tcW w:type="dxa" w:w="2102"/>
+          </w:tcPr>
+          <w:p>
+            <w:pPr>
+              <w:spacing w:after="40"/>
+            </w:pPr>
+            <w:r>
+              <w:rPr>
+                <w:sz w:val="17"/>
+              </w:rPr>
+              <w:t>Model</w:t>
+            </w:r>
+          </w:p>
+        </w:tc>
+        <w:tc>
+          <w:tcPr>
+            <w:tcW w:type="dxa" w:w="2102"/>
+          </w:tcPr>
+          <w:p>
+            <w:pPr>
+              <w:spacing w:after="40"/>
+            </w:pPr>
+            <w:r>
+              <w:rPr>
+                <w:sz w:val="17"/>
+              </w:rPr>
+              <w:t>Training R²</w:t>
+            </w:r>
+          </w:p>
+        </w:tc>
+        <w:tc>
+          <w:tcPr>
+            <w:tcW w:type="dxa" w:w="2102"/>
+          </w:tcPr>
+          <w:p>
+            <w:pPr>
+              <w:spacing w:after="40"/>
+            </w:pPr>
+            <w:r>
+              <w:rPr>
+                <w:sz w:val="17"/>
+              </w:rPr>
+              <w:t>Training RMSLE</w:t>
+            </w:r>
+          </w:p>
+        </w:tc>
+        <w:tc>
+          <w:tcPr>
+            <w:tcW w:type="dxa" w:w="2102"/>
+          </w:tcPr>
+          <w:p>
+            <w:pPr>
+              <w:spacing w:after="40"/>
+            </w:pPr>
+            <w:r>
+              <w:rPr>
+                <w:sz w:val="17"/>
+              </w:rPr>
+              <w:t>Testing R²</w:t>
+            </w:r>
+          </w:p>
+        </w:tc>
+        <w:tc>
+          <w:tcPr>
+            <w:tcW w:type="dxa" w:w="2102"/>
+          </w:tcPr>
+          <w:p>
+            <w:pPr>
+              <w:spacing w:after="40"/>
+            </w:pPr>
+            <w:r>
+              <w:rPr>
+                <w:sz w:val="17"/>
+              </w:rPr>
+              <w:t>Testing RMSLE</w:t>
             </w:r>
           </w:p>
         </w:tc>
@@ -268,43 +369,168 @@
       <w:tr>
         <w:tc>
           <w:tcPr>
-            <w:tcW w:type="dxa" w:w="5184"/>
+            <w:tcW w:type="dxa" w:w="2102"/>
           </w:tcPr>
           <w:p>
             <w:pPr>
-              <w:spacing w:after="60" w:before="0"/>
+              <w:spacing w:after="40"/>
             </w:pPr>
             <w:r>
               <w:rPr>
-                <w:sz w:val="18"/>
+                <w:sz w:val="17"/>
               </w:rPr>
-              <w:t>Selected input logarithms</w:t>
+              <w:t>Data-driven</w:t>
             </w:r>
           </w:p>
         </w:tc>
         <w:tc>
           <w:tcPr>
-            <w:tcW w:type="dxa" w:w="5184"/>
+            <w:tcW w:type="dxa" w:w="2102"/>
           </w:tcPr>
           <w:p>
             <w:pPr>
-              <w:spacing w:after="60" w:before="0"/>
+              <w:spacing w:after="40"/>
             </w:pPr>
             <w:r>
               <w:rPr>
-                <w:sz w:val="18"/>
+                <w:sz w:val="17"/>
               </w:rPr>
-              <w:t>Enabled or disabled; standardization follows either choice</w:t>
+              <w:t>0.0896</w:t>
+            </w:r>
+          </w:p>
+        </w:tc>
+        <w:tc>
+          <w:tcPr>
+            <w:tcW w:type="dxa" w:w="2102"/>
+          </w:tcPr>
+          <w:p>
+            <w:pPr>
+              <w:spacing w:after="40"/>
+            </w:pPr>
+            <w:r>
+              <w:rPr>
+                <w:sz w:val="17"/>
+              </w:rPr>
+              <w:t>0.2808</w:t>
+            </w:r>
+          </w:p>
+        </w:tc>
+        <w:tc>
+          <w:tcPr>
+            <w:tcW w:type="dxa" w:w="2102"/>
+          </w:tcPr>
+          <w:p>
+            <w:pPr>
+              <w:spacing w:after="40"/>
+            </w:pPr>
+            <w:r>
+              <w:rPr>
+                <w:sz w:val="17"/>
+              </w:rPr>
+              <w:t>0.1803</w:t>
+            </w:r>
+          </w:p>
+        </w:tc>
+        <w:tc>
+          <w:tcPr>
+            <w:tcW w:type="dxa" w:w="2102"/>
+          </w:tcPr>
+          <w:p>
+            <w:pPr>
+              <w:spacing w:after="40"/>
+            </w:pPr>
+            <w:r>
+              <w:rPr>
+                <w:sz w:val="17"/>
+              </w:rPr>
+              <w:t>0.2855</w:t>
+            </w:r>
+          </w:p>
+        </w:tc>
+      </w:tr>
+      <w:tr>
+        <w:tc>
+          <w:tcPr>
+            <w:tcW w:type="dxa" w:w="2102"/>
+          </w:tcPr>
+          <w:p>
+            <w:pPr>
+              <w:spacing w:after="40"/>
+            </w:pPr>
+            <w:r>
+              <w:rPr>
+                <w:sz w:val="17"/>
+              </w:rPr>
+              <w:t>Physics-informed</w:t>
+            </w:r>
+          </w:p>
+        </w:tc>
+        <w:tc>
+          <w:tcPr>
+            <w:tcW w:type="dxa" w:w="2102"/>
+          </w:tcPr>
+          <w:p>
+            <w:pPr>
+              <w:spacing w:after="40"/>
+            </w:pPr>
+            <w:r>
+              <w:rPr>
+                <w:sz w:val="17"/>
+              </w:rPr>
+              <w:t>0.1886</w:t>
+            </w:r>
+          </w:p>
+        </w:tc>
+        <w:tc>
+          <w:tcPr>
+            <w:tcW w:type="dxa" w:w="2102"/>
+          </w:tcPr>
+          <w:p>
+            <w:pPr>
+              <w:spacing w:after="40"/>
+            </w:pPr>
+            <w:r>
+              <w:rPr>
+                <w:sz w:val="17"/>
+              </w:rPr>
+              <w:t>0.2725</w:t>
+            </w:r>
+          </w:p>
+        </w:tc>
+        <w:tc>
+          <w:tcPr>
+            <w:tcW w:type="dxa" w:w="2102"/>
+          </w:tcPr>
+          <w:p>
+            <w:pPr>
+              <w:spacing w:after="40"/>
+            </w:pPr>
+            <w:r>
+              <w:rPr>
+                <w:sz w:val="17"/>
+              </w:rPr>
+              <w:t>0.2082</w:t>
+            </w:r>
+          </w:p>
+        </w:tc>
+        <w:tc>
+          <w:tcPr>
+            <w:tcW w:type="dxa" w:w="2102"/>
+          </w:tcPr>
+          <w:p>
+            <w:pPr>
+              <w:spacing w:after="40"/>
+            </w:pPr>
+            <w:r>
+              <w:rPr>
+                <w:sz w:val="17"/>
+              </w:rPr>
+              <w:t>0.2810</w:t>
             </w:r>
           </w:p>
         </w:tc>
       </w:tr>
     </w:tbl>
-    <w:p>
-      <w:r>
-        <w:t>Twenty distinct combinations were sampled without replacement from 1,296 possibilities using NumPy seed 42, giving 100 fold fits. This is a predefined budget-limited random search, not exhaustive optimization. The training objective is mean squared log10-target error plus α times the sum of squared weight-matrix entries; biases are excluded from L2. No separate weight decay or learning-rate schedule is used.</w:t>
-      </w:r>
-    </w:p>
     <w:p>
       <w:r>
         <w:br w:type="page"/>
@@ -315,535 +541,14 @@
         <w:pStyle w:val="Heading1"/>
       </w:pPr>
       <w:r>
-        <w:t>3. Training protocol and selected configuration</w:t>
+        <w:t>3. Training behavior and learned exponent</w:t>
       </w:r>
     </w:p>
     <w:p>
       <w:r>
-        <w:t>Adam uses β₁ = 0.9, β₂ = 0.999, and ε = 10⁻⁷. Hidden layers use He initialization for ReLU or Xavier initialization with tanh gain; the output uses Xavier initialization and biases start at zero. Fold seeds are 42 + fold number and are shared across candidates. CPU execution uses one PyTorch thread and deterministic algorithms. Early stopping monitors validation RMSLE, with 1,000 maximum epochs, patience 50, and minimum improvement 10⁻⁵. The absolute lowest validation-score checkpoint is retained; the improvement threshold controls patience only.</w:t>
-      </w:r>
-    </w:p>
-    <w:p>
-      <w:r>
-        <w:t>The selection metric is RMSLE₁₀ = √mean[(log₁₀(1 + ŷ) − log₁₀(1 + y))²], with predictions on their original scale. This explicit +1 convention differs from RMSE in log10(y) space. The selected candidate minimizes mean validation RMSLE across five folds; standard deviation is calculated with ddof = 1.</w:t>
-      </w:r>
-    </w:p>
-    <w:p>
-      <w:r>
-        <w:t>Configuration 2 was selected: three hidden layers of 16 neurons (9 → 16 → 16 → 16 → 1), ReLU activation, learning rate 0.003, batch size 64, L2 coefficient 0.001, and selected-feature logarithms enabled. Mean validation RMSLE is 0.299685 ± 0.016474 (fold standard deviation). The next-ranked candidate scores 0.302644; this small difference does not establish statistical superiority.</w:t>
-      </w:r>
-    </w:p>
-    <w:tbl>
-      <w:tblPr>
-        <w:tblStyle w:val="LightShading-Accent1"/>
-        <w:tblW w:type="auto" w:w="0"/>
-        <w:tblLook w:firstColumn="1" w:firstRow="1" w:lastColumn="0" w:lastRow="0" w:noHBand="0" w:noVBand="1" w:val="04A0"/>
-      </w:tblPr>
-      <w:tblGrid>
-        <w:gridCol w:w="2074"/>
-        <w:gridCol w:w="2074"/>
-        <w:gridCol w:w="2074"/>
-        <w:gridCol w:w="2074"/>
-        <w:gridCol w:w="2074"/>
-      </w:tblGrid>
-      <w:tr>
-        <w:tc>
-          <w:tcPr>
-            <w:tcW w:type="dxa" w:w="2074"/>
-          </w:tcPr>
-          <w:p>
-            <w:pPr>
-              <w:spacing w:after="60" w:before="0"/>
-            </w:pPr>
-            <w:r>
-              <w:rPr>
-                <w:sz w:val="18"/>
-              </w:rPr>
-              <w:t>Fold</w:t>
-            </w:r>
-          </w:p>
-        </w:tc>
-        <w:tc>
-          <w:tcPr>
-            <w:tcW w:type="dxa" w:w="2074"/>
-          </w:tcPr>
-          <w:p>
-            <w:pPr>
-              <w:spacing w:after="60" w:before="0"/>
-            </w:pPr>
-            <w:r>
-              <w:rPr>
-                <w:sz w:val="18"/>
-              </w:rPr>
-              <w:t>Validation RMSLE</w:t>
-            </w:r>
-          </w:p>
-        </w:tc>
-        <w:tc>
-          <w:tcPr>
-            <w:tcW w:type="dxa" w:w="2074"/>
-          </w:tcPr>
-          <w:p>
-            <w:pPr>
-              <w:spacing w:after="60" w:before="0"/>
-            </w:pPr>
-            <w:r>
-              <w:rPr>
-                <w:sz w:val="18"/>
-              </w:rPr>
-              <w:t>Best epoch</w:t>
-            </w:r>
-          </w:p>
-        </w:tc>
-        <w:tc>
-          <w:tcPr>
-            <w:tcW w:type="dxa" w:w="2074"/>
-          </w:tcPr>
-          <w:p>
-            <w:pPr>
-              <w:spacing w:after="60" w:before="0"/>
-            </w:pPr>
-            <w:r>
-              <w:rPr>
-                <w:sz w:val="18"/>
-              </w:rPr>
-              <w:t>Stopping epoch</w:t>
-            </w:r>
-          </w:p>
-        </w:tc>
-        <w:tc>
-          <w:tcPr>
-            <w:tcW w:type="dxa" w:w="2074"/>
-          </w:tcPr>
-          <w:p>
-            <w:pPr>
-              <w:spacing w:after="60" w:before="0"/>
-            </w:pPr>
-            <w:r>
-              <w:rPr>
-                <w:sz w:val="18"/>
-              </w:rPr>
-              <w:t>Runtime (s)</w:t>
-            </w:r>
-          </w:p>
-        </w:tc>
-      </w:tr>
-      <w:tr>
-        <w:tc>
-          <w:tcPr>
-            <w:tcW w:type="dxa" w:w="2074"/>
-          </w:tcPr>
-          <w:p>
-            <w:pPr>
-              <w:spacing w:after="60" w:before="0"/>
-            </w:pPr>
-            <w:r>
-              <w:rPr>
-                <w:sz w:val="18"/>
-              </w:rPr>
-              <w:t>1</w:t>
-            </w:r>
-          </w:p>
-        </w:tc>
-        <w:tc>
-          <w:tcPr>
-            <w:tcW w:type="dxa" w:w="2074"/>
-          </w:tcPr>
-          <w:p>
-            <w:pPr>
-              <w:spacing w:after="60" w:before="0"/>
-            </w:pPr>
-            <w:r>
-              <w:rPr>
-                <w:sz w:val="18"/>
-              </w:rPr>
-              <w:t>0.304186</w:t>
-            </w:r>
-          </w:p>
-        </w:tc>
-        <w:tc>
-          <w:tcPr>
-            <w:tcW w:type="dxa" w:w="2074"/>
-          </w:tcPr>
-          <w:p>
-            <w:pPr>
-              <w:spacing w:after="60" w:before="0"/>
-            </w:pPr>
-            <w:r>
-              <w:rPr>
-                <w:sz w:val="18"/>
-              </w:rPr>
-              <w:t>31</w:t>
-            </w:r>
-          </w:p>
-        </w:tc>
-        <w:tc>
-          <w:tcPr>
-            <w:tcW w:type="dxa" w:w="2074"/>
-          </w:tcPr>
-          <w:p>
-            <w:pPr>
-              <w:spacing w:after="60" w:before="0"/>
-            </w:pPr>
-            <w:r>
-              <w:rPr>
-                <w:sz w:val="18"/>
-              </w:rPr>
-              <w:t>81</w:t>
-            </w:r>
-          </w:p>
-        </w:tc>
-        <w:tc>
-          <w:tcPr>
-            <w:tcW w:type="dxa" w:w="2074"/>
-          </w:tcPr>
-          <w:p>
-            <w:pPr>
-              <w:spacing w:after="60" w:before="0"/>
-            </w:pPr>
-            <w:r>
-              <w:rPr>
-                <w:sz w:val="18"/>
-              </w:rPr>
-              <w:t>1.01</w:t>
-            </w:r>
-          </w:p>
-        </w:tc>
-      </w:tr>
-      <w:tr>
-        <w:tc>
-          <w:tcPr>
-            <w:tcW w:type="dxa" w:w="2074"/>
-          </w:tcPr>
-          <w:p>
-            <w:pPr>
-              <w:spacing w:after="60" w:before="0"/>
-            </w:pPr>
-            <w:r>
-              <w:rPr>
-                <w:sz w:val="18"/>
-              </w:rPr>
-              <w:t>2</w:t>
-            </w:r>
-          </w:p>
-        </w:tc>
-        <w:tc>
-          <w:tcPr>
-            <w:tcW w:type="dxa" w:w="2074"/>
-          </w:tcPr>
-          <w:p>
-            <w:pPr>
-              <w:spacing w:after="60" w:before="0"/>
-            </w:pPr>
-            <w:r>
-              <w:rPr>
-                <w:sz w:val="18"/>
-              </w:rPr>
-              <w:t>0.307538</w:t>
-            </w:r>
-          </w:p>
-        </w:tc>
-        <w:tc>
-          <w:tcPr>
-            <w:tcW w:type="dxa" w:w="2074"/>
-          </w:tcPr>
-          <w:p>
-            <w:pPr>
-              <w:spacing w:after="60" w:before="0"/>
-            </w:pPr>
-            <w:r>
-              <w:rPr>
-                <w:sz w:val="18"/>
-              </w:rPr>
-              <w:t>123</w:t>
-            </w:r>
-          </w:p>
-        </w:tc>
-        <w:tc>
-          <w:tcPr>
-            <w:tcW w:type="dxa" w:w="2074"/>
-          </w:tcPr>
-          <w:p>
-            <w:pPr>
-              <w:spacing w:after="60" w:before="0"/>
-            </w:pPr>
-            <w:r>
-              <w:rPr>
-                <w:sz w:val="18"/>
-              </w:rPr>
-              <w:t>173</w:t>
-            </w:r>
-          </w:p>
-        </w:tc>
-        <w:tc>
-          <w:tcPr>
-            <w:tcW w:type="dxa" w:w="2074"/>
-          </w:tcPr>
-          <w:p>
-            <w:pPr>
-              <w:spacing w:after="60" w:before="0"/>
-            </w:pPr>
-            <w:r>
-              <w:rPr>
-                <w:sz w:val="18"/>
-              </w:rPr>
-              <w:t>2.23</w:t>
-            </w:r>
-          </w:p>
-        </w:tc>
-      </w:tr>
-      <w:tr>
-        <w:tc>
-          <w:tcPr>
-            <w:tcW w:type="dxa" w:w="2074"/>
-          </w:tcPr>
-          <w:p>
-            <w:pPr>
-              <w:spacing w:after="60" w:before="0"/>
-            </w:pPr>
-            <w:r>
-              <w:rPr>
-                <w:sz w:val="18"/>
-              </w:rPr>
-              <w:t>3</w:t>
-            </w:r>
-          </w:p>
-        </w:tc>
-        <w:tc>
-          <w:tcPr>
-            <w:tcW w:type="dxa" w:w="2074"/>
-          </w:tcPr>
-          <w:p>
-            <w:pPr>
-              <w:spacing w:after="60" w:before="0"/>
-            </w:pPr>
-            <w:r>
-              <w:rPr>
-                <w:sz w:val="18"/>
-              </w:rPr>
-              <w:t>0.285252</w:t>
-            </w:r>
-          </w:p>
-        </w:tc>
-        <w:tc>
-          <w:tcPr>
-            <w:tcW w:type="dxa" w:w="2074"/>
-          </w:tcPr>
-          <w:p>
-            <w:pPr>
-              <w:spacing w:after="60" w:before="0"/>
-            </w:pPr>
-            <w:r>
-              <w:rPr>
-                <w:sz w:val="18"/>
-              </w:rPr>
-              <w:t>89</w:t>
-            </w:r>
-          </w:p>
-        </w:tc>
-        <w:tc>
-          <w:tcPr>
-            <w:tcW w:type="dxa" w:w="2074"/>
-          </w:tcPr>
-          <w:p>
-            <w:pPr>
-              <w:spacing w:after="60" w:before="0"/>
-            </w:pPr>
-            <w:r>
-              <w:rPr>
-                <w:sz w:val="18"/>
-              </w:rPr>
-              <w:t>139</w:t>
-            </w:r>
-          </w:p>
-        </w:tc>
-        <w:tc>
-          <w:tcPr>
-            <w:tcW w:type="dxa" w:w="2074"/>
-          </w:tcPr>
-          <w:p>
-            <w:pPr>
-              <w:spacing w:after="60" w:before="0"/>
-            </w:pPr>
-            <w:r>
-              <w:rPr>
-                <w:sz w:val="18"/>
-              </w:rPr>
-              <w:t>1.90</w:t>
-            </w:r>
-          </w:p>
-        </w:tc>
-      </w:tr>
-      <w:tr>
-        <w:tc>
-          <w:tcPr>
-            <w:tcW w:type="dxa" w:w="2074"/>
-          </w:tcPr>
-          <w:p>
-            <w:pPr>
-              <w:spacing w:after="60" w:before="0"/>
-            </w:pPr>
-            <w:r>
-              <w:rPr>
-                <w:sz w:val="18"/>
-              </w:rPr>
-              <w:t>4</w:t>
-            </w:r>
-          </w:p>
-        </w:tc>
-        <w:tc>
-          <w:tcPr>
-            <w:tcW w:type="dxa" w:w="2074"/>
-          </w:tcPr>
-          <w:p>
-            <w:pPr>
-              <w:spacing w:after="60" w:before="0"/>
-            </w:pPr>
-            <w:r>
-              <w:rPr>
-                <w:sz w:val="18"/>
-              </w:rPr>
-              <w:t>0.320640</w:t>
-            </w:r>
-          </w:p>
-        </w:tc>
-        <w:tc>
-          <w:tcPr>
-            <w:tcW w:type="dxa" w:w="2074"/>
-          </w:tcPr>
-          <w:p>
-            <w:pPr>
-              <w:spacing w:after="60" w:before="0"/>
-            </w:pPr>
-            <w:r>
-              <w:rPr>
-                <w:sz w:val="18"/>
-              </w:rPr>
-              <w:t>39</w:t>
-            </w:r>
-          </w:p>
-        </w:tc>
-        <w:tc>
-          <w:tcPr>
-            <w:tcW w:type="dxa" w:w="2074"/>
-          </w:tcPr>
-          <w:p>
-            <w:pPr>
-              <w:spacing w:after="60" w:before="0"/>
-            </w:pPr>
-            <w:r>
-              <w:rPr>
-                <w:sz w:val="18"/>
-              </w:rPr>
-              <w:t>89</w:t>
-            </w:r>
-          </w:p>
-        </w:tc>
-        <w:tc>
-          <w:tcPr>
-            <w:tcW w:type="dxa" w:w="2074"/>
-          </w:tcPr>
-          <w:p>
-            <w:pPr>
-              <w:spacing w:after="60" w:before="0"/>
-            </w:pPr>
-            <w:r>
-              <w:rPr>
-                <w:sz w:val="18"/>
-              </w:rPr>
-              <w:t>1.21</w:t>
-            </w:r>
-          </w:p>
-        </w:tc>
-      </w:tr>
-      <w:tr>
-        <w:tc>
-          <w:tcPr>
-            <w:tcW w:type="dxa" w:w="2074"/>
-          </w:tcPr>
-          <w:p>
-            <w:pPr>
-              <w:spacing w:after="60" w:before="0"/>
-            </w:pPr>
-            <w:r>
-              <w:rPr>
-                <w:sz w:val="18"/>
-              </w:rPr>
-              <w:t>5</w:t>
-            </w:r>
-          </w:p>
-        </w:tc>
-        <w:tc>
-          <w:tcPr>
-            <w:tcW w:type="dxa" w:w="2074"/>
-          </w:tcPr>
-          <w:p>
-            <w:pPr>
-              <w:spacing w:after="60" w:before="0"/>
-            </w:pPr>
-            <w:r>
-              <w:rPr>
-                <w:sz w:val="18"/>
-              </w:rPr>
-              <w:t>0.280810</w:t>
-            </w:r>
-          </w:p>
-        </w:tc>
-        <w:tc>
-          <w:tcPr>
-            <w:tcW w:type="dxa" w:w="2074"/>
-          </w:tcPr>
-          <w:p>
-            <w:pPr>
-              <w:spacing w:after="60" w:before="0"/>
-            </w:pPr>
-            <w:r>
-              <w:rPr>
-                <w:sz w:val="18"/>
-              </w:rPr>
-              <w:t>78</w:t>
-            </w:r>
-          </w:p>
-        </w:tc>
-        <w:tc>
-          <w:tcPr>
-            <w:tcW w:type="dxa" w:w="2074"/>
-          </w:tcPr>
-          <w:p>
-            <w:pPr>
-              <w:spacing w:after="60" w:before="0"/>
-            </w:pPr>
-            <w:r>
-              <w:rPr>
-                <w:sz w:val="18"/>
-              </w:rPr>
-              <w:t>128</w:t>
-            </w:r>
-          </w:p>
-        </w:tc>
-        <w:tc>
-          <w:tcPr>
-            <w:tcW w:type="dxa" w:w="2074"/>
-          </w:tcPr>
-          <w:p>
-            <w:pPr>
-              <w:spacing w:after="60" w:before="0"/>
-            </w:pPr>
-            <w:r>
-              <w:rPr>
-                <w:sz w:val="18"/>
-              </w:rPr>
-              <w:t>1.69</w:t>
-            </w:r>
-          </w:p>
-        </w:tc>
-      </w:tr>
-    </w:tbl>
-    <w:p>
-      <w:r>
         <w:drawing>
           <wp:inline xmlns:a="http://schemas.openxmlformats.org/drawingml/2006/main" xmlns:pic="http://schemas.openxmlformats.org/drawingml/2006/picture">
-            <wp:extent cx="6355080" cy="3442335"/>
+            <wp:extent cx="6492240" cy="2267776"/>
             <wp:docPr id="1" name="Picture 1"/>
             <wp:cNvGraphicFramePr>
               <a:graphicFrameLocks noChangeAspect="1"/>
@@ -852,7 +557,7 @@
               <a:graphicData uri="http://schemas.openxmlformats.org/drawingml/2006/picture">
                 <pic:pic>
                   <pic:nvPicPr>
-                    <pic:cNvPr id="0" name="selected_all_folds_learning_curves.png"/>
+                    <pic:cNvPr id="0" name="training_validation_curves.png"/>
                     <pic:cNvPicPr/>
                   </pic:nvPicPr>
                   <pic:blipFill>
@@ -864,7 +569,7 @@
                   <pic:spPr>
                     <a:xfrm>
                       <a:off x="0" y="0"/>
-                      <a:ext cx="6355080" cy="3442335"/>
+                      <a:ext cx="6492240" cy="2267776"/>
                     </a:xfrm>
                     <a:prstGeom prst="rect"/>
                   </pic:spPr>
@@ -878,9 +583,328 @@
     <w:p>
       <w:r>
         <w:rPr>
-          <w:sz w:val="18"/>
+          <w:sz w:val="17"/>
         </w:rPr>
-        <w:t>Figure 1. Training and validation RMSLE for all five folds of the selected configuration. Dashed lines mark retained checkpoints. Curves end at actual early-stopping epochs; shorter runs are not padded. Shared axes support comparison. No test error is plotted.</w:t>
+        <w:t>Figure 1. Training and validation RMSLE versus epoch for preselected CV fold 1 of each selected configuration. Dashed lines mark retained epochs; curves end at actual early stopping. All five folds are provided in supporting outputs. No test error was monitored against epoch.</w:t>
+      </w:r>
+    </w:p>
+    <w:p>
+      <w:r>
+        <w:drawing>
+          <wp:inline xmlns:a="http://schemas.openxmlformats.org/drawingml/2006/main" xmlns:pic="http://schemas.openxmlformats.org/drawingml/2006/picture">
+            <wp:extent cx="6492240" cy="1803400"/>
+            <wp:docPr id="2" name="Picture 2"/>
+            <wp:cNvGraphicFramePr>
+              <a:graphicFrameLocks noChangeAspect="1"/>
+            </wp:cNvGraphicFramePr>
+            <a:graphic>
+              <a:graphicData uri="http://schemas.openxmlformats.org/drawingml/2006/picture">
+                <pic:pic>
+                  <pic:nvPicPr>
+                    <pic:cNvPr id="0" name="physics_training_diagnostics.png"/>
+                    <pic:cNvPicPr/>
+                  </pic:nvPicPr>
+                  <pic:blipFill>
+                    <a:blip r:embed="rId11"/>
+                    <a:stretch>
+                      <a:fillRect/>
+                    </a:stretch>
+                  </pic:blipFill>
+                  <pic:spPr>
+                    <a:xfrm>
+                      <a:off x="0" y="0"/>
+                      <a:ext cx="6492240" cy="1803400"/>
+                    </a:xfrm>
+                    <a:prstGeom prst="rect"/>
+                  </pic:spPr>
+                </pic:pic>
+              </a:graphicData>
+            </a:graphic>
+          </wp:inline>
+        </w:drawing>
+      </w:r>
+    </w:p>
+    <w:p>
+      <w:r>
+        <w:rPr>
+          <w:sz w:val="17"/>
+        </w:rPr>
+        <w:t>Figure 2. Separate unweighted data and physics losses (log10-space MSE), and m evolution on fixed fitting-fold inputs, for physics-informed CV fold 1. The band is the sample 10th–90th percentile, not uncertainty. Dashed lines mark the retained checkpoint. Full-training refit diagnostics are supplied separately.</w:t>
+      </w:r>
+    </w:p>
+    <w:p>
+      <w:r>
+        <w:t>m is sample-dependent; a single global exponent would be misleading. Final-model summaries below describe the learned distribution, and every sample’s m is saved with its ID. Test exponents are generated from features alone. No observed y is passed to the exponent network at inference.</w:t>
+      </w:r>
+    </w:p>
+    <w:tbl>
+      <w:tblPr>
+        <w:tblStyle w:val="LightShading-Accent1"/>
+        <w:tblW w:type="auto" w:w="0"/>
+        <w:tblLook w:firstColumn="1" w:firstRow="1" w:lastColumn="0" w:lastRow="0" w:noHBand="0" w:noVBand="1" w:val="04A0"/>
+      </w:tblPr>
+      <w:tblGrid>
+        <w:gridCol w:w="2102"/>
+        <w:gridCol w:w="2102"/>
+        <w:gridCol w:w="2102"/>
+        <w:gridCol w:w="2102"/>
+        <w:gridCol w:w="2102"/>
+      </w:tblGrid>
+      <w:tr>
+        <w:tc>
+          <w:tcPr>
+            <w:tcW w:type="dxa" w:w="2102"/>
+          </w:tcPr>
+          <w:p>
+            <w:pPr>
+              <w:spacing w:after="40"/>
+            </w:pPr>
+            <w:r>
+              <w:rPr>
+                <w:sz w:val="17"/>
+              </w:rPr>
+              <w:t>Partition</w:t>
+            </w:r>
+          </w:p>
+        </w:tc>
+        <w:tc>
+          <w:tcPr>
+            <w:tcW w:type="dxa" w:w="2102"/>
+          </w:tcPr>
+          <w:p>
+            <w:pPr>
+              <w:spacing w:after="40"/>
+            </w:pPr>
+            <w:r>
+              <w:rPr>
+                <w:sz w:val="17"/>
+              </w:rPr>
+              <w:t>Mean m</w:t>
+            </w:r>
+          </w:p>
+        </w:tc>
+        <w:tc>
+          <w:tcPr>
+            <w:tcW w:type="dxa" w:w="2102"/>
+          </w:tcPr>
+          <w:p>
+            <w:pPr>
+              <w:spacing w:after="40"/>
+            </w:pPr>
+            <w:r>
+              <w:rPr>
+                <w:sz w:val="17"/>
+              </w:rPr>
+              <w:t>Median m</w:t>
+            </w:r>
+          </w:p>
+        </w:tc>
+        <w:tc>
+          <w:tcPr>
+            <w:tcW w:type="dxa" w:w="2102"/>
+          </w:tcPr>
+          <w:p>
+            <w:pPr>
+              <w:spacing w:after="40"/>
+            </w:pPr>
+            <w:r>
+              <w:rPr>
+                <w:sz w:val="17"/>
+              </w:rPr>
+              <w:t>SD</w:t>
+            </w:r>
+          </w:p>
+        </w:tc>
+        <w:tc>
+          <w:tcPr>
+            <w:tcW w:type="dxa" w:w="2102"/>
+          </w:tcPr>
+          <w:p>
+            <w:pPr>
+              <w:spacing w:after="40"/>
+            </w:pPr>
+            <w:r>
+              <w:rPr>
+                <w:sz w:val="17"/>
+              </w:rPr>
+              <w:t>10th–90th percentile</w:t>
+            </w:r>
+          </w:p>
+        </w:tc>
+      </w:tr>
+      <w:tr>
+        <w:tc>
+          <w:tcPr>
+            <w:tcW w:type="dxa" w:w="2102"/>
+          </w:tcPr>
+          <w:p>
+            <w:pPr>
+              <w:spacing w:after="40"/>
+            </w:pPr>
+            <w:r>
+              <w:rPr>
+                <w:sz w:val="17"/>
+              </w:rPr>
+              <w:t>Training</w:t>
+            </w:r>
+          </w:p>
+        </w:tc>
+        <w:tc>
+          <w:tcPr>
+            <w:tcW w:type="dxa" w:w="2102"/>
+          </w:tcPr>
+          <w:p>
+            <w:pPr>
+              <w:spacing w:after="40"/>
+            </w:pPr>
+            <w:r>
+              <w:rPr>
+                <w:sz w:val="17"/>
+              </w:rPr>
+              <w:t>2.843</w:t>
+            </w:r>
+          </w:p>
+        </w:tc>
+        <w:tc>
+          <w:tcPr>
+            <w:tcW w:type="dxa" w:w="2102"/>
+          </w:tcPr>
+          <w:p>
+            <w:pPr>
+              <w:spacing w:after="40"/>
+            </w:pPr>
+            <w:r>
+              <w:rPr>
+                <w:sz w:val="17"/>
+              </w:rPr>
+              <w:t>2.718</w:t>
+            </w:r>
+          </w:p>
+        </w:tc>
+        <w:tc>
+          <w:tcPr>
+            <w:tcW w:type="dxa" w:w="2102"/>
+          </w:tcPr>
+          <w:p>
+            <w:pPr>
+              <w:spacing w:after="40"/>
+            </w:pPr>
+            <w:r>
+              <w:rPr>
+                <w:sz w:val="17"/>
+              </w:rPr>
+              <w:t>1.723</w:t>
+            </w:r>
+          </w:p>
+        </w:tc>
+        <w:tc>
+          <w:tcPr>
+            <w:tcW w:type="dxa" w:w="2102"/>
+          </w:tcPr>
+          <w:p>
+            <w:pPr>
+              <w:spacing w:after="40"/>
+            </w:pPr>
+            <w:r>
+              <w:rPr>
+                <w:sz w:val="17"/>
+              </w:rPr>
+              <w:t>0.649–5.296</w:t>
+            </w:r>
+          </w:p>
+        </w:tc>
+      </w:tr>
+      <w:tr>
+        <w:tc>
+          <w:tcPr>
+            <w:tcW w:type="dxa" w:w="2102"/>
+          </w:tcPr>
+          <w:p>
+            <w:pPr>
+              <w:spacing w:after="40"/>
+            </w:pPr>
+            <w:r>
+              <w:rPr>
+                <w:sz w:val="17"/>
+              </w:rPr>
+              <w:t>Testing</w:t>
+            </w:r>
+          </w:p>
+        </w:tc>
+        <w:tc>
+          <w:tcPr>
+            <w:tcW w:type="dxa" w:w="2102"/>
+          </w:tcPr>
+          <w:p>
+            <w:pPr>
+              <w:spacing w:after="40"/>
+            </w:pPr>
+            <w:r>
+              <w:rPr>
+                <w:sz w:val="17"/>
+              </w:rPr>
+              <w:t>2.959</w:t>
+            </w:r>
+          </w:p>
+        </w:tc>
+        <w:tc>
+          <w:tcPr>
+            <w:tcW w:type="dxa" w:w="2102"/>
+          </w:tcPr>
+          <w:p>
+            <w:pPr>
+              <w:spacing w:after="40"/>
+            </w:pPr>
+            <w:r>
+              <w:rPr>
+                <w:sz w:val="17"/>
+              </w:rPr>
+              <w:t>2.958</w:t>
+            </w:r>
+          </w:p>
+        </w:tc>
+        <w:tc>
+          <w:tcPr>
+            <w:tcW w:type="dxa" w:w="2102"/>
+          </w:tcPr>
+          <w:p>
+            <w:pPr>
+              <w:spacing w:after="40"/>
+            </w:pPr>
+            <w:r>
+              <w:rPr>
+                <w:sz w:val="17"/>
+              </w:rPr>
+              <w:t>1.652</w:t>
+            </w:r>
+          </w:p>
+        </w:tc>
+        <w:tc>
+          <w:tcPr>
+            <w:tcW w:type="dxa" w:w="2102"/>
+          </w:tcPr>
+          <w:p>
+            <w:pPr>
+              <w:spacing w:after="40"/>
+            </w:pPr>
+            <w:r>
+              <w:rPr>
+                <w:sz w:val="17"/>
+              </w:rPr>
+              <w:t>0.768–5.419</w:t>
+            </w:r>
+          </w:p>
+        </w:tc>
+      </w:tr>
+    </w:tbl>
+    <w:p>
+      <w:r>
+        <w:t>The physics residual RMSE is 0.7838 log10 units on training data and 0.7075 on testing data. These measure agreement of the prediction with the learned equation, not agreement of the equation with an independently established exponent. The exponent mapping and prediction network can co-adapt, so predictive accuracy and small residuals alone do not establish identifiable or causal physical parameters.</w:t>
+      </w:r>
+    </w:p>
+    <w:p>
+      <w:r>
+        <w:t>Computational record: cumulative fold-training time was 293.20 s (data-driven) and 546.87 s (physics-informed), approximately 14.00 min combined, on CPU with one PyTorch thread and deterministic algorithms. Final refits took 1.29 s and 2.67 s respectively. Timings exclude installation and smoke tests and may differ in Colab. 1 physics folds hit the epoch ceiling; 0 belonged to the selected candidate. No data-driven fit hit the ceiling. Search records include elapsed time and software versions.</w:t>
       </w:r>
     </w:p>
     <w:p>
@@ -893,22 +917,61 @@
         <w:pStyle w:val="Heading1"/>
       </w:pPr>
       <w:r>
-        <w:t>4. Computational runtime and interpretation</w:t>
+        <w:t>4. Prediction diagnostics and interpretation</w:t>
       </w:r>
     </w:p>
     <w:p>
       <w:r>
-        <w:t>All 20 candidates completed five folds (100 fits). Cumulative measured fold-training time was 293.20 s (4.89 min); the complete search invocation took 294.29 s (4.90 min), excluding dependency installation. The selected candidate’s five fits required 8.05 s in total. These are measurements on the current single-threaded CPU environment, not estimates of Colab runtime. Software versions recorded with the experiment are Python 3.12.14, PyTorch 2.14.1+cpu, NumPy 2.3.5, pandas 2.2.3, and scikit-learn 1.8.0.</w:t>
+        <w:drawing>
+          <wp:inline xmlns:a="http://schemas.openxmlformats.org/drawingml/2006/main" xmlns:pic="http://schemas.openxmlformats.org/drawingml/2006/picture">
+            <wp:extent cx="5943600" cy="5448300"/>
+            <wp:docPr id="3" name="Picture 3"/>
+            <wp:cNvGraphicFramePr>
+              <a:graphicFrameLocks noChangeAspect="1"/>
+            </wp:cNvGraphicFramePr>
+            <a:graphic>
+              <a:graphicData uri="http://schemas.openxmlformats.org/drawingml/2006/picture">
+                <pic:pic>
+                  <pic:nvPicPr>
+                    <pic:cNvPr id="0" name="observed_vs_predicted.png"/>
+                    <pic:cNvPicPr/>
+                  </pic:nvPicPr>
+                  <pic:blipFill>
+                    <a:blip r:embed="rId12"/>
+                    <a:stretch>
+                      <a:fillRect/>
+                    </a:stretch>
+                  </pic:blipFill>
+                  <pic:spPr>
+                    <a:xfrm>
+                      <a:off x="0" y="0"/>
+                      <a:ext cx="5943600" cy="5448300"/>
+                    </a:xfrm>
+                    <a:prstGeom prst="rect"/>
+                  </pic:spPr>
+                </pic:pic>
+              </a:graphicData>
+            </a:graphic>
+          </wp:inline>
+        </w:drawing>
       </w:r>
     </w:p>
     <w:p>
       <w:r>
-        <w:t>No fit reached the epoch ceiling. Different stopping epochs reflect fold-specific validation trajectories. Training error generally continues to decline after validation improvement slows, indicating a generalization gap and supporting early stopping. The selected best epochs are 31, 123, 89, 39, and 78. Their median, 78 epochs, is the predetermined duration for subsequent refitting on all 1,493 training observations; no final refit has yet been performed.</w:t>
+        <w:rPr>
+          <w:sz w:val="17"/>
+        </w:rPr>
+        <w:t>Figure 3. Final-model predictions versus observations for training and testing, with common logarithmic limits and 1:1 lines. Training points are in-sample; test points are held out. Metrics are calculated on the original predictions without clipping.</w:t>
       </w:r>
     </w:p>
     <w:p>
       <w:r>
-        <w:t>The reported validation scores serve both early stopping and candidate selection and therefore are not an independent generalization estimate. Fold variability is not a confidence interval, and one seed per fold does not characterize initialization sensitivity. Twenty trials provide limited coverage of the search space. The fixed log-target objective and log(1+y) selection metric emphasize errors differently. Repeated inputs with different outputs also limit how uniquely the measured features determine y; their origin has not been established.</w:t>
+        <w:t>The physics-informed model has lower test RMSLE than the data-driven model (0.2810 versus 0.2855); original-scale R² must be considered alongside the logarithmic metric because they emphasize different errors. Both test R² values remain low, and the scatter shows overprediction at the smallest targets and underprediction of many large targets. The improvement on one split should not be generalized beyond this dataset. Neither training fit nor selected validation scores alone establish generalization. The saved validation tradeoff figure compares predictive RMSLE and physical residual across evaluated candidates; architectures and learning rates also vary, so it is exploratory rather than an isolated causal effect of λ.</w:t>
+      </w:r>
+    </w:p>
+    <w:p>
+      <w:r>
+        <w:t>Physical compatibility is limited: all observed x1 values are below one, so m&gt;0 implies y_phys &lt; x2²/72.2. A training-only check found 359/1493 observations above this bound; they were retained. A soft physics penalty can therefore conflict with exact data fitting, and the chosen λ reflects a validation compromise rather than proof of the law. Twenty trials per model provide limited search coverage. One seed per fold does not quantify initialization uncertainty; fold SD is not a confidence interval. The physics architecture is conditioned on the selected data-driven backbone, and the fixed log-target objective differs from RMSLE’s log(1+y) weighting.</w:t>
       </w:r>
     </w:p>
     <w:p>
@@ -916,309 +979,18 @@
         <w:pStyle w:val="Heading1"/>
       </w:pPr>
       <w:r>
-        <w:t>5. Final comparison: pending evaluation</w:t>
-      </w:r>
-    </w:p>
-    <w:tbl>
-      <w:tblPr>
-        <w:tblStyle w:val="LightShading-Accent1"/>
-        <w:tblW w:type="auto" w:w="0"/>
-        <w:tblLook w:firstColumn="1" w:firstRow="1" w:lastColumn="0" w:lastRow="0" w:noHBand="0" w:noVBand="1" w:val="04A0"/>
-      </w:tblPr>
-      <w:tblGrid>
-        <w:gridCol w:w="2074"/>
-        <w:gridCol w:w="2074"/>
-        <w:gridCol w:w="2074"/>
-        <w:gridCol w:w="2074"/>
-        <w:gridCol w:w="2074"/>
-      </w:tblGrid>
-      <w:tr>
-        <w:tc>
-          <w:tcPr>
-            <w:tcW w:type="dxa" w:w="2074"/>
-          </w:tcPr>
-          <w:p>
-            <w:pPr>
-              <w:spacing w:after="60" w:before="0"/>
-            </w:pPr>
-            <w:r>
-              <w:rPr>
-                <w:sz w:val="18"/>
-              </w:rPr>
-              <w:t>Model</w:t>
-            </w:r>
-          </w:p>
-        </w:tc>
-        <w:tc>
-          <w:tcPr>
-            <w:tcW w:type="dxa" w:w="2074"/>
-          </w:tcPr>
-          <w:p>
-            <w:pPr>
-              <w:spacing w:after="60" w:before="0"/>
-            </w:pPr>
-            <w:r>
-              <w:rPr>
-                <w:sz w:val="18"/>
-              </w:rPr>
-              <w:t>Training R²</w:t>
-            </w:r>
-          </w:p>
-        </w:tc>
-        <w:tc>
-          <w:tcPr>
-            <w:tcW w:type="dxa" w:w="2074"/>
-          </w:tcPr>
-          <w:p>
-            <w:pPr>
-              <w:spacing w:after="60" w:before="0"/>
-            </w:pPr>
-            <w:r>
-              <w:rPr>
-                <w:sz w:val="18"/>
-              </w:rPr>
-              <w:t>Training RMSLE</w:t>
-            </w:r>
-          </w:p>
-        </w:tc>
-        <w:tc>
-          <w:tcPr>
-            <w:tcW w:type="dxa" w:w="2074"/>
-          </w:tcPr>
-          <w:p>
-            <w:pPr>
-              <w:spacing w:after="60" w:before="0"/>
-            </w:pPr>
-            <w:r>
-              <w:rPr>
-                <w:sz w:val="18"/>
-              </w:rPr>
-              <w:t>Testing R²</w:t>
-            </w:r>
-          </w:p>
-        </w:tc>
-        <w:tc>
-          <w:tcPr>
-            <w:tcW w:type="dxa" w:w="2074"/>
-          </w:tcPr>
-          <w:p>
-            <w:pPr>
-              <w:spacing w:after="60" w:before="0"/>
-            </w:pPr>
-            <w:r>
-              <w:rPr>
-                <w:sz w:val="18"/>
-              </w:rPr>
-              <w:t>Testing RMSLE</w:t>
-            </w:r>
-          </w:p>
-        </w:tc>
-      </w:tr>
-      <w:tr>
-        <w:tc>
-          <w:tcPr>
-            <w:tcW w:type="dxa" w:w="2074"/>
-          </w:tcPr>
-          <w:p>
-            <w:pPr>
-              <w:spacing w:after="60" w:before="0"/>
-            </w:pPr>
-            <w:r>
-              <w:rPr>
-                <w:sz w:val="18"/>
-              </w:rPr>
-              <w:t>Data-driven network</w:t>
-            </w:r>
-          </w:p>
-        </w:tc>
-        <w:tc>
-          <w:tcPr>
-            <w:tcW w:type="dxa" w:w="2074"/>
-          </w:tcPr>
-          <w:p>
-            <w:pPr>
-              <w:spacing w:after="60" w:before="0"/>
-            </w:pPr>
-            <w:r>
-              <w:rPr>
-                <w:sz w:val="18"/>
-              </w:rPr>
-              <w:t>Pending</w:t>
-            </w:r>
-          </w:p>
-        </w:tc>
-        <w:tc>
-          <w:tcPr>
-            <w:tcW w:type="dxa" w:w="2074"/>
-          </w:tcPr>
-          <w:p>
-            <w:pPr>
-              <w:spacing w:after="60" w:before="0"/>
-            </w:pPr>
-            <w:r>
-              <w:rPr>
-                <w:sz w:val="18"/>
-              </w:rPr>
-              <w:t>Pending</w:t>
-            </w:r>
-          </w:p>
-        </w:tc>
-        <w:tc>
-          <w:tcPr>
-            <w:tcW w:type="dxa" w:w="2074"/>
-          </w:tcPr>
-          <w:p>
-            <w:pPr>
-              <w:spacing w:after="60" w:before="0"/>
-            </w:pPr>
-            <w:r>
-              <w:rPr>
-                <w:sz w:val="18"/>
-              </w:rPr>
-              <w:t>Pending</w:t>
-            </w:r>
-          </w:p>
-        </w:tc>
-        <w:tc>
-          <w:tcPr>
-            <w:tcW w:type="dxa" w:w="2074"/>
-          </w:tcPr>
-          <w:p>
-            <w:pPr>
-              <w:spacing w:after="60" w:before="0"/>
-            </w:pPr>
-            <w:r>
-              <w:rPr>
-                <w:sz w:val="18"/>
-              </w:rPr>
-              <w:t>Pending</w:t>
-            </w:r>
-          </w:p>
-        </w:tc>
-      </w:tr>
-      <w:tr>
-        <w:tc>
-          <w:tcPr>
-            <w:tcW w:type="dxa" w:w="2074"/>
-          </w:tcPr>
-          <w:p>
-            <w:pPr>
-              <w:spacing w:after="60" w:before="0"/>
-            </w:pPr>
-            <w:r>
-              <w:rPr>
-                <w:sz w:val="18"/>
-              </w:rPr>
-              <w:t>Physics-informed network</w:t>
-            </w:r>
-          </w:p>
-        </w:tc>
-        <w:tc>
-          <w:tcPr>
-            <w:tcW w:type="dxa" w:w="2074"/>
-          </w:tcPr>
-          <w:p>
-            <w:pPr>
-              <w:spacing w:after="60" w:before="0"/>
-            </w:pPr>
-            <w:r>
-              <w:rPr>
-                <w:sz w:val="18"/>
-              </w:rPr>
-              <w:t>Pending</w:t>
-            </w:r>
-          </w:p>
-        </w:tc>
-        <w:tc>
-          <w:tcPr>
-            <w:tcW w:type="dxa" w:w="2074"/>
-          </w:tcPr>
-          <w:p>
-            <w:pPr>
-              <w:spacing w:after="60" w:before="0"/>
-            </w:pPr>
-            <w:r>
-              <w:rPr>
-                <w:sz w:val="18"/>
-              </w:rPr>
-              <w:t>Pending</w:t>
-            </w:r>
-          </w:p>
-        </w:tc>
-        <w:tc>
-          <w:tcPr>
-            <w:tcW w:type="dxa" w:w="2074"/>
-          </w:tcPr>
-          <w:p>
-            <w:pPr>
-              <w:spacing w:after="60" w:before="0"/>
-            </w:pPr>
-            <w:r>
-              <w:rPr>
-                <w:sz w:val="18"/>
-              </w:rPr>
-              <w:t>Pending</w:t>
-            </w:r>
-          </w:p>
-        </w:tc>
-        <w:tc>
-          <w:tcPr>
-            <w:tcW w:type="dxa" w:w="2074"/>
-          </w:tcPr>
-          <w:p>
-            <w:pPr>
-              <w:spacing w:after="60" w:before="0"/>
-            </w:pPr>
-            <w:r>
-              <w:rPr>
-                <w:sz w:val="18"/>
-              </w:rPr>
-              <w:t>Pending</w:t>
-            </w:r>
-          </w:p>
-        </w:tc>
-      </w:tr>
-    </w:tbl>
-    <w:p>
-      <w:r>
-        <w:t>The table is intentionally incomplete: cross-validation scores must not be substituted for finalized-model training or testing metrics. Final R² will be calculated from residuals on the original y scale. After physics-informed selection and full-training refitting, each finalized model will be evaluated on the untouched test set without adjustment. The observed-versus-predicted training/test panels and the physics-loss and exponent-evolution diagnostics remain outstanding.</w:t>
-      </w:r>
-    </w:p>
-    <w:p>
-      <w:pPr>
-        <w:pStyle w:val="Heading1"/>
-      </w:pPr>
-      <w:r>
-        <w:t>6. Reproducibility and next stage</w:t>
+        <w:t>Reproducibility, sources, and assistance</w:t>
       </w:r>
     </w:p>
     <w:p>
       <w:r>
-        <w:t>The Colab notebook and standalone Python scripts reproduce data preparation, saved grouped partitions, and the predefined search. Dependencies are pinned. Outputs include the sampled configurations and software manifest, all 100 fold scores and histories, fold checkpoints with scaler statistics, validation predictions linked to IDs, and the selected settings. configuration_results.csv and configuration_results.md are generated from measured fold results and record every candidate’s hyperparameters, five scores, mean, standard deviation, rank, and runtime. The original training source is archived to match the recorded source hash.</w:t>
-      </w:r>
-    </w:p>
-    <w:p>
-      <w:r>
-        <w:t>Next, define a jointly trained positive sample-dependent exponent component and a physics-loss weight search, preserving the equation in original units. Use the same saved partitions and keep the test set excluded from model selection. This Word report is maintained separately from the analysis notebook. The final submission must be a PDF of at most three pages and will be revised when both models are complete.</w:t>
-      </w:r>
-    </w:p>
-    <w:p>
-      <w:pPr>
-        <w:pStyle w:val="Heading1"/>
-      </w:pPr>
-      <w:r>
-        <w:t>Assistance disclosure and source material</w:t>
-      </w:r>
-    </w:p>
-    <w:p>
-      <w:r>
-        <w:t>Source material: the supplied Coding Challenge.pdf and Database.xls. OpenAI Codex assisted with data inspection, Python implementation, cross-validation execution, visualization, and report drafting. The author must review and understand the implementation, verify the findings, and disclose this assistance in the final submission. No external predictive baseline or physical interpretation has yet been validated.</w:t>
+        <w:t>The notebook and Python sources reproduce preprocessing, saved partitions, both searches, refitting, evaluation, and figures. Pinned dependencies, candidate tables, fold histories/checkpoints, final settings and model checkpoints, positive predictions linked to IDs, and m summaries are supplied. See README.md; upload the provided Database.xls and run the notebook in order. Source materials are the supplied Coding Challenge.pdf and workbook; implementation uses NumPy, pandas, scikit-learn, PyTorch, and Matplotlib. OpenAI Codex assisted with implementation, execution, interpretation, figures, and report drafting; the author must review, understand, verify, and disclose this assistance.</w:t>
       </w:r>
     </w:p>
     <w:sectPr>
       <w:footerReference w:type="default" r:id="rId9"/>
       <w:pgSz w:w="12240" w:h="15840"/>
-      <w:pgMar w:top="864" w:right="936" w:bottom="864" w:left="936" w:header="720" w:footer="720" w:gutter="0"/>
+      <w:pgMar w:top="792" w:right="864" w:bottom="792" w:left="864" w:header="720" w:footer="720" w:gutter="0"/>
       <w:cols w:space="720"/>
       <w:docGrid w:linePitch="360"/>
     </w:sectPr>
@@ -1233,7 +1005,7 @@
       <w:pStyle w:val="Footer"/>
     </w:pPr>
     <w:r>
-      <w:t xml:space="preserve">UTA Coding Challenge | Interim analysis, October 20, 2026 | </w:t>
+      <w:t xml:space="preserve">UTA Coding Challenge | October 20, 2026 | </w:t>
     </w:r>
     <w:fldSimple w:instr="PAGE"/>
   </w:p>
@@ -1604,11 +1376,11 @@
     <w:qFormat/>
     <w:rsid w:val="00FC693F"/>
     <w:pPr>
-      <w:spacing w:after="100" w:line="240" w:lineRule="auto"/>
+      <w:spacing w:after="80" w:line="240" w:lineRule="auto"/>
     </w:pPr>
     <w:rPr>
       <w:rFonts w:ascii="Calibri" w:hAnsi="Calibri"/>
-      <w:sz w:val="20"/>
+      <w:sz w:val="19"/>
     </w:rPr>
   </w:style>
   <w:style w:type="paragraph" w:styleId="Header">
@@ -1666,7 +1438,7 @@
     <w:pPr>
       <w:keepNext/>
       <w:keepLines/>
-      <w:spacing w:before="160" w:after="80"/>
+      <w:spacing w:before="120" w:after="60"/>
       <w:outlineLvl w:val="0"/>
     </w:pPr>
     <w:rPr>
@@ -1674,7 +1446,7 @@
       <w:b/>
       <w:bCs/>
       <w:color w:val="203E55"/>
-      <w:sz w:val="24"/>
+      <w:sz w:val="22"/>
       <w:szCs w:val="28"/>
     </w:rPr>
   </w:style>
@@ -1690,7 +1462,7 @@
     <w:pPr>
       <w:keepNext/>
       <w:keepLines/>
-      <w:spacing w:before="160" w:after="80"/>
+      <w:spacing w:before="120" w:after="60"/>
       <w:outlineLvl w:val="1"/>
     </w:pPr>
     <w:rPr>
@@ -1963,7 +1735,7 @@
       <w:color w:val="17365D" w:themeColor="text2" w:themeShade="BF"/>
       <w:spacing w:val="5"/>
       <w:kern w:val="28"/>
-      <w:sz w:val="38"/>
+      <w:sz w:val="36"/>
       <w:szCs w:val="52"/>
     </w:rPr>
   </w:style>

</xml_diff>

<commit_message>
Improve academic report readability with concise sections and tables
</commit_message>
<xml_diff>
--- a/reports/preprocessing_progress_report.docx
+++ b/reports/preprocessing_progress_report.docx
@@ -7,7 +7,12 @@
         <w:pStyle w:val="Title"/>
       </w:pPr>
       <w:r>
-        <w:t>Data-Driven and Physics-Informed Neural Networks</w:t>
+        <w:t>Comparing Data-Driven and Physics-Informed Neural Networks</w:t>
+      </w:r>
+    </w:p>
+    <w:p>
+      <w:r>
+        <w:t>Main finding: adding a weak physics penalty slightly improved held-out prediction. Both models still have limited accuracy on the original target scale; this experiment does not validate the physical law.</w:t>
       </w:r>
     </w:p>
     <w:p>
@@ -15,64 +20,50 @@
         <w:pStyle w:val="Heading1"/>
       </w:pPr>
       <w:r>
-        <w:t>1. Data, protocol, and model selection</w:t>
-      </w:r>
-    </w:p>
-    <w:p>
-      <w:r>
-        <w:t>We compare a feedforward regression network with a jointly trained physics-informed model. Database.xls contains 1,865 samples, nine predictors, and target y. IDs are excluded from prediction. The two-row header was handled explicitly; there are no missing/nonfinite values or duplicate IDs. All observations were retained. Six pairs share all nine predictors: two also share y, while four have different y. Exact predictor combinations define groups, giving 1,859 groups and preventing repeated inputs from crossing partitions.</w:t>
-      </w:r>
-    </w:p>
-    <w:p>
-      <w:r>
-        <w:t>Seed-42 GroupShuffleSplit holds out 20% of groups: 1,493 training and 372 testing samples (80.05/19.95%). Shuffled GroupKFold, seed 42, forms five training folds with 298, 298, 300, 300, and 297 validation samples. Both models use identical saved assignments. Standardization is fitted separately on each fitting fold. Positive x1, x2, x4, x5, and x6 are optionally log10-transformed first; zero-valued features are not logged. The fixed log10(y) target accommodates its approximately 0.000075–46.863905 range. Predictions are 10 raised to the network output; invalid values raise errors, with no clipping.</w:t>
-      </w:r>
-    </w:p>
-    <w:p>
-      <w:r>
-        <w:t>The physics model predicts m = softplus(g(X)) &gt; 0 jointly with z = log10(ŷ). In original numerical units, z_phys = 2 log10(x2) − log10(72.2) + m log10(x1), equivalent to y_phys = x2²/[72.2 x1^(−m)]. Its objective is mean[(z − log10(y))²] + λ mean[(z − z_phys)²] + αΣ||W||². The data-driven model omits the physics term. Biases are excluded from L2. The physical residual sends gradients to both networks; equation equivalence and nonzero gradients were verified.</w:t>
+        <w:t>1. Data and evaluation design</w:t>
       </w:r>
     </w:p>
     <w:tbl>
       <w:tblPr>
         <w:tblStyle w:val="LightShading-Accent1"/>
         <w:tblW w:type="auto" w:w="0"/>
+        <w:tblLayout w:type="fixed"/>
         <w:tblLook w:firstColumn="1" w:firstRow="1" w:lastColumn="0" w:lastRow="0" w:noHBand="0" w:noVBand="1" w:val="04A0"/>
       </w:tblPr>
       <w:tblGrid>
-        <w:gridCol w:w="5256"/>
-        <w:gridCol w:w="5256"/>
+        <w:gridCol w:w="2088"/>
+        <w:gridCol w:w="8280"/>
       </w:tblGrid>
       <w:tr>
         <w:tc>
           <w:tcPr>
-            <w:tcW w:type="dxa" w:w="5256"/>
+            <w:tcW w:type="dxa" w:w="2088"/>
           </w:tcPr>
           <w:p>
             <w:pPr>
-              <w:spacing w:after="40"/>
+              <w:spacing w:after="60" w:before="20"/>
             </w:pPr>
             <w:r>
               <w:rPr>
-                <w:sz w:val="17"/>
+                <w:sz w:val="18"/>
               </w:rPr>
-              <w:t>Choice</w:t>
+              <w:t>Item</w:t>
             </w:r>
           </w:p>
         </w:tc>
         <w:tc>
           <w:tcPr>
-            <w:tcW w:type="dxa" w:w="5256"/>
+            <w:tcW w:type="dxa" w:w="8280"/>
           </w:tcPr>
           <w:p>
             <w:pPr>
-              <w:spacing w:after="40"/>
+              <w:spacing w:after="60" w:before="20"/>
             </w:pPr>
             <w:r>
               <w:rPr>
-                <w:sz w:val="17"/>
+                <w:sz w:val="18"/>
               </w:rPr>
-              <w:t>Search / rationale</w:t>
+              <w:t>What we did</w:t>
             </w:r>
           </w:p>
         </w:tc>
@@ -80,33 +71,33 @@
       <w:tr>
         <w:tc>
           <w:tcPr>
-            <w:tcW w:type="dxa" w:w="5256"/>
+            <w:tcW w:type="dxa" w:w="2088"/>
           </w:tcPr>
           <w:p>
             <w:pPr>
-              <w:spacing w:after="40"/>
+              <w:spacing w:after="60" w:before="20"/>
             </w:pPr>
             <w:r>
               <w:rPr>
-                <w:sz w:val="17"/>
+                <w:sz w:val="18"/>
               </w:rPr>
-              <w:t>Prediction architecture</w:t>
+              <w:t>Dataset</w:t>
             </w:r>
           </w:p>
         </w:tc>
         <w:tc>
           <w:tcPr>
-            <w:tcW w:type="dxa" w:w="5256"/>
+            <w:tcW w:type="dxa" w:w="8280"/>
           </w:tcPr>
           <w:p>
             <w:pPr>
-              <w:spacing w:after="40"/>
+              <w:spacing w:after="60" w:before="20"/>
             </w:pPr>
             <w:r>
               <w:rPr>
-                <w:sz w:val="17"/>
+                <w:sz w:val="18"/>
               </w:rPr>
-              <w:t>1–3 layers; uniform widths 16/32/64; ReLU/tanh: modest nonlinear capacities</w:t>
+              <w:t>1,865 observations; both prediction networks use all nine features, x1–x9. ID is only an identifier.</w:t>
             </w:r>
           </w:p>
         </w:tc>
@@ -114,33 +105,33 @@
       <w:tr>
         <w:tc>
           <w:tcPr>
-            <w:tcW w:type="dxa" w:w="5256"/>
+            <w:tcW w:type="dxa" w:w="2088"/>
           </w:tcPr>
           <w:p>
             <w:pPr>
-              <w:spacing w:after="40"/>
+              <w:spacing w:after="60" w:before="20"/>
             </w:pPr>
             <w:r>
               <w:rPr>
-                <w:sz w:val="17"/>
+                <w:sz w:val="18"/>
               </w:rPr>
-              <w:t>Optimization</w:t>
+              <w:t>Data quality</w:t>
             </w:r>
           </w:p>
         </w:tc>
         <w:tc>
           <w:tcPr>
-            <w:tcW w:type="dxa" w:w="5256"/>
+            <w:tcW w:type="dxa" w:w="8280"/>
           </w:tcPr>
           <w:p>
             <w:pPr>
-              <w:spacing w:after="40"/>
+              <w:spacing w:after="60" w:before="20"/>
             </w:pPr>
             <w:r>
               <w:rPr>
-                <w:sz w:val="17"/>
+                <w:sz w:val="18"/>
               </w:rPr>
-              <w:t>Adam; rates 0.0003/0.001/0.003; batches 32/64/128; L2 0/1e−5/1e−4/1e−3</w:t>
+              <w:t>No missing/nonfinite values or duplicate IDs. All observations, including extreme values, were retained.</w:t>
             </w:r>
           </w:p>
         </w:tc>
@@ -148,15 +139,343 @@
       <w:tr>
         <w:tc>
           <w:tcPr>
-            <w:tcW w:type="dxa" w:w="5256"/>
+            <w:tcW w:type="dxa" w:w="2088"/>
           </w:tcPr>
           <w:p>
             <w:pPr>
-              <w:spacing w:after="40"/>
+              <w:spacing w:after="60" w:before="20"/>
             </w:pPr>
             <w:r>
               <w:rPr>
-                <w:sz w:val="17"/>
+                <w:sz w:val="18"/>
+              </w:rPr>
+              <w:t>Repeated inputs</w:t>
+            </w:r>
+          </w:p>
+        </w:tc>
+        <w:tc>
+          <w:tcPr>
+            <w:tcW w:type="dxa" w:w="8280"/>
+          </w:tcPr>
+          <w:p>
+            <w:pPr>
+              <w:spacing w:after="60" w:before="20"/>
+            </w:pPr>
+            <w:r>
+              <w:rPr>
+                <w:sz w:val="18"/>
+              </w:rPr>
+              <w:t>Six matching-input pairs: two share y, four have different y. All rows were kept; each pair stays together in every split.</w:t>
+            </w:r>
+          </w:p>
+        </w:tc>
+      </w:tr>
+      <w:tr>
+        <w:tc>
+          <w:tcPr>
+            <w:tcW w:type="dxa" w:w="2088"/>
+          </w:tcPr>
+          <w:p>
+            <w:pPr>
+              <w:spacing w:after="60" w:before="20"/>
+            </w:pPr>
+            <w:r>
+              <w:rPr>
+                <w:sz w:val="18"/>
+              </w:rPr>
+              <w:t>Holdout split</w:t>
+            </w:r>
+          </w:p>
+        </w:tc>
+        <w:tc>
+          <w:tcPr>
+            <w:tcW w:type="dxa" w:w="8280"/>
+          </w:tcPr>
+          <w:p>
+            <w:pPr>
+              <w:spacing w:after="60" w:before="20"/>
+            </w:pPr>
+            <w:r>
+              <w:rPr>
+                <w:sz w:val="18"/>
+              </w:rPr>
+              <w:t>Seed 42; 1,493 training / 372 testing rows (80.05% / 19.95%). Grouping explains the small departure from 80/20.</w:t>
+            </w:r>
+          </w:p>
+        </w:tc>
+      </w:tr>
+      <w:tr>
+        <w:tc>
+          <w:tcPr>
+            <w:tcW w:type="dxa" w:w="2088"/>
+          </w:tcPr>
+          <w:p>
+            <w:pPr>
+              <w:spacing w:after="60" w:before="20"/>
+            </w:pPr>
+            <w:r>
+              <w:rPr>
+                <w:sz w:val="18"/>
+              </w:rPr>
+              <w:t>Validation</w:t>
+            </w:r>
+          </w:p>
+        </w:tc>
+        <w:tc>
+          <w:tcPr>
+            <w:tcW w:type="dxa" w:w="8280"/>
+          </w:tcPr>
+          <w:p>
+            <w:pPr>
+              <w:spacing w:after="60" w:before="20"/>
+            </w:pPr>
+            <w:r>
+              <w:rPr>
+                <w:sz w:val="18"/>
+              </w:rPr>
+              <w:t>The same five grouped folds for both models; validation sizes 298, 298, 300, 300, 297. Preprocessing is fitted on each fitting fold only; the test set is excluded from tuning.</w:t>
+            </w:r>
+          </w:p>
+        </w:tc>
+      </w:tr>
+    </w:tbl>
+    <w:p>
+      <w:r>
+        <w:t>Preparation: compare raw inputs with log10(x1, x2, x4, x5, x6), then standardize. These inputs are positive; zero-valued features are not logged. The target is log10(y), reflecting its wide range (about 0.000075–46.86). Outputs are converted back with 10^z, ensuring positive predictions. Invalid numerical outputs raise errors; nothing is silently clipped.</w:t>
+      </w:r>
+    </w:p>
+    <w:p>
+      <w:pPr>
+        <w:pStyle w:val="Heading1"/>
+      </w:pPr>
+      <w:r>
+        <w:t>2. Search choices and selected models</w:t>
+      </w:r>
+    </w:p>
+    <w:tbl>
+      <w:tblPr>
+        <w:tblStyle w:val="LightShading-Accent1"/>
+        <w:tblW w:type="auto" w:w="0"/>
+        <w:tblLayout w:type="fixed"/>
+        <w:tblLook w:firstColumn="1" w:firstRow="1" w:lastColumn="0" w:lastRow="0" w:noHBand="0" w:noVBand="1" w:val="04A0"/>
+      </w:tblPr>
+      <w:tblGrid>
+        <w:gridCol w:w="2304"/>
+        <w:gridCol w:w="4032"/>
+        <w:gridCol w:w="4032"/>
+      </w:tblGrid>
+      <w:tr>
+        <w:tc>
+          <w:tcPr>
+            <w:tcW w:type="dxa" w:w="2304"/>
+          </w:tcPr>
+          <w:p>
+            <w:pPr>
+              <w:spacing w:after="60" w:before="20"/>
+            </w:pPr>
+            <w:r>
+              <w:rPr>
+                <w:sz w:val="18"/>
+              </w:rPr>
+              <w:t>Search choice</w:t>
+            </w:r>
+          </w:p>
+        </w:tc>
+        <w:tc>
+          <w:tcPr>
+            <w:tcW w:type="dxa" w:w="4032"/>
+          </w:tcPr>
+          <w:p>
+            <w:pPr>
+              <w:spacing w:after="60" w:before="20"/>
+            </w:pPr>
+            <w:r>
+              <w:rPr>
+                <w:sz w:val="18"/>
+              </w:rPr>
+              <w:t>Candidate values</w:t>
+            </w:r>
+          </w:p>
+        </w:tc>
+        <w:tc>
+          <w:tcPr>
+            <w:tcW w:type="dxa" w:w="4032"/>
+          </w:tcPr>
+          <w:p>
+            <w:pPr>
+              <w:spacing w:after="60" w:before="20"/>
+            </w:pPr>
+            <w:r>
+              <w:rPr>
+                <w:sz w:val="18"/>
+              </w:rPr>
+              <w:t>Reason</w:t>
+            </w:r>
+          </w:p>
+        </w:tc>
+      </w:tr>
+      <w:tr>
+        <w:tc>
+          <w:tcPr>
+            <w:tcW w:type="dxa" w:w="2304"/>
+          </w:tcPr>
+          <w:p>
+            <w:pPr>
+              <w:spacing w:after="60" w:before="20"/>
+            </w:pPr>
+            <w:r>
+              <w:rPr>
+                <w:sz w:val="18"/>
+              </w:rPr>
+              <w:t>Prediction network</w:t>
+            </w:r>
+          </w:p>
+        </w:tc>
+        <w:tc>
+          <w:tcPr>
+            <w:tcW w:type="dxa" w:w="4032"/>
+          </w:tcPr>
+          <w:p>
+            <w:pPr>
+              <w:spacing w:after="60" w:before="20"/>
+            </w:pPr>
+            <w:r>
+              <w:rPr>
+                <w:sz w:val="18"/>
+              </w:rPr>
+              <w:t>1–3 layers; width 16/32/64; ReLU/tanh</w:t>
+            </w:r>
+          </w:p>
+        </w:tc>
+        <w:tc>
+          <w:tcPr>
+            <w:tcW w:type="dxa" w:w="4032"/>
+          </w:tcPr>
+          <w:p>
+            <w:pPr>
+              <w:spacing w:after="60" w:before="20"/>
+            </w:pPr>
+            <w:r>
+              <w:rPr>
+                <w:sz w:val="18"/>
+              </w:rPr>
+              <w:t>Compare modest capacities for nine inputs.</w:t>
+            </w:r>
+          </w:p>
+        </w:tc>
+      </w:tr>
+      <w:tr>
+        <w:tc>
+          <w:tcPr>
+            <w:tcW w:type="dxa" w:w="2304"/>
+          </w:tcPr>
+          <w:p>
+            <w:pPr>
+              <w:spacing w:after="60" w:before="20"/>
+            </w:pPr>
+            <w:r>
+              <w:rPr>
+                <w:sz w:val="18"/>
+              </w:rPr>
+              <w:t>Adam learning rate</w:t>
+            </w:r>
+          </w:p>
+        </w:tc>
+        <w:tc>
+          <w:tcPr>
+            <w:tcW w:type="dxa" w:w="4032"/>
+          </w:tcPr>
+          <w:p>
+            <w:pPr>
+              <w:spacing w:after="60" w:before="20"/>
+            </w:pPr>
+            <w:r>
+              <w:rPr>
+                <w:sz w:val="18"/>
+              </w:rPr>
+              <w:t>0.0003 / 0.001 / 0.003</w:t>
+            </w:r>
+          </w:p>
+        </w:tc>
+        <w:tc>
+          <w:tcPr>
+            <w:tcW w:type="dxa" w:w="4032"/>
+          </w:tcPr>
+          <w:p>
+            <w:pPr>
+              <w:spacing w:after="60" w:before="20"/>
+            </w:pPr>
+            <w:r>
+              <w:rPr>
+                <w:sz w:val="18"/>
+              </w:rPr>
+              <w:t>Explore slower and faster updates.</w:t>
+            </w:r>
+          </w:p>
+        </w:tc>
+      </w:tr>
+      <w:tr>
+        <w:tc>
+          <w:tcPr>
+            <w:tcW w:type="dxa" w:w="2304"/>
+          </w:tcPr>
+          <w:p>
+            <w:pPr>
+              <w:spacing w:after="60" w:before="20"/>
+            </w:pPr>
+            <w:r>
+              <w:rPr>
+                <w:sz w:val="18"/>
+              </w:rPr>
+              <w:t>Batch size; L2</w:t>
+            </w:r>
+          </w:p>
+        </w:tc>
+        <w:tc>
+          <w:tcPr>
+            <w:tcW w:type="dxa" w:w="4032"/>
+          </w:tcPr>
+          <w:p>
+            <w:pPr>
+              <w:spacing w:after="60" w:before="20"/>
+            </w:pPr>
+            <w:r>
+              <w:rPr>
+                <w:sz w:val="18"/>
+              </w:rPr>
+              <w:t>32/64/128; 0/1e−5/1e−4/1e−3</w:t>
+            </w:r>
+          </w:p>
+        </w:tc>
+        <w:tc>
+          <w:tcPr>
+            <w:tcW w:type="dxa" w:w="4032"/>
+          </w:tcPr>
+          <w:p>
+            <w:pPr>
+              <w:spacing w:after="60" w:before="20"/>
+            </w:pPr>
+            <w:r>
+              <w:rPr>
+                <w:sz w:val="18"/>
+              </w:rPr>
+              <w:t>Balance update frequency and overfitting.</w:t>
+            </w:r>
+          </w:p>
+        </w:tc>
+      </w:tr>
+      <w:tr>
+        <w:tc>
+          <w:tcPr>
+            <w:tcW w:type="dxa" w:w="2304"/>
+          </w:tcPr>
+          <w:p>
+            <w:pPr>
+              <w:spacing w:after="60" w:before="20"/>
+            </w:pPr>
+            <w:r>
+              <w:rPr>
+                <w:sz w:val="18"/>
               </w:rPr>
               <w:t>Input representation</w:t>
             </w:r>
@@ -164,17 +483,33 @@
         </w:tc>
         <w:tc>
           <w:tcPr>
-            <w:tcW w:type="dxa" w:w="5256"/>
+            <w:tcW w:type="dxa" w:w="4032"/>
           </w:tcPr>
           <w:p>
             <w:pPr>
-              <w:spacing w:after="40"/>
+              <w:spacing w:after="60" w:before="20"/>
             </w:pPr>
             <w:r>
               <w:rPr>
-                <w:sz w:val="17"/>
+                <w:sz w:val="18"/>
               </w:rPr>
-              <w:t>Selected logs on/off, then standardization: assess compression, especially x2/x4</w:t>
+              <w:t>Selected logs off/on</w:t>
+            </w:r>
+          </w:p>
+        </w:tc>
+        <w:tc>
+          <w:tcPr>
+            <w:tcW w:type="dxa" w:w="4032"/>
+          </w:tcPr>
+          <w:p>
+            <w:pPr>
+              <w:spacing w:after="60" w:before="20"/>
+            </w:pPr>
+            <w:r>
+              <w:rPr>
+                <w:sz w:val="18"/>
+              </w:rPr>
+              <w:t>Test compression, especially for x2 and x4.</w:t>
             </w:r>
           </w:p>
         </w:tc>
@@ -182,33 +517,49 @@
       <w:tr>
         <w:tc>
           <w:tcPr>
-            <w:tcW w:type="dxa" w:w="5256"/>
+            <w:tcW w:type="dxa" w:w="2304"/>
           </w:tcPr>
           <w:p>
             <w:pPr>
-              <w:spacing w:after="40"/>
+              <w:spacing w:after="60" w:before="20"/>
             </w:pPr>
             <w:r>
               <w:rPr>
-                <w:sz w:val="17"/>
+                <w:sz w:val="18"/>
               </w:rPr>
-              <w:t>Physics exponent network</w:t>
+              <w:t>Exponent network</w:t>
             </w:r>
           </w:p>
         </w:tc>
         <w:tc>
           <w:tcPr>
-            <w:tcW w:type="dxa" w:w="5256"/>
+            <w:tcW w:type="dxa" w:w="4032"/>
           </w:tcPr>
           <w:p>
             <w:pPr>
-              <w:spacing w:after="40"/>
+              <w:spacing w:after="60" w:before="20"/>
             </w:pPr>
             <w:r>
               <w:rPr>
-                <w:sz w:val="17"/>
+                <w:sz w:val="18"/>
               </w:rPr>
-              <w:t>Tanh hidden sizes (8), (16), (16,8); inputs x1–x2/all: limited scalar-map capacity</w:t>
+              <w:t>Tanh: (8), (16), (16,8); inputs x1–x2/all</w:t>
+            </w:r>
+          </w:p>
+        </w:tc>
+        <w:tc>
+          <w:tcPr>
+            <w:tcW w:type="dxa" w:w="4032"/>
+          </w:tcPr>
+          <w:p>
+            <w:pPr>
+              <w:spacing w:after="60" w:before="20"/>
+            </w:pPr>
+            <w:r>
+              <w:rPr>
+                <w:sz w:val="18"/>
+              </w:rPr>
+              <w:t>Limit flexibility; test additional inputs.</w:t>
             </w:r>
           </w:p>
         </w:tc>
@@ -216,33 +567,49 @@
       <w:tr>
         <w:tc>
           <w:tcPr>
-            <w:tcW w:type="dxa" w:w="5256"/>
+            <w:tcW w:type="dxa" w:w="2304"/>
           </w:tcPr>
           <w:p>
             <w:pPr>
-              <w:spacing w:after="40"/>
+              <w:spacing w:after="60" w:before="20"/>
             </w:pPr>
             <w:r>
               <w:rPr>
-                <w:sz w:val="17"/>
+                <w:sz w:val="18"/>
               </w:rPr>
-              <w:t>Physics optimization</w:t>
+              <w:t>Physics weight λ</w:t>
             </w:r>
           </w:p>
         </w:tc>
         <w:tc>
           <w:tcPr>
-            <w:tcW w:type="dxa" w:w="5256"/>
+            <w:tcW w:type="dxa" w:w="4032"/>
           </w:tcPr>
           <w:p>
             <w:pPr>
-              <w:spacing w:after="40"/>
+              <w:spacing w:after="60" w:before="20"/>
             </w:pPr>
             <w:r>
               <w:rPr>
-                <w:sz w:val="17"/>
+                <w:sz w:val="18"/>
               </w:rPr>
-              <w:t>Fixed selected backbone, batch/L2/logs; retune the three rates; λ = 0.01/0.1/1/10</w:t>
+              <w:t>0.01 / 0.1 / 1 / 10</w:t>
+            </w:r>
+          </w:p>
+        </w:tc>
+        <w:tc>
+          <w:tcPr>
+            <w:tcW w:type="dxa" w:w="4032"/>
+          </w:tcPr>
+          <w:p>
+            <w:pPr>
+              <w:spacing w:after="60" w:before="20"/>
+            </w:pPr>
+            <w:r>
+              <w:rPr>
+                <w:sz w:val="18"/>
+              </w:rPr>
+              <w:t>Compare weak and strong equation penalties.</w:t>
             </w:r>
           </w:p>
         </w:tc>
@@ -250,118 +617,67 @@
     </w:tbl>
     <w:p>
       <w:r>
-        <w:t>Each search samples 20 distinct candidates without replacement (seed 42): 20/1,296 data-driven and 20/72 physics configurations, totaling 200 fold fits. Adam uses β=(0.9,0.999), ε=1e−7. He/ReLU and Xavier/tanh initialization are used with zero biases; output weights use Xavier initialization. Fold seeds are 42+fold. Early stopping uses validation RMSLE, a 1,000-epoch ceiling, patience 50, and min_delta=1e−5; retain the absolute minimum checkpoint. Select by mean five-fold RMSLE and report sample SD (ddof=1).</w:t>
-      </w:r>
-    </w:p>
-    <w:p>
-      <w:r>
-        <w:t>Selected data-driven settings: 16–16–16 ReLU, learning rate 0.003, batch 64, L2 0.001, logs enabled; validation RMSLE 0.299685 ± 0.016474. Physics retains that backbone and selects exponent hidden sizes [16], inputs x1_x2, learning rate 0.003, and λ=0.01; validation RMSLE 0.298574 ± 0.015089. Other features x3–x9 contribute through the prediction network.</w:t>
-      </w:r>
-    </w:p>
-    <w:p>
-      <w:pPr>
-        <w:pStyle w:val="Heading1"/>
-      </w:pPr>
-      <w:r>
-        <w:t>2. Final refitting and predictive results</w:t>
-      </w:r>
-    </w:p>
-    <w:p>
-      <w:r>
-        <w:t>Before testing, durations were fixed to median selected CV best epochs: 78 (data-driven) and 116 (physics-informed). New scalers and models were fitted on all training samples, seed 42, without test/validation monitoring. R² = 1 − SSE/SST uses original-scale residuals. RMSLE₁₀ = √mean[(log10(1+ŷ) − log10(1+y))²]; this +1 convention differs from the log-target training loss. Finalized models were evaluated without further adjustment.</w:t>
+        <w:t>Budget: seed-42 random sampling without replacement; 20/1,296 data-driven and 20/72 physics candidates, each over five folds (200 fits). Physics keeps the selected prediction backbone, batch size, L2, and input transform fixed. Choose the lowest mean validation RMSLE. Early stopping: at most 1,000 epochs; patience 50; minimum improvement 1e−5. Retain the lowest-score checkpoint. L2 penalizes weights, not biases; no separate weight decay is used.</w:t>
       </w:r>
     </w:p>
     <w:tbl>
       <w:tblPr>
         <w:tblStyle w:val="LightShading-Accent1"/>
         <w:tblW w:type="auto" w:w="0"/>
+        <w:tblLayout w:type="fixed"/>
         <w:tblLook w:firstColumn="1" w:firstRow="1" w:lastColumn="0" w:lastRow="0" w:noHBand="0" w:noVBand="1" w:val="04A0"/>
       </w:tblPr>
       <w:tblGrid>
-        <w:gridCol w:w="2102"/>
-        <w:gridCol w:w="2102"/>
-        <w:gridCol w:w="2102"/>
-        <w:gridCol w:w="2102"/>
-        <w:gridCol w:w="2102"/>
+        <w:gridCol w:w="2304"/>
+        <w:gridCol w:w="4032"/>
+        <w:gridCol w:w="4032"/>
       </w:tblGrid>
       <w:tr>
         <w:tc>
           <w:tcPr>
-            <w:tcW w:type="dxa" w:w="2102"/>
+            <w:tcW w:type="dxa" w:w="2304"/>
           </w:tcPr>
           <w:p>
             <w:pPr>
-              <w:spacing w:after="40"/>
+              <w:spacing w:after="60" w:before="20"/>
             </w:pPr>
             <w:r>
               <w:rPr>
-                <w:sz w:val="17"/>
+                <w:sz w:val="18"/>
               </w:rPr>
-              <w:t>Model</w:t>
+              <w:t>Selected setting</w:t>
             </w:r>
           </w:p>
         </w:tc>
         <w:tc>
           <w:tcPr>
-            <w:tcW w:type="dxa" w:w="2102"/>
+            <w:tcW w:type="dxa" w:w="4032"/>
           </w:tcPr>
           <w:p>
             <w:pPr>
-              <w:spacing w:after="40"/>
+              <w:spacing w:after="60" w:before="20"/>
             </w:pPr>
             <w:r>
               <w:rPr>
-                <w:sz w:val="17"/>
+                <w:sz w:val="18"/>
               </w:rPr>
-              <w:t>Training R²</w:t>
+              <w:t>Data-driven</w:t>
             </w:r>
           </w:p>
         </w:tc>
         <w:tc>
           <w:tcPr>
-            <w:tcW w:type="dxa" w:w="2102"/>
+            <w:tcW w:type="dxa" w:w="4032"/>
           </w:tcPr>
           <w:p>
             <w:pPr>
-              <w:spacing w:after="40"/>
+              <w:spacing w:after="60" w:before="20"/>
             </w:pPr>
             <w:r>
               <w:rPr>
-                <w:sz w:val="17"/>
+                <w:sz w:val="18"/>
               </w:rPr>
-              <w:t>Training RMSLE</w:t>
-            </w:r>
-          </w:p>
-        </w:tc>
-        <w:tc>
-          <w:tcPr>
-            <w:tcW w:type="dxa" w:w="2102"/>
-          </w:tcPr>
-          <w:p>
-            <w:pPr>
-              <w:spacing w:after="40"/>
-            </w:pPr>
-            <w:r>
-              <w:rPr>
-                <w:sz w:val="17"/>
-              </w:rPr>
-              <w:t>Testing R²</w:t>
-            </w:r>
-          </w:p>
-        </w:tc>
-        <w:tc>
-          <w:tcPr>
-            <w:tcW w:type="dxa" w:w="2102"/>
-          </w:tcPr>
-          <w:p>
-            <w:pPr>
-              <w:spacing w:after="40"/>
-            </w:pPr>
-            <w:r>
-              <w:rPr>
-                <w:sz w:val="17"/>
-              </w:rPr>
-              <w:t>Testing RMSLE</w:t>
+              <w:t>Physics-informed</w:t>
             </w:r>
           </w:p>
         </w:tc>
@@ -369,81 +685,49 @@
       <w:tr>
         <w:tc>
           <w:tcPr>
-            <w:tcW w:type="dxa" w:w="2102"/>
+            <w:tcW w:type="dxa" w:w="2304"/>
           </w:tcPr>
           <w:p>
             <w:pPr>
-              <w:spacing w:after="40"/>
+              <w:spacing w:after="60" w:before="20"/>
             </w:pPr>
             <w:r>
               <w:rPr>
-                <w:sz w:val="17"/>
+                <w:sz w:val="18"/>
               </w:rPr>
-              <w:t>Data-driven</w:t>
+              <w:t>Prediction network</w:t>
             </w:r>
           </w:p>
         </w:tc>
         <w:tc>
           <w:tcPr>
-            <w:tcW w:type="dxa" w:w="2102"/>
+            <w:tcW w:type="dxa" w:w="4032"/>
           </w:tcPr>
           <w:p>
             <w:pPr>
-              <w:spacing w:after="40"/>
+              <w:spacing w:after="60" w:before="20"/>
             </w:pPr>
             <w:r>
               <w:rPr>
-                <w:sz w:val="17"/>
+                <w:sz w:val="18"/>
               </w:rPr>
-              <w:t>0.0896</w:t>
+              <w:t>16 → 16 → 16, ReLU</w:t>
             </w:r>
           </w:p>
         </w:tc>
         <w:tc>
           <w:tcPr>
-            <w:tcW w:type="dxa" w:w="2102"/>
+            <w:tcW w:type="dxa" w:w="4032"/>
           </w:tcPr>
           <w:p>
             <w:pPr>
-              <w:spacing w:after="40"/>
+              <w:spacing w:after="60" w:before="20"/>
             </w:pPr>
             <w:r>
               <w:rPr>
-                <w:sz w:val="17"/>
+                <w:sz w:val="18"/>
               </w:rPr>
-              <w:t>0.2808</w:t>
-            </w:r>
-          </w:p>
-        </w:tc>
-        <w:tc>
-          <w:tcPr>
-            <w:tcW w:type="dxa" w:w="2102"/>
-          </w:tcPr>
-          <w:p>
-            <w:pPr>
-              <w:spacing w:after="40"/>
-            </w:pPr>
-            <w:r>
-              <w:rPr>
-                <w:sz w:val="17"/>
-              </w:rPr>
-              <w:t>0.1803</w:t>
-            </w:r>
-          </w:p>
-        </w:tc>
-        <w:tc>
-          <w:tcPr>
-            <w:tcW w:type="dxa" w:w="2102"/>
-          </w:tcPr>
-          <w:p>
-            <w:pPr>
-              <w:spacing w:after="40"/>
-            </w:pPr>
-            <w:r>
-              <w:rPr>
-                <w:sz w:val="17"/>
-              </w:rPr>
-              <w:t>0.2855</w:t>
+              <w:t>Same prediction backbone</w:t>
             </w:r>
           </w:p>
         </w:tc>
@@ -451,104 +735,186 @@
       <w:tr>
         <w:tc>
           <w:tcPr>
-            <w:tcW w:type="dxa" w:w="2102"/>
+            <w:tcW w:type="dxa" w:w="2304"/>
           </w:tcPr>
           <w:p>
             <w:pPr>
-              <w:spacing w:after="40"/>
+              <w:spacing w:after="60" w:before="20"/>
             </w:pPr>
             <w:r>
               <w:rPr>
-                <w:sz w:val="17"/>
+                <w:sz w:val="18"/>
               </w:rPr>
-              <w:t>Physics-informed</w:t>
+              <w:t>Rate / batch / L2</w:t>
             </w:r>
           </w:p>
         </w:tc>
         <w:tc>
           <w:tcPr>
-            <w:tcW w:type="dxa" w:w="2102"/>
+            <w:tcW w:type="dxa" w:w="4032"/>
           </w:tcPr>
           <w:p>
             <w:pPr>
-              <w:spacing w:after="40"/>
+              <w:spacing w:after="60" w:before="20"/>
             </w:pPr>
             <w:r>
               <w:rPr>
-                <w:sz w:val="17"/>
+                <w:sz w:val="18"/>
               </w:rPr>
-              <w:t>0.1886</w:t>
+              <w:t>0.003 / 64 / 0.001</w:t>
             </w:r>
           </w:p>
         </w:tc>
         <w:tc>
           <w:tcPr>
-            <w:tcW w:type="dxa" w:w="2102"/>
+            <w:tcW w:type="dxa" w:w="4032"/>
           </w:tcPr>
           <w:p>
             <w:pPr>
-              <w:spacing w:after="40"/>
+              <w:spacing w:after="60" w:before="20"/>
             </w:pPr>
             <w:r>
               <w:rPr>
-                <w:sz w:val="17"/>
+                <w:sz w:val="18"/>
               </w:rPr>
-              <w:t>0.2725</w:t>
+              <w:t>0.003 / 64 / 0.001</w:t>
+            </w:r>
+          </w:p>
+        </w:tc>
+      </w:tr>
+      <w:tr>
+        <w:tc>
+          <w:tcPr>
+            <w:tcW w:type="dxa" w:w="2304"/>
+          </w:tcPr>
+          <w:p>
+            <w:pPr>
+              <w:spacing w:after="60" w:before="20"/>
+            </w:pPr>
+            <w:r>
+              <w:rPr>
+                <w:sz w:val="18"/>
+              </w:rPr>
+              <w:t>Transforms</w:t>
             </w:r>
           </w:p>
         </w:tc>
         <w:tc>
           <w:tcPr>
-            <w:tcW w:type="dxa" w:w="2102"/>
+            <w:tcW w:type="dxa" w:w="4032"/>
           </w:tcPr>
           <w:p>
             <w:pPr>
-              <w:spacing w:after="40"/>
+              <w:spacing w:after="60" w:before="20"/>
             </w:pPr>
             <w:r>
               <w:rPr>
-                <w:sz w:val="17"/>
+                <w:sz w:val="18"/>
               </w:rPr>
-              <w:t>0.2082</w:t>
+              <w:t>Selected logs + standardization; log10(y)</w:t>
             </w:r>
           </w:p>
         </w:tc>
         <w:tc>
           <w:tcPr>
-            <w:tcW w:type="dxa" w:w="2102"/>
+            <w:tcW w:type="dxa" w:w="4032"/>
           </w:tcPr>
           <w:p>
             <w:pPr>
-              <w:spacing w:after="40"/>
+              <w:spacing w:after="60" w:before="20"/>
             </w:pPr>
             <w:r>
               <w:rPr>
-                <w:sz w:val="17"/>
+                <w:sz w:val="18"/>
               </w:rPr>
-              <w:t>0.2810</w:t>
+              <w:t>Same</w:t>
+            </w:r>
+          </w:p>
+        </w:tc>
+      </w:tr>
+      <w:tr>
+        <w:tc>
+          <w:tcPr>
+            <w:tcW w:type="dxa" w:w="2304"/>
+          </w:tcPr>
+          <w:p>
+            <w:pPr>
+              <w:spacing w:after="60" w:before="20"/>
+            </w:pPr>
+            <w:r>
+              <w:rPr>
+                <w:sz w:val="18"/>
+              </w:rPr>
+              <w:t>Exponent / physics weight</w:t>
+            </w:r>
+          </w:p>
+        </w:tc>
+        <w:tc>
+          <w:tcPr>
+            <w:tcW w:type="dxa" w:w="4032"/>
+          </w:tcPr>
+          <w:p>
+            <w:pPr>
+              <w:spacing w:after="60" w:before="20"/>
+            </w:pPr>
+            <w:r>
+              <w:rPr>
+                <w:sz w:val="18"/>
+              </w:rPr>
+              <w:t>Not applicable</w:t>
+            </w:r>
+          </w:p>
+        </w:tc>
+        <w:tc>
+          <w:tcPr>
+            <w:tcW w:type="dxa" w:w="4032"/>
+          </w:tcPr>
+          <w:p>
+            <w:pPr>
+              <w:spacing w:after="60" w:before="20"/>
+            </w:pPr>
+            <w:r>
+              <w:rPr>
+                <w:sz w:val="18"/>
+              </w:rPr>
+              <w:t>One 16-neuron tanh layer; x1–x2; λ=0.01</w:t>
             </w:r>
           </w:p>
         </w:tc>
       </w:tr>
     </w:tbl>
     <w:p>
+      <w:pPr>
+        <w:pStyle w:val="Heading1"/>
+      </w:pPr>
       <w:r>
-        <w:br w:type="page"/>
+        <w:t>3. How physics enters training</w:t>
+      </w:r>
+    </w:p>
+    <w:p>
+      <w:r>
+        <w:t>The equation is y_phys = x2² / [72.2 × x1^(−m)]. A second network learns a separate m for each sample, jointly with the prediction network. Softplus enforces m&gt;0. At inference, m uses features alone, never observed y. Features x3–x9 influence the prediction branch.</w:t>
+      </w:r>
+    </w:p>
+    <w:p>
+      <w:r>
+        <w:t>Using original units: z_phys = 2 log10(x2) − log10(72.2) + m log10(x1), where z = log10(predicted y). Minimize data MSE in log10(y) + λ × mean[(z − z_phys)²] + L2. Equation equivalence and gradient flow to both networks and m were checked. Exponents are learned during training, not prescribed or fitted afterward.</w:t>
       </w:r>
     </w:p>
     <w:p>
       <w:pPr>
         <w:pStyle w:val="Heading1"/>
+        <w:pageBreakBefore/>
       </w:pPr>
       <w:r>
-        <w:t>3. Training behavior and learned exponent</w:t>
+        <w:t>4. Training and validation evidence</w:t>
       </w:r>
     </w:p>
     <w:p>
       <w:r>
         <w:drawing>
           <wp:inline xmlns:a="http://schemas.openxmlformats.org/drawingml/2006/main" xmlns:pic="http://schemas.openxmlformats.org/drawingml/2006/picture">
-            <wp:extent cx="6492240" cy="2267776"/>
+            <wp:extent cx="6355080" cy="2219865"/>
             <wp:docPr id="1" name="Picture 1"/>
             <wp:cNvGraphicFramePr>
               <a:graphicFrameLocks noChangeAspect="1"/>
@@ -569,7 +935,7 @@
                   <pic:spPr>
                     <a:xfrm>
                       <a:off x="0" y="0"/>
-                      <a:ext cx="6492240" cy="2267776"/>
+                      <a:ext cx="6355080" cy="2219865"/>
                     </a:xfrm>
                     <a:prstGeom prst="rect"/>
                   </pic:spPr>
@@ -585,14 +951,190 @@
         <w:rPr>
           <w:sz w:val="17"/>
         </w:rPr>
-        <w:t>Figure 1. Training and validation RMSLE versus epoch for preselected CV fold 1 of each selected configuration. Dashed lines mark retained epochs; curves end at actual early stopping. All five folds are provided in supporting outputs. No test error was monitored against epoch.</w:t>
+        <w:t>Figure 1. Training and validation RMSLE for preselected fold 1 of each selected model. Dashed lines mark retained epochs. Curves stop at actual early stopping. All five folds are included in supporting outputs; test error is never plotted against epoch.</w:t>
+      </w:r>
+    </w:p>
+    <w:tbl>
+      <w:tblPr>
+        <w:tblStyle w:val="LightShading-Accent1"/>
+        <w:tblW w:type="auto" w:w="0"/>
+        <w:tblLayout w:type="fixed"/>
+        <w:tblLook w:firstColumn="1" w:firstRow="1" w:lastColumn="0" w:lastRow="0" w:noHBand="0" w:noVBand="1" w:val="04A0"/>
+      </w:tblPr>
+      <w:tblGrid>
+        <w:gridCol w:w="2304"/>
+        <w:gridCol w:w="4032"/>
+        <w:gridCol w:w="4032"/>
+      </w:tblGrid>
+      <w:tr>
+        <w:tc>
+          <w:tcPr>
+            <w:tcW w:type="dxa" w:w="2304"/>
+          </w:tcPr>
+          <w:p>
+            <w:pPr>
+              <w:spacing w:after="60" w:before="20"/>
+            </w:pPr>
+            <w:r>
+              <w:rPr>
+                <w:sz w:val="18"/>
+              </w:rPr>
+              <w:t>Selected model</w:t>
+            </w:r>
+          </w:p>
+        </w:tc>
+        <w:tc>
+          <w:tcPr>
+            <w:tcW w:type="dxa" w:w="4032"/>
+          </w:tcPr>
+          <w:p>
+            <w:pPr>
+              <w:spacing w:after="60" w:before="20"/>
+            </w:pPr>
+            <w:r>
+              <w:rPr>
+                <w:sz w:val="18"/>
+              </w:rPr>
+              <w:t>Validation RMSLE mean</w:t>
+            </w:r>
+          </w:p>
+        </w:tc>
+        <w:tc>
+          <w:tcPr>
+            <w:tcW w:type="dxa" w:w="4032"/>
+          </w:tcPr>
+          <w:p>
+            <w:pPr>
+              <w:spacing w:after="60" w:before="20"/>
+            </w:pPr>
+            <w:r>
+              <w:rPr>
+                <w:sz w:val="18"/>
+              </w:rPr>
+              <w:t>Fold standard deviation</w:t>
+            </w:r>
+          </w:p>
+        </w:tc>
+      </w:tr>
+      <w:tr>
+        <w:tc>
+          <w:tcPr>
+            <w:tcW w:type="dxa" w:w="2304"/>
+          </w:tcPr>
+          <w:p>
+            <w:pPr>
+              <w:spacing w:after="60" w:before="20"/>
+            </w:pPr>
+            <w:r>
+              <w:rPr>
+                <w:sz w:val="18"/>
+              </w:rPr>
+              <w:t>Data-driven</w:t>
+            </w:r>
+          </w:p>
+        </w:tc>
+        <w:tc>
+          <w:tcPr>
+            <w:tcW w:type="dxa" w:w="4032"/>
+          </w:tcPr>
+          <w:p>
+            <w:pPr>
+              <w:spacing w:after="60" w:before="20"/>
+            </w:pPr>
+            <w:r>
+              <w:rPr>
+                <w:sz w:val="18"/>
+              </w:rPr>
+              <w:t>0.299685</w:t>
+            </w:r>
+          </w:p>
+        </w:tc>
+        <w:tc>
+          <w:tcPr>
+            <w:tcW w:type="dxa" w:w="4032"/>
+          </w:tcPr>
+          <w:p>
+            <w:pPr>
+              <w:spacing w:after="60" w:before="20"/>
+            </w:pPr>
+            <w:r>
+              <w:rPr>
+                <w:sz w:val="18"/>
+              </w:rPr>
+              <w:t>0.016474</w:t>
+            </w:r>
+          </w:p>
+        </w:tc>
+      </w:tr>
+      <w:tr>
+        <w:tc>
+          <w:tcPr>
+            <w:tcW w:type="dxa" w:w="2304"/>
+          </w:tcPr>
+          <w:p>
+            <w:pPr>
+              <w:spacing w:after="60" w:before="20"/>
+            </w:pPr>
+            <w:r>
+              <w:rPr>
+                <w:sz w:val="18"/>
+              </w:rPr>
+              <w:t>Physics-informed</w:t>
+            </w:r>
+          </w:p>
+        </w:tc>
+        <w:tc>
+          <w:tcPr>
+            <w:tcW w:type="dxa" w:w="4032"/>
+          </w:tcPr>
+          <w:p>
+            <w:pPr>
+              <w:spacing w:after="60" w:before="20"/>
+            </w:pPr>
+            <w:r>
+              <w:rPr>
+                <w:sz w:val="18"/>
+              </w:rPr>
+              <w:t>0.298574</w:t>
+            </w:r>
+          </w:p>
+        </w:tc>
+        <w:tc>
+          <w:tcPr>
+            <w:tcW w:type="dxa" w:w="4032"/>
+          </w:tcPr>
+          <w:p>
+            <w:pPr>
+              <w:spacing w:after="60" w:before="20"/>
+            </w:pPr>
+            <w:r>
+              <w:rPr>
+                <w:sz w:val="18"/>
+              </w:rPr>
+              <w:t>0.015089</w:t>
+            </w:r>
+          </w:p>
+        </w:tc>
+      </w:tr>
+    </w:tbl>
+    <w:p>
+      <w:r>
+        <w:t>Each summary uses five folds; SD uses ddof=1. These scores were used for selection and are not independent test estimates. Fold seeds are 42 + fold number.</w:t>
+      </w:r>
+    </w:p>
+    <w:p>
+      <w:pPr>
+        <w:pStyle w:val="Heading1"/>
+      </w:pPr>
+      <w:r>
+        <w:t>5. What the exponent learned</w:t>
       </w:r>
     </w:p>
     <w:p>
       <w:r>
         <w:drawing>
           <wp:inline xmlns:a="http://schemas.openxmlformats.org/drawingml/2006/main" xmlns:pic="http://schemas.openxmlformats.org/drawingml/2006/picture">
-            <wp:extent cx="6492240" cy="1803400"/>
+            <wp:extent cx="6355080" cy="1765300"/>
             <wp:docPr id="2" name="Picture 2"/>
             <wp:cNvGraphicFramePr>
               <a:graphicFrameLocks noChangeAspect="1"/>
@@ -613,7 +1155,7 @@
                   <pic:spPr>
                     <a:xfrm>
                       <a:off x="0" y="0"/>
-                      <a:ext cx="6492240" cy="1803400"/>
+                      <a:ext cx="6355080" cy="1765300"/>
                     </a:xfrm>
                     <a:prstGeom prst="rect"/>
                   </pic:spPr>
@@ -629,55 +1171,56 @@
         <w:rPr>
           <w:sz w:val="17"/>
         </w:rPr>
-        <w:t>Figure 2. Separate unweighted data and physics losses (log10-space MSE), and m evolution on fixed fitting-fold inputs, for physics-informed CV fold 1. The band is the sample 10th–90th percentile, not uncertainty. Dashed lines mark the retained checkpoint. Full-training refit diagnostics are supplied separately.</w:t>
+        <w:t>Figure 2. Physics-informed fold 1: separate data/physics losses and m evolution on fixed fitting-fold inputs. The shaded band is the sample 10th–90th percentile, not uncertainty. Dashed lines mark the retained epoch. Final-refit diagnostics are also saved.</w:t>
       </w:r>
     </w:p>
     <w:p>
       <w:r>
-        <w:t>m is sample-dependent; a single global exponent would be misleading. Final-model summaries below describe the learned distribution, and every sample’s m is saved with its ID. Test exponents are generated from features alone. No observed y is passed to the exponent network at inference.</w:t>
+        <w:t>Because m varies by sample, report its final distribution rather than one global value. Each sample’s learned m is saved with its ID; held-out values are generated from inputs alone.</w:t>
       </w:r>
     </w:p>
     <w:tbl>
       <w:tblPr>
         <w:tblStyle w:val="LightShading-Accent1"/>
         <w:tblW w:type="auto" w:w="0"/>
+        <w:tblLayout w:type="fixed"/>
         <w:tblLook w:firstColumn="1" w:firstRow="1" w:lastColumn="0" w:lastRow="0" w:noHBand="0" w:noVBand="1" w:val="04A0"/>
       </w:tblPr>
       <w:tblGrid>
-        <w:gridCol w:w="2102"/>
-        <w:gridCol w:w="2102"/>
-        <w:gridCol w:w="2102"/>
-        <w:gridCol w:w="2102"/>
-        <w:gridCol w:w="2102"/>
+        <w:gridCol w:w="2074"/>
+        <w:gridCol w:w="2074"/>
+        <w:gridCol w:w="2074"/>
+        <w:gridCol w:w="2074"/>
+        <w:gridCol w:w="2074"/>
       </w:tblGrid>
       <w:tr>
         <w:tc>
           <w:tcPr>
-            <w:tcW w:type="dxa" w:w="2102"/>
+            <w:tcW w:type="dxa" w:w="2074"/>
           </w:tcPr>
           <w:p>
             <w:pPr>
-              <w:spacing w:after="40"/>
+              <w:spacing w:after="60" w:before="20"/>
             </w:pPr>
             <w:r>
               <w:rPr>
-                <w:sz w:val="17"/>
+                <w:sz w:val="18"/>
               </w:rPr>
-              <w:t>Partition</w:t>
+              <w:t>Final model inputs</w:t>
             </w:r>
           </w:p>
         </w:tc>
         <w:tc>
           <w:tcPr>
-            <w:tcW w:type="dxa" w:w="2102"/>
+            <w:tcW w:type="dxa" w:w="2074"/>
           </w:tcPr>
           <w:p>
             <w:pPr>
-              <w:spacing w:after="40"/>
+              <w:spacing w:after="60" w:before="20"/>
             </w:pPr>
             <w:r>
               <w:rPr>
-                <w:sz w:val="17"/>
+                <w:sz w:val="18"/>
               </w:rPr>
               <w:t>Mean m</w:t>
             </w:r>
@@ -685,15 +1228,15 @@
         </w:tc>
         <w:tc>
           <w:tcPr>
-            <w:tcW w:type="dxa" w:w="2102"/>
+            <w:tcW w:type="dxa" w:w="2074"/>
           </w:tcPr>
           <w:p>
             <w:pPr>
-              <w:spacing w:after="40"/>
+              <w:spacing w:after="60" w:before="20"/>
             </w:pPr>
             <w:r>
               <w:rPr>
-                <w:sz w:val="17"/>
+                <w:sz w:val="18"/>
               </w:rPr>
               <w:t>Median m</w:t>
             </w:r>
@@ -701,15 +1244,15 @@
         </w:tc>
         <w:tc>
           <w:tcPr>
-            <w:tcW w:type="dxa" w:w="2102"/>
+            <w:tcW w:type="dxa" w:w="2074"/>
           </w:tcPr>
           <w:p>
             <w:pPr>
-              <w:spacing w:after="40"/>
+              <w:spacing w:after="60" w:before="20"/>
             </w:pPr>
             <w:r>
               <w:rPr>
-                <w:sz w:val="17"/>
+                <w:sz w:val="18"/>
               </w:rPr>
               <w:t>SD</w:t>
             </w:r>
@@ -717,15 +1260,15 @@
         </w:tc>
         <w:tc>
           <w:tcPr>
-            <w:tcW w:type="dxa" w:w="2102"/>
+            <w:tcW w:type="dxa" w:w="2074"/>
           </w:tcPr>
           <w:p>
             <w:pPr>
-              <w:spacing w:after="40"/>
+              <w:spacing w:after="60" w:before="20"/>
             </w:pPr>
             <w:r>
               <w:rPr>
-                <w:sz w:val="17"/>
+                <w:sz w:val="18"/>
               </w:rPr>
               <w:t>10th–90th percentile</w:t>
             </w:r>
@@ -735,15 +1278,15 @@
       <w:tr>
         <w:tc>
           <w:tcPr>
-            <w:tcW w:type="dxa" w:w="2102"/>
+            <w:tcW w:type="dxa" w:w="2074"/>
           </w:tcPr>
           <w:p>
             <w:pPr>
-              <w:spacing w:after="40"/>
+              <w:spacing w:after="60" w:before="20"/>
             </w:pPr>
             <w:r>
               <w:rPr>
-                <w:sz w:val="17"/>
+                <w:sz w:val="18"/>
               </w:rPr>
               <w:t>Training</w:t>
             </w:r>
@@ -751,15 +1294,15 @@
         </w:tc>
         <w:tc>
           <w:tcPr>
-            <w:tcW w:type="dxa" w:w="2102"/>
+            <w:tcW w:type="dxa" w:w="2074"/>
           </w:tcPr>
           <w:p>
             <w:pPr>
-              <w:spacing w:after="40"/>
+              <w:spacing w:after="60" w:before="20"/>
             </w:pPr>
             <w:r>
               <w:rPr>
-                <w:sz w:val="17"/>
+                <w:sz w:val="18"/>
               </w:rPr>
               <w:t>2.843</w:t>
             </w:r>
@@ -767,15 +1310,15 @@
         </w:tc>
         <w:tc>
           <w:tcPr>
-            <w:tcW w:type="dxa" w:w="2102"/>
+            <w:tcW w:type="dxa" w:w="2074"/>
           </w:tcPr>
           <w:p>
             <w:pPr>
-              <w:spacing w:after="40"/>
+              <w:spacing w:after="60" w:before="20"/>
             </w:pPr>
             <w:r>
               <w:rPr>
-                <w:sz w:val="17"/>
+                <w:sz w:val="18"/>
               </w:rPr>
               <w:t>2.718</w:t>
             </w:r>
@@ -783,15 +1326,15 @@
         </w:tc>
         <w:tc>
           <w:tcPr>
-            <w:tcW w:type="dxa" w:w="2102"/>
+            <w:tcW w:type="dxa" w:w="2074"/>
           </w:tcPr>
           <w:p>
             <w:pPr>
-              <w:spacing w:after="40"/>
+              <w:spacing w:after="60" w:before="20"/>
             </w:pPr>
             <w:r>
               <w:rPr>
-                <w:sz w:val="17"/>
+                <w:sz w:val="18"/>
               </w:rPr>
               <w:t>1.723</w:t>
             </w:r>
@@ -799,15 +1342,15 @@
         </w:tc>
         <w:tc>
           <w:tcPr>
-            <w:tcW w:type="dxa" w:w="2102"/>
+            <w:tcW w:type="dxa" w:w="2074"/>
           </w:tcPr>
           <w:p>
             <w:pPr>
-              <w:spacing w:after="40"/>
+              <w:spacing w:after="60" w:before="20"/>
             </w:pPr>
             <w:r>
               <w:rPr>
-                <w:sz w:val="17"/>
+                <w:sz w:val="18"/>
               </w:rPr>
               <w:t>0.649–5.296</w:t>
             </w:r>
@@ -817,15 +1360,15 @@
       <w:tr>
         <w:tc>
           <w:tcPr>
-            <w:tcW w:type="dxa" w:w="2102"/>
+            <w:tcW w:type="dxa" w:w="2074"/>
           </w:tcPr>
           <w:p>
             <w:pPr>
-              <w:spacing w:after="40"/>
+              <w:spacing w:after="60" w:before="20"/>
             </w:pPr>
             <w:r>
               <w:rPr>
-                <w:sz w:val="17"/>
+                <w:sz w:val="18"/>
               </w:rPr>
               <w:t>Testing</w:t>
             </w:r>
@@ -833,15 +1376,15 @@
         </w:tc>
         <w:tc>
           <w:tcPr>
-            <w:tcW w:type="dxa" w:w="2102"/>
+            <w:tcW w:type="dxa" w:w="2074"/>
           </w:tcPr>
           <w:p>
             <w:pPr>
-              <w:spacing w:after="40"/>
+              <w:spacing w:after="60" w:before="20"/>
             </w:pPr>
             <w:r>
               <w:rPr>
-                <w:sz w:val="17"/>
+                <w:sz w:val="18"/>
               </w:rPr>
               <w:t>2.959</w:t>
             </w:r>
@@ -849,15 +1392,15 @@
         </w:tc>
         <w:tc>
           <w:tcPr>
-            <w:tcW w:type="dxa" w:w="2102"/>
+            <w:tcW w:type="dxa" w:w="2074"/>
           </w:tcPr>
           <w:p>
             <w:pPr>
-              <w:spacing w:after="40"/>
+              <w:spacing w:after="60" w:before="20"/>
             </w:pPr>
             <w:r>
               <w:rPr>
-                <w:sz w:val="17"/>
+                <w:sz w:val="18"/>
               </w:rPr>
               <w:t>2.958</w:t>
             </w:r>
@@ -865,15 +1408,15 @@
         </w:tc>
         <w:tc>
           <w:tcPr>
-            <w:tcW w:type="dxa" w:w="2102"/>
+            <w:tcW w:type="dxa" w:w="2074"/>
           </w:tcPr>
           <w:p>
             <w:pPr>
-              <w:spacing w:after="40"/>
+              <w:spacing w:after="60" w:before="20"/>
             </w:pPr>
             <w:r>
               <w:rPr>
-                <w:sz w:val="17"/>
+                <w:sz w:val="18"/>
               </w:rPr>
               <w:t>1.652</w:t>
             </w:r>
@@ -881,15 +1424,15 @@
         </w:tc>
         <w:tc>
           <w:tcPr>
-            <w:tcW w:type="dxa" w:w="2102"/>
+            <w:tcW w:type="dxa" w:w="2074"/>
           </w:tcPr>
           <w:p>
             <w:pPr>
-              <w:spacing w:after="40"/>
+              <w:spacing w:after="60" w:before="20"/>
             </w:pPr>
             <w:r>
               <w:rPr>
-                <w:sz w:val="17"/>
+                <w:sz w:val="18"/>
               </w:rPr>
               <w:t>0.768–5.419</w:t>
             </w:r>
@@ -898,33 +1441,461 @@
       </w:tr>
     </w:tbl>
     <w:p>
+      <w:pPr>
+        <w:pStyle w:val="Heading1"/>
+      </w:pPr>
       <w:r>
-        <w:t>The physics residual RMSE is 0.7838 log10 units on training data and 0.7075 on testing data. These measure agreement of the prediction with the learned equation, not agreement of the equation with an independently established exponent. The exponent mapping and prediction network can co-adapt, so predictive accuracy and small residuals alone do not establish identifiable or causal physical parameters.</w:t>
+        <w:t>6. Runtime and final refitting</w:t>
       </w:r>
     </w:p>
+    <w:tbl>
+      <w:tblPr>
+        <w:tblStyle w:val="LightShading-Accent1"/>
+        <w:tblW w:type="auto" w:w="0"/>
+        <w:tblLayout w:type="fixed"/>
+        <w:tblLook w:firstColumn="1" w:firstRow="1" w:lastColumn="0" w:lastRow="0" w:noHBand="0" w:noVBand="1" w:val="04A0"/>
+      </w:tblPr>
+      <w:tblGrid>
+        <w:gridCol w:w="2304"/>
+        <w:gridCol w:w="4032"/>
+        <w:gridCol w:w="4032"/>
+      </w:tblGrid>
+      <w:tr>
+        <w:tc>
+          <w:tcPr>
+            <w:tcW w:type="dxa" w:w="2304"/>
+          </w:tcPr>
+          <w:p>
+            <w:pPr>
+              <w:spacing w:after="60" w:before="20"/>
+            </w:pPr>
+            <w:r>
+              <w:rPr>
+                <w:sz w:val="18"/>
+              </w:rPr>
+              <w:t>Model</w:t>
+            </w:r>
+          </w:p>
+        </w:tc>
+        <w:tc>
+          <w:tcPr>
+            <w:tcW w:type="dxa" w:w="4032"/>
+          </w:tcPr>
+          <w:p>
+            <w:pPr>
+              <w:spacing w:after="60" w:before="20"/>
+            </w:pPr>
+            <w:r>
+              <w:rPr>
+                <w:sz w:val="18"/>
+              </w:rPr>
+              <w:t>100 CV fits</w:t>
+            </w:r>
+          </w:p>
+        </w:tc>
+        <w:tc>
+          <w:tcPr>
+            <w:tcW w:type="dxa" w:w="4032"/>
+          </w:tcPr>
+          <w:p>
+            <w:pPr>
+              <w:spacing w:after="60" w:before="20"/>
+            </w:pPr>
+            <w:r>
+              <w:rPr>
+                <w:sz w:val="18"/>
+              </w:rPr>
+              <w:t>Full-training refit</w:t>
+            </w:r>
+          </w:p>
+        </w:tc>
+      </w:tr>
+      <w:tr>
+        <w:tc>
+          <w:tcPr>
+            <w:tcW w:type="dxa" w:w="2304"/>
+          </w:tcPr>
+          <w:p>
+            <w:pPr>
+              <w:spacing w:after="60" w:before="20"/>
+            </w:pPr>
+            <w:r>
+              <w:rPr>
+                <w:sz w:val="18"/>
+              </w:rPr>
+              <w:t>Data-driven</w:t>
+            </w:r>
+          </w:p>
+        </w:tc>
+        <w:tc>
+          <w:tcPr>
+            <w:tcW w:type="dxa" w:w="4032"/>
+          </w:tcPr>
+          <w:p>
+            <w:pPr>
+              <w:spacing w:after="60" w:before="20"/>
+            </w:pPr>
+            <w:r>
+              <w:rPr>
+                <w:sz w:val="18"/>
+              </w:rPr>
+              <w:t>293.20 s</w:t>
+            </w:r>
+          </w:p>
+        </w:tc>
+        <w:tc>
+          <w:tcPr>
+            <w:tcW w:type="dxa" w:w="4032"/>
+          </w:tcPr>
+          <w:p>
+            <w:pPr>
+              <w:spacing w:after="60" w:before="20"/>
+            </w:pPr>
+            <w:r>
+              <w:rPr>
+                <w:sz w:val="18"/>
+              </w:rPr>
+              <w:t>78 epochs; 1.29 s</w:t>
+            </w:r>
+          </w:p>
+        </w:tc>
+      </w:tr>
+      <w:tr>
+        <w:tc>
+          <w:tcPr>
+            <w:tcW w:type="dxa" w:w="2304"/>
+          </w:tcPr>
+          <w:p>
+            <w:pPr>
+              <w:spacing w:after="60" w:before="20"/>
+            </w:pPr>
+            <w:r>
+              <w:rPr>
+                <w:sz w:val="18"/>
+              </w:rPr>
+              <w:t>Physics-informed</w:t>
+            </w:r>
+          </w:p>
+        </w:tc>
+        <w:tc>
+          <w:tcPr>
+            <w:tcW w:type="dxa" w:w="4032"/>
+          </w:tcPr>
+          <w:p>
+            <w:pPr>
+              <w:spacing w:after="60" w:before="20"/>
+            </w:pPr>
+            <w:r>
+              <w:rPr>
+                <w:sz w:val="18"/>
+              </w:rPr>
+              <w:t>546.87 s</w:t>
+            </w:r>
+          </w:p>
+        </w:tc>
+        <w:tc>
+          <w:tcPr>
+            <w:tcW w:type="dxa" w:w="4032"/>
+          </w:tcPr>
+          <w:p>
+            <w:pPr>
+              <w:spacing w:after="60" w:before="20"/>
+            </w:pPr>
+            <w:r>
+              <w:rPr>
+                <w:sz w:val="18"/>
+              </w:rPr>
+              <w:t>116 epochs; 2.67 s</w:t>
+            </w:r>
+          </w:p>
+        </w:tc>
+      </w:tr>
+    </w:tbl>
     <w:p>
       <w:r>
-        <w:t>Computational record: cumulative fold-training time was 293.20 s (data-driven) and 546.87 s (physics-informed), approximately 14.00 min combined, on CPU with one PyTorch thread and deterministic algorithms. Final refits took 1.29 s and 2.67 s respectively. Timings exclude installation and smoke tests and may differ in Colab. 1 physics folds hit the epoch ceiling; 0 belonged to the selected candidate. No data-driven fit hit the ceiling. Search records include elapsed time and software versions.</w:t>
-      </w:r>
-    </w:p>
-    <w:p>
-      <w:r>
-        <w:br w:type="page"/>
+        <w:t>About 14 minutes of CV training on one CPU thread, using deterministic algorithms; installation and smoke tests excluded. One nonselected physics-informed fold reached 1,000 epochs; selected folds did not. Refit durations are the median selected CV best epochs. Fresh models and scalers use all 1,493 training rows, seed 42, with no validation/test monitoring. Both models were fixed before testing and were not adjusted afterward.</w:t>
       </w:r>
     </w:p>
     <w:p>
       <w:pPr>
         <w:pStyle w:val="Heading1"/>
+        <w:pageBreakBefore/>
       </w:pPr>
       <w:r>
-        <w:t>4. Prediction diagnostics and interpretation</w:t>
+        <w:t>7. Final predictive results</w:t>
+      </w:r>
+    </w:p>
+    <w:tbl>
+      <w:tblPr>
+        <w:tblStyle w:val="LightShading-Accent1"/>
+        <w:tblW w:type="auto" w:w="0"/>
+        <w:tblLayout w:type="fixed"/>
+        <w:tblLook w:firstColumn="1" w:firstRow="1" w:lastColumn="0" w:lastRow="0" w:noHBand="0" w:noVBand="1" w:val="04A0"/>
+      </w:tblPr>
+      <w:tblGrid>
+        <w:gridCol w:w="2074"/>
+        <w:gridCol w:w="2074"/>
+        <w:gridCol w:w="2074"/>
+        <w:gridCol w:w="2074"/>
+        <w:gridCol w:w="2074"/>
+      </w:tblGrid>
+      <w:tr>
+        <w:tc>
+          <w:tcPr>
+            <w:tcW w:type="dxa" w:w="2074"/>
+          </w:tcPr>
+          <w:p>
+            <w:pPr>
+              <w:spacing w:after="60" w:before="20"/>
+            </w:pPr>
+            <w:r>
+              <w:rPr>
+                <w:sz w:val="18"/>
+              </w:rPr>
+              <w:t>Model</w:t>
+            </w:r>
+          </w:p>
+        </w:tc>
+        <w:tc>
+          <w:tcPr>
+            <w:tcW w:type="dxa" w:w="2074"/>
+          </w:tcPr>
+          <w:p>
+            <w:pPr>
+              <w:spacing w:after="60" w:before="20"/>
+            </w:pPr>
+            <w:r>
+              <w:rPr>
+                <w:sz w:val="18"/>
+              </w:rPr>
+              <w:t>Training R²</w:t>
+            </w:r>
+          </w:p>
+        </w:tc>
+        <w:tc>
+          <w:tcPr>
+            <w:tcW w:type="dxa" w:w="2074"/>
+          </w:tcPr>
+          <w:p>
+            <w:pPr>
+              <w:spacing w:after="60" w:before="20"/>
+            </w:pPr>
+            <w:r>
+              <w:rPr>
+                <w:sz w:val="18"/>
+              </w:rPr>
+              <w:t>Training RMSLE</w:t>
+            </w:r>
+          </w:p>
+        </w:tc>
+        <w:tc>
+          <w:tcPr>
+            <w:tcW w:type="dxa" w:w="2074"/>
+          </w:tcPr>
+          <w:p>
+            <w:pPr>
+              <w:spacing w:after="60" w:before="20"/>
+            </w:pPr>
+            <w:r>
+              <w:rPr>
+                <w:sz w:val="18"/>
+              </w:rPr>
+              <w:t>Testing R²</w:t>
+            </w:r>
+          </w:p>
+        </w:tc>
+        <w:tc>
+          <w:tcPr>
+            <w:tcW w:type="dxa" w:w="2074"/>
+          </w:tcPr>
+          <w:p>
+            <w:pPr>
+              <w:spacing w:after="60" w:before="20"/>
+            </w:pPr>
+            <w:r>
+              <w:rPr>
+                <w:sz w:val="18"/>
+              </w:rPr>
+              <w:t>Testing RMSLE</w:t>
+            </w:r>
+          </w:p>
+        </w:tc>
+      </w:tr>
+      <w:tr>
+        <w:tc>
+          <w:tcPr>
+            <w:tcW w:type="dxa" w:w="2074"/>
+          </w:tcPr>
+          <w:p>
+            <w:pPr>
+              <w:spacing w:after="60" w:before="20"/>
+            </w:pPr>
+            <w:r>
+              <w:rPr>
+                <w:sz w:val="18"/>
+              </w:rPr>
+              <w:t>Data-driven</w:t>
+            </w:r>
+          </w:p>
+        </w:tc>
+        <w:tc>
+          <w:tcPr>
+            <w:tcW w:type="dxa" w:w="2074"/>
+          </w:tcPr>
+          <w:p>
+            <w:pPr>
+              <w:spacing w:after="60" w:before="20"/>
+            </w:pPr>
+            <w:r>
+              <w:rPr>
+                <w:sz w:val="18"/>
+              </w:rPr>
+              <w:t>0.0896</w:t>
+            </w:r>
+          </w:p>
+        </w:tc>
+        <w:tc>
+          <w:tcPr>
+            <w:tcW w:type="dxa" w:w="2074"/>
+          </w:tcPr>
+          <w:p>
+            <w:pPr>
+              <w:spacing w:after="60" w:before="20"/>
+            </w:pPr>
+            <w:r>
+              <w:rPr>
+                <w:sz w:val="18"/>
+              </w:rPr>
+              <w:t>0.2808</w:t>
+            </w:r>
+          </w:p>
+        </w:tc>
+        <w:tc>
+          <w:tcPr>
+            <w:tcW w:type="dxa" w:w="2074"/>
+          </w:tcPr>
+          <w:p>
+            <w:pPr>
+              <w:spacing w:after="60" w:before="20"/>
+            </w:pPr>
+            <w:r>
+              <w:rPr>
+                <w:sz w:val="18"/>
+              </w:rPr>
+              <w:t>0.1803</w:t>
+            </w:r>
+          </w:p>
+        </w:tc>
+        <w:tc>
+          <w:tcPr>
+            <w:tcW w:type="dxa" w:w="2074"/>
+          </w:tcPr>
+          <w:p>
+            <w:pPr>
+              <w:spacing w:after="60" w:before="20"/>
+            </w:pPr>
+            <w:r>
+              <w:rPr>
+                <w:sz w:val="18"/>
+              </w:rPr>
+              <w:t>0.2855</w:t>
+            </w:r>
+          </w:p>
+        </w:tc>
+      </w:tr>
+      <w:tr>
+        <w:tc>
+          <w:tcPr>
+            <w:tcW w:type="dxa" w:w="2074"/>
+          </w:tcPr>
+          <w:p>
+            <w:pPr>
+              <w:spacing w:after="60" w:before="20"/>
+            </w:pPr>
+            <w:r>
+              <w:rPr>
+                <w:sz w:val="18"/>
+              </w:rPr>
+              <w:t>Physics-informed</w:t>
+            </w:r>
+          </w:p>
+        </w:tc>
+        <w:tc>
+          <w:tcPr>
+            <w:tcW w:type="dxa" w:w="2074"/>
+          </w:tcPr>
+          <w:p>
+            <w:pPr>
+              <w:spacing w:after="60" w:before="20"/>
+            </w:pPr>
+            <w:r>
+              <w:rPr>
+                <w:sz w:val="18"/>
+              </w:rPr>
+              <w:t>0.1886</w:t>
+            </w:r>
+          </w:p>
+        </w:tc>
+        <w:tc>
+          <w:tcPr>
+            <w:tcW w:type="dxa" w:w="2074"/>
+          </w:tcPr>
+          <w:p>
+            <w:pPr>
+              <w:spacing w:after="60" w:before="20"/>
+            </w:pPr>
+            <w:r>
+              <w:rPr>
+                <w:sz w:val="18"/>
+              </w:rPr>
+              <w:t>0.2725</w:t>
+            </w:r>
+          </w:p>
+        </w:tc>
+        <w:tc>
+          <w:tcPr>
+            <w:tcW w:type="dxa" w:w="2074"/>
+          </w:tcPr>
+          <w:p>
+            <w:pPr>
+              <w:spacing w:after="60" w:before="20"/>
+            </w:pPr>
+            <w:r>
+              <w:rPr>
+                <w:sz w:val="18"/>
+              </w:rPr>
+              <w:t>0.2082</w:t>
+            </w:r>
+          </w:p>
+        </w:tc>
+        <w:tc>
+          <w:tcPr>
+            <w:tcW w:type="dxa" w:w="2074"/>
+          </w:tcPr>
+          <w:p>
+            <w:pPr>
+              <w:spacing w:after="60" w:before="20"/>
+            </w:pPr>
+            <w:r>
+              <w:rPr>
+                <w:sz w:val="18"/>
+              </w:rPr>
+              <w:t>0.2810</w:t>
+            </w:r>
+          </w:p>
+        </w:tc>
+      </w:tr>
+    </w:tbl>
+    <w:p>
+      <w:r>
+        <w:t>Higher R² and lower RMSLE are better. R² = 1 − SSE/SST uses original-scale residuals, not squared correlation. Base-10 RMSLE = √mean[(log10(1+ŷ) − log10(1+y))²]. This +1 convention differs from the log-target training loss.</w:t>
       </w:r>
     </w:p>
     <w:p>
       <w:r>
         <w:drawing>
           <wp:inline xmlns:a="http://schemas.openxmlformats.org/drawingml/2006/main" xmlns:pic="http://schemas.openxmlformats.org/drawingml/2006/picture">
-            <wp:extent cx="5943600" cy="5448300"/>
+            <wp:extent cx="4892040" cy="4484370"/>
             <wp:docPr id="3" name="Picture 3"/>
             <wp:cNvGraphicFramePr>
               <a:graphicFrameLocks noChangeAspect="1"/>
@@ -945,7 +1916,7 @@
                   <pic:spPr>
                     <a:xfrm>
                       <a:off x="0" y="0"/>
-                      <a:ext cx="5943600" cy="5448300"/>
+                      <a:ext cx="4892040" cy="4484370"/>
                     </a:xfrm>
                     <a:prstGeom prst="rect"/>
                   </pic:spPr>
@@ -961,17 +1932,7 @@
         <w:rPr>
           <w:sz w:val="17"/>
         </w:rPr>
-        <w:t>Figure 3. Final-model predictions versus observations for training and testing, with common logarithmic limits and 1:1 lines. Training points are in-sample; test points are held out. Metrics are calculated on the original predictions without clipping.</w:t>
-      </w:r>
-    </w:p>
-    <w:p>
-      <w:r>
-        <w:t>The physics-informed model has lower test RMSLE than the data-driven model (0.2810 versus 0.2855); original-scale R² must be considered alongside the logarithmic metric because they emphasize different errors. Both test R² values remain low, and the scatter shows overprediction at the smallest targets and underprediction of many large targets. The improvement on one split should not be generalized beyond this dataset. Neither training fit nor selected validation scores alone establish generalization. The saved validation tradeoff figure compares predictive RMSLE and physical residual across evaluated candidates; architectures and learning rates also vary, so it is exploratory rather than an isolated causal effect of λ.</w:t>
-      </w:r>
-    </w:p>
-    <w:p>
-      <w:r>
-        <w:t>Physical compatibility is limited: all observed x1 values are below one, so m&gt;0 implies y_phys &lt; x2²/72.2. A training-only check found 359/1493 observations above this bound; they were retained. A soft physics penalty can therefore conflict with exact data fitting, and the chosen λ reflects a validation compromise rather than proof of the law. Twenty trials per model provide limited search coverage. One seed per fold does not quantify initialization uncertainty; fold SD is not a confidence interval. The physics architecture is conditioned on the selected data-driven backbone, and the fixed log-target objective differs from RMSLE’s log(1+y) weighting.</w:t>
+        <w:t>Figure 3. Final predictions: training and testing for both models. All panels use common logarithmic limits and a 1:1 line. Training predictions are in-sample; testing predictions are held out.</w:t>
       </w:r>
     </w:p>
     <w:p>
@@ -979,18 +1940,50 @@
         <w:pStyle w:val="Heading1"/>
       </w:pPr>
       <w:r>
-        <w:t>Reproducibility, sources, and assistance</w:t>
+        <w:t>8. Interpretation and limitations</w:t>
+      </w:r>
+    </w:p>
+    <w:p>
+      <w:pPr>
+        <w:pStyle w:val="ListBullet"/>
+      </w:pPr>
+      <w:r>
+        <w:t>Modest gain: physics lowers test RMSLE from 0.2855 to 0.2810, but both test R² values remain low. Small targets are often overpredicted and large targets underpredicted. One split does not establish a general advantage.</w:t>
+      </w:r>
+    </w:p>
+    <w:p>
+      <w:pPr>
+        <w:pStyle w:val="ListBullet"/>
+      </w:pPr>
+      <w:r>
+        <w:t>Approximate physics: agreement RMSE is 0.7838 (training) and 0.7075 (testing), in log10 units. The selected λ=0.01 is weak. Since x1&lt;1 and m&gt;0, the equation requires y_phys&lt;x2²/72.2; 359/1,493 training observations exceed that bound and were retained.</w:t>
+      </w:r>
+    </w:p>
+    <w:p>
+      <w:pPr>
+        <w:pStyle w:val="ListBullet"/>
+      </w:pPr>
+      <w:r>
+        <w:t>Limited certainty: m and the prediction network can co-adapt, so learned exponents are not proven physical parameters. Only 20 candidates per model and one seed per fold were tested. Fold SD is not a confidence interval. The saved accuracy–physics tradeoff plot is exploratory because other settings also vary.</w:t>
+      </w:r>
+    </w:p>
+    <w:p>
+      <w:pPr>
+        <w:pStyle w:val="Heading1"/>
+      </w:pPr>
+      <w:r>
+        <w:t>Reproduction and disclosure</w:t>
       </w:r>
     </w:p>
     <w:p>
       <w:r>
-        <w:t>The notebook and Python sources reproduce preprocessing, saved partitions, both searches, refitting, evaluation, and figures. Pinned dependencies, candidate tables, fold histories/checkpoints, final settings and model checkpoints, positive predictions linked to IDs, and m summaries are supplied. See README.md; upload the provided Database.xls and run the notebook in order. Source materials are the supplied Coding Challenge.pdf and workbook; implementation uses NumPy, pandas, scikit-learn, PyTorch, and Matplotlib. OpenAI Codex assisted with implementation, execution, interpretation, figures, and report drafting; the author must review, understand, verify, and disclose this assistance.</w:t>
+        <w:t>Reproduce with Database.xls, the notebook, README.md, and requirements.txt. Supporting files contain partitions, settings, fold records, final models, ID-linked predictions/m, and figures. Sources: supplied challenge/workbook and listed software libraries. OpenAI Codex assisted with code, execution, interpretation, figures, and writing. The author must verify and understand all submitted work.</w:t>
       </w:r>
     </w:p>
     <w:sectPr>
       <w:footerReference w:type="default" r:id="rId9"/>
       <w:pgSz w:w="12240" w:h="15840"/>
-      <w:pgMar w:top="792" w:right="864" w:bottom="792" w:left="864" w:header="720" w:footer="720" w:gutter="0"/>
+      <w:pgMar w:top="792" w:right="936" w:bottom="792" w:left="936" w:header="720" w:footer="720" w:gutter="0"/>
       <w:cols w:space="720"/>
       <w:docGrid w:linePitch="360"/>
     </w:sectPr>
@@ -1376,11 +2369,11 @@
     <w:qFormat/>
     <w:rsid w:val="00FC693F"/>
     <w:pPr>
-      <w:spacing w:after="80" w:line="240" w:lineRule="auto"/>
+      <w:spacing w:after="100" w:line="245" w:lineRule="auto"/>
     </w:pPr>
     <w:rPr>
       <w:rFonts w:ascii="Calibri" w:hAnsi="Calibri"/>
-      <w:sz w:val="19"/>
+      <w:sz w:val="20"/>
     </w:rPr>
   </w:style>
   <w:style w:type="paragraph" w:styleId="Header">
@@ -1438,7 +2431,7 @@
     <w:pPr>
       <w:keepNext/>
       <w:keepLines/>
-      <w:spacing w:before="120" w:after="60"/>
+      <w:spacing w:before="140" w:after="80"/>
       <w:outlineLvl w:val="0"/>
     </w:pPr>
     <w:rPr>
@@ -1446,7 +2439,7 @@
       <w:b/>
       <w:bCs/>
       <w:color w:val="203E55"/>
-      <w:sz w:val="22"/>
+      <w:sz w:val="24"/>
       <w:szCs w:val="28"/>
     </w:rPr>
   </w:style>
@@ -1462,7 +2455,7 @@
     <w:pPr>
       <w:keepNext/>
       <w:keepLines/>
-      <w:spacing w:before="120" w:after="60"/>
+      <w:spacing w:before="140" w:after="80"/>
       <w:outlineLvl w:val="1"/>
     </w:pPr>
     <w:rPr>
@@ -1470,7 +2463,7 @@
       <w:b/>
       <w:bCs/>
       <w:color w:val="203E55"/>
-      <w:sz w:val="22"/>
+      <w:sz w:val="21"/>
       <w:szCs w:val="26"/>
     </w:rPr>
   </w:style>
@@ -1735,7 +2728,7 @@
       <w:color w:val="17365D" w:themeColor="text2" w:themeShade="BF"/>
       <w:spacing w:val="5"/>
       <w:kern w:val="28"/>
-      <w:sz w:val="36"/>
+      <w:sz w:val="38"/>
       <w:szCs w:val="52"/>
     </w:rPr>
   </w:style>

</xml_diff>

<commit_message>
Fix notebook imports and complete reproducibility and scientific review
</commit_message>
<xml_diff>
--- a/reports/preprocessing_progress_report.docx
+++ b/reports/preprocessing_progress_report.docx
@@ -12,7 +12,7 @@
     </w:p>
     <w:p>
       <w:r>
-        <w:t>Main finding: adding a weak physics penalty slightly improved held-out prediction. Both models still have limited accuracy on the original target scale; this experiment does not validate the physical law.</w:t>
+        <w:t>Main finding: the physics-informed model had slightly lower test error. Both models have limited original-scale accuracy; this comparison does not isolate the physics penalty’s effect or validate the physical law.</w:t>
       </w:r>
     </w:p>
     <w:p>
@@ -1948,7 +1948,7 @@
         <w:pStyle w:val="ListBullet"/>
       </w:pPr>
       <w:r>
-        <w:t>Modest gain: physics lowers test RMSLE from 0.2855 to 0.2810, but both test R² values remain low. Small targets are often overpredicted and large targets underpredicted. One split does not establish a general advantage.</w:t>
+        <w:t>Prediction limits: the physics-informed model has test RMSLE 0.2810 versus 0.2855, but both test R² values remain low. Small targets are often overpredicted and large targets underpredicted. The log(y) training loss and log(1+y) selection score emphasize errors differently; one split gives limited evidence.</w:t>
       </w:r>
     </w:p>
     <w:p>
@@ -1964,7 +1964,7 @@
         <w:pStyle w:val="ListBullet"/>
       </w:pPr>
       <w:r>
-        <w:t>Limited certainty: m and the prediction network can co-adapt, so learned exponents are not proven physical parameters. Only 20 candidates per model and one seed per fold were tested. Fold SD is not a confidence interval. The saved accuracy–physics tradeoff plot is exploratory because other settings also vary.</w:t>
+        <w:t>Evidence limits: m and the predictor can co-adapt; the added branch and optimization changes are not isolated, so a causal benefit of physics is not established. Twenty candidates and one seed per fold limit robustness; fold SD is not a confidence interval. Matched-λ studies, repeated seeds, and simple baselines remain future work.</w:t>
       </w:r>
     </w:p>
     <w:p>

</xml_diff>